<commit_message>
Proposta Surcin: módulo opcional de avaliação de desempenho por competência
Co-Authored-By: Claude Opus 5.5 (1M context) <noreply@anthropic.com>
Claude-Session: https://claude.ai/code/session_0127xFh2xB8HoQ18BDMAY2QJ
</commit_message>
<xml_diff>
--- a/proposta-surcin/04-proposta-comercial.docx
+++ b/proposta-surcin/04-proposta-comercial.docx
@@ -2478,6 +2478,267 @@
     </w:p>
     <w:p>
       <w:pPr>
+        <w:pStyle w:val="Heading3"/>
+      </w:pPr>
+      <w:r>
+        <w:t>Módulo opcional · Avaliação de desempenho por competência</w:t>
+      </w:r>
+    </w:p>
+    <w:p>
+      <w:r>
+        <w:rPr>
+          <w:i w:val="0"/>
+        </w:rPr>
+        <w:t>Atende ao pedido de avaliar o desempenho individual e criar uma premiação (reunião 00:46 e 02:21; briefing, seção 10). Parte dos papéis e indicadores da Fase 1 e organiza a avaliação em ciclos semestrais, com uma gratificação de fim de ano que a Surcin consegue provisionar mês a mês.</w:t>
+      </w:r>
+    </w:p>
+    <w:p>
+      <w:pPr>
+        <w:pStyle w:val="ListBullet"/>
+      </w:pPr>
+      <w:r>
+        <w:t>Matriz de competências por função (secretária, financeiro, DP, estagiária do jurídico), com o nível esperado de cada uma.</w:t>
+      </w:r>
+    </w:p>
+    <w:p>
+      <w:pPr>
+        <w:pStyle w:val="ListBullet"/>
+      </w:pPr>
+      <w:r>
+        <w:t>Formulário de avaliação com escala definida: autoavaliação da funcionária e avaliação da Thamires.</w:t>
+      </w:r>
+    </w:p>
+    <w:p>
+      <w:pPr>
+        <w:pStyle w:val="ListBullet"/>
+      </w:pPr>
+      <w:r>
+        <w:t>Regras do ciclo: duas avaliações por ano, critérios de assiduidade e pontualidade, conversa de devolutiva e plano de desenvolvimento individual.</w:t>
+      </w:r>
+    </w:p>
+    <w:p>
+      <w:pPr>
+        <w:pStyle w:val="ListBullet"/>
+      </w:pPr>
+      <w:r>
+        <w:t>Modelo de ligação com a gratificação de fim de ano, com simulação de provisão mensal. Os valores são decisão dela.</w:t>
+      </w:r>
+    </w:p>
+    <w:p>
+      <w:pPr>
+        <w:pStyle w:val="ListBullet"/>
+      </w:pPr>
+      <w:r>
+        <w:t>Guia de aplicação e uma sessão de preparação da Thamires para o primeiro ciclo.</w:t>
+      </w:r>
+    </w:p>
+    <w:tbl>
+      <w:tblPr>
+        <w:tblStyle w:val="TableGrid"/>
+        <w:tblW w:type="auto" w:w="0"/>
+        <w:jc w:val="center"/>
+        <w:tblLook w:firstColumn="1" w:firstRow="1" w:lastColumn="0" w:lastRow="0" w:noHBand="0" w:noVBand="1" w:val="04A0"/>
+      </w:tblPr>
+      <w:tblGrid>
+        <w:gridCol w:w="4873"/>
+        <w:gridCol w:w="4873"/>
+      </w:tblGrid>
+      <w:tr>
+        <w:tc>
+          <w:tcPr>
+            <w:tcW w:type="dxa" w:w="3402"/>
+            <w:shd w:val="clear" w:color="auto" w:fill="1F3A5F"/>
+          </w:tcPr>
+          <w:p>
+            <w:r/>
+            <w:r>
+              <w:rPr>
+                <w:b/>
+                <w:color w:val="FFFFFF"/>
+                <w:sz w:val="20"/>
+              </w:rPr>
+              <w:t>Item</w:t>
+            </w:r>
+          </w:p>
+        </w:tc>
+        <w:tc>
+          <w:tcPr>
+            <w:tcW w:type="dxa" w:w="5669"/>
+            <w:shd w:val="clear" w:color="auto" w:fill="1F3A5F"/>
+          </w:tcPr>
+          <w:p>
+            <w:r/>
+            <w:r>
+              <w:rPr>
+                <w:b/>
+                <w:color w:val="FFFFFF"/>
+                <w:sz w:val="20"/>
+              </w:rPr>
+              <w:t>Valor</w:t>
+            </w:r>
+          </w:p>
+        </w:tc>
+      </w:tr>
+      <w:tr>
+        <w:tc>
+          <w:tcPr>
+            <w:tcW w:type="dxa" w:w="3402"/>
+          </w:tcPr>
+          <w:p>
+            <w:r/>
+            <w:r>
+              <w:rPr>
+                <w:b w:val="0"/>
+                <w:sz w:val="20"/>
+              </w:rPr>
+              <w:t>Esforço estimado</w:t>
+            </w:r>
+          </w:p>
+        </w:tc>
+        <w:tc>
+          <w:tcPr>
+            <w:tcW w:type="dxa" w:w="5669"/>
+          </w:tcPr>
+          <w:p>
+            <w:r/>
+            <w:r>
+              <w:rPr>
+                <w:b w:val="0"/>
+                <w:sz w:val="20"/>
+              </w:rPr>
+              <w:t>18 h (15 h + 20% de contingência)</w:t>
+            </w:r>
+          </w:p>
+        </w:tc>
+      </w:tr>
+      <w:tr>
+        <w:tc>
+          <w:tcPr>
+            <w:tcW w:type="dxa" w:w="3402"/>
+          </w:tcPr>
+          <w:p>
+            <w:r/>
+            <w:r>
+              <w:rPr>
+                <w:b/>
+                <w:sz w:val="20"/>
+              </w:rPr>
+              <w:t>Investimento avulso</w:t>
+            </w:r>
+          </w:p>
+        </w:tc>
+        <w:tc>
+          <w:tcPr>
+            <w:tcW w:type="dxa" w:w="5669"/>
+          </w:tcPr>
+          <w:p>
+            <w:r/>
+            <w:r>
+              <w:rPr>
+                <w:b/>
+                <w:sz w:val="20"/>
+              </w:rPr>
+              <w:t>R$ 3.200</w:t>
+            </w:r>
+          </w:p>
+        </w:tc>
+      </w:tr>
+      <w:tr>
+        <w:tc>
+          <w:tcPr>
+            <w:tcW w:type="dxa" w:w="3402"/>
+          </w:tcPr>
+          <w:p>
+            <w:r/>
+            <w:r>
+              <w:rPr>
+                <w:b/>
+                <w:sz w:val="20"/>
+              </w:rPr>
+              <w:t>Contratado junto com a Completa</w:t>
+            </w:r>
+          </w:p>
+        </w:tc>
+        <w:tc>
+          <w:tcPr>
+            <w:tcW w:type="dxa" w:w="5669"/>
+          </w:tcPr>
+          <w:p>
+            <w:r/>
+            <w:r>
+              <w:rPr>
+                <w:b/>
+                <w:sz w:val="20"/>
+              </w:rPr>
+              <w:t>R$ 2.600** (reaproveita os papéis e indicadores da Etapa 2)</w:t>
+            </w:r>
+          </w:p>
+        </w:tc>
+      </w:tr>
+      <w:tr>
+        <w:tc>
+          <w:tcPr>
+            <w:tcW w:type="dxa" w:w="3402"/>
+          </w:tcPr>
+          <w:p>
+            <w:r/>
+            <w:r>
+              <w:rPr>
+                <w:b w:val="0"/>
+                <w:sz w:val="20"/>
+              </w:rPr>
+              <w:t>Quando</w:t>
+            </w:r>
+          </w:p>
+        </w:tc>
+        <w:tc>
+          <w:tcPr>
+            <w:tcW w:type="dxa" w:w="5669"/>
+          </w:tcPr>
+          <w:p>
+            <w:r/>
+            <w:r>
+              <w:rPr>
+                <w:b w:val="0"/>
+                <w:sz w:val="20"/>
+              </w:rPr>
+              <w:t>Janeiro de 2027, para que o primeiro ciclo cubra o 1º semestre de 2027</w:t>
+            </w:r>
+          </w:p>
+        </w:tc>
+      </w:tr>
+    </w:tbl>
+    <w:p/>
+    <w:tbl>
+      <w:tblPr>
+        <w:tblStyle w:val="TableGrid"/>
+        <w:tblW w:type="auto" w:w="0"/>
+        <w:tblLook w:firstColumn="1" w:firstRow="1" w:lastColumn="0" w:lastRow="0" w:noHBand="0" w:noVBand="1" w:val="04A0"/>
+      </w:tblPr>
+      <w:tblGrid>
+        <w:gridCol w:w="9746"/>
+      </w:tblGrid>
+      <w:tr>
+        <w:tc>
+          <w:tcPr>
+            <w:tcW w:type="dxa" w:w="9746"/>
+            <w:shd w:val="clear" w:color="auto" w:fill="FFF4D6"/>
+          </w:tcPr>
+          <w:p>
+            <w:r/>
+            <w:r>
+              <w:rPr>
+                <w:sz w:val="20"/>
+              </w:rPr>
+              <w:t>Os critérios e a gratificação precisam de revisão trabalhista antes de entrar em vigor, em especial o tratamento de faltas justificadas por atestado médico e a natureza jurídica do valor pago. Essa revisão não está incluída.</w:t>
+            </w:r>
+          </w:p>
+        </w:tc>
+      </w:tr>
+    </w:tbl>
+    <w:p/>
+    <w:p>
+      <w:pPr>
         <w:pStyle w:val="Heading1"/>
       </w:pPr>
       <w:r>

</xml_diff>

<commit_message>
Proposta Surcin: avaliação por competência dentro da Completa (R$ 17.400, entrega final em 22/01/2027)
Co-Authored-By: Claude Opus 5.5 (1M context) <noreply@anthropic.com>
Claude-Session: https://claude.ai/code/session_0127xFh2xB8HoQ18BDMAY2QJ
</commit_message>
<xml_diff>
--- a/proposta-surcin/04-proposta-comercial.docx
+++ b/proposta-surcin/04-proposta-comercial.docx
@@ -833,6 +833,53 @@
                 <w:sz w:val="20"/>
               </w:rPr>
               <w:t>Casos de uso priorizados por valor, risco, esforço e dependência, com módulos estimados e custo recorrente</w:t>
+            </w:r>
+          </w:p>
+        </w:tc>
+      </w:tr>
+      <w:tr>
+        <w:tc>
+          <w:tcPr>
+            <w:tcW w:type="dxa" w:w="3118"/>
+          </w:tcPr>
+          <w:p>
+            <w:r/>
+            <w:r>
+              <w:rPr>
+                <w:b w:val="0"/>
+                <w:sz w:val="20"/>
+              </w:rPr>
+              <w:t>Avaliação de desempenho por competência</w:t>
+            </w:r>
+          </w:p>
+        </w:tc>
+        <w:tc>
+          <w:tcPr>
+            <w:tcW w:type="dxa" w:w="2551"/>
+          </w:tcPr>
+          <w:p>
+            <w:r/>
+            <w:r>
+              <w:rPr>
+                <w:b w:val="0"/>
+                <w:sz w:val="20"/>
+              </w:rPr>
+              <w:t>Não (pode ser contratada à parte por R$ 3.200)</w:t>
+            </w:r>
+          </w:p>
+        </w:tc>
+        <w:tc>
+          <w:tcPr>
+            <w:tcW w:type="dxa" w:w="3402"/>
+          </w:tcPr>
+          <w:p>
+            <w:r/>
+            <w:r>
+              <w:rPr>
+                <w:b w:val="0"/>
+                <w:sz w:val="20"/>
+              </w:rPr>
+              <w:t>Sim, em janeiro de 2027: matriz de competências, formulário, ciclo semestral e ligação com a gratificação</w:t>
             </w:r>
           </w:p>
         </w:tc>
@@ -2168,6 +2215,53 @@
                 <w:b w:val="0"/>
                 <w:sz w:val="20"/>
               </w:rPr>
+              <w:t>Avaliação de desempenho por competência</w:t>
+            </w:r>
+          </w:p>
+        </w:tc>
+        <w:tc>
+          <w:tcPr>
+            <w:tcW w:type="dxa" w:w="1984"/>
+          </w:tcPr>
+          <w:p>
+            <w:r/>
+            <w:r>
+              <w:rPr>
+                <w:b w:val="0"/>
+                <w:sz w:val="20"/>
+              </w:rPr>
+              <w:t>-</w:t>
+            </w:r>
+          </w:p>
+        </w:tc>
+        <w:tc>
+          <w:tcPr>
+            <w:tcW w:type="dxa" w:w="1984"/>
+          </w:tcPr>
+          <w:p>
+            <w:r/>
+            <w:r>
+              <w:rPr>
+                <w:b w:val="0"/>
+                <w:sz w:val="20"/>
+              </w:rPr>
+              <w:t>12</w:t>
+            </w:r>
+          </w:p>
+        </w:tc>
+      </w:tr>
+      <w:tr>
+        <w:tc>
+          <w:tcPr>
+            <w:tcW w:type="dxa" w:w="5102"/>
+          </w:tcPr>
+          <w:p>
+            <w:r/>
+            <w:r>
+              <w:rPr>
+                <w:b w:val="0"/>
+                <w:sz w:val="20"/>
+              </w:rPr>
               <w:t>Contingência (20%)</w:t>
             </w:r>
           </w:p>
@@ -2198,7 +2292,7 @@
                 <w:b w:val="0"/>
                 <w:sz w:val="20"/>
               </w:rPr>
-              <w:t>13,5</w:t>
+              <w:t>16</w:t>
             </w:r>
           </w:p>
         </w:tc>
@@ -2245,7 +2339,7 @@
                 <w:b/>
                 <w:sz w:val="20"/>
               </w:rPr>
-              <w:t>~81 h</w:t>
+              <w:t>~96 h</w:t>
             </w:r>
           </w:p>
         </w:tc>
@@ -2399,7 +2493,7 @@
                 <w:b/>
                 <w:sz w:val="20"/>
               </w:rPr>
-              <w:t>R$ 14.800</w:t>
+              <w:t>R$ 17.400</w:t>
             </w:r>
           </w:p>
         </w:tc>
@@ -2414,7 +2508,7 @@
                 <w:b w:val="0"/>
                 <w:sz w:val="20"/>
               </w:rPr>
-              <w:t>30% no aceite, 35% na entrega do mapeamento, 35% na entrega final</w:t>
+              <w:t>30% no aceite, 35% na entrega do mapeamento, 35% na entrega final (janeiro de 2027)</w:t>
             </w:r>
           </w:p>
         </w:tc>
@@ -2481,7 +2575,7 @@
         <w:pStyle w:val="Heading3"/>
       </w:pPr>
       <w:r>
-        <w:t>Módulo opcional · Avaliação de desempenho por competência</w:t>
+        <w:t>Avaliação de desempenho por competência (incluída na Completa)</w:t>
       </w:r>
     </w:p>
     <w:p>
@@ -2591,7 +2685,7 @@
                 <w:b w:val="0"/>
                 <w:sz w:val="20"/>
               </w:rPr>
-              <w:t>Esforço estimado</w:t>
+              <w:t>Na opção Completa</w:t>
             </w:r>
           </w:p>
         </w:tc>
@@ -2606,7 +2700,7 @@
                 <w:b w:val="0"/>
                 <w:sz w:val="20"/>
               </w:rPr>
-              <w:t>18 h (15 h + 20% de contingência)</w:t>
+              <w:t>Incluída no valor (cerca de 14 h, reaproveitando os papéis e indicadores da estrutura organizacional)</w:t>
             </w:r>
           </w:p>
         </w:tc>
@@ -2623,7 +2717,7 @@
                 <w:b/>
                 <w:sz w:val="20"/>
               </w:rPr>
-              <w:t>Investimento avulso</w:t>
+              <w:t>Com a Essencial ou contratada depois</w:t>
             </w:r>
           </w:p>
         </w:tc>
@@ -2638,39 +2732,7 @@
                 <w:b/>
                 <w:sz w:val="20"/>
               </w:rPr>
-              <w:t>R$ 3.200</w:t>
-            </w:r>
-          </w:p>
-        </w:tc>
-      </w:tr>
-      <w:tr>
-        <w:tc>
-          <w:tcPr>
-            <w:tcW w:type="dxa" w:w="3402"/>
-          </w:tcPr>
-          <w:p>
-            <w:r/>
-            <w:r>
-              <w:rPr>
-                <w:b/>
-                <w:sz w:val="20"/>
-              </w:rPr>
-              <w:t>Contratado junto com a Completa</w:t>
-            </w:r>
-          </w:p>
-        </w:tc>
-        <w:tc>
-          <w:tcPr>
-            <w:tcW w:type="dxa" w:w="5669"/>
-          </w:tcPr>
-          <w:p>
-            <w:r/>
-            <w:r>
-              <w:rPr>
-                <w:b/>
-                <w:sz w:val="20"/>
-              </w:rPr>
-              <w:t>R$ 2.600** (reaproveita os papéis e indicadores da Etapa 2)</w:t>
+              <w:t>R$ 3.200** (cerca de 18 h)</w:t>
             </w:r>
           </w:p>
         </w:tc>
@@ -3127,7 +3189,54 @@
                 <w:b w:val="0"/>
                 <w:sz w:val="20"/>
               </w:rPr>
-              <w:t>Apresentação final e proposta dos módulos da Fase 2</w:t>
+              <w:t>Apresentação dos fluxos e do plano de automação; proposta dos módulos da Fase 2</w:t>
+            </w:r>
+          </w:p>
+        </w:tc>
+        <w:tc>
+          <w:tcPr>
+            <w:tcW w:type="dxa" w:w="2381"/>
+          </w:tcPr>
+          <w:p>
+            <w:r/>
+            <w:r>
+              <w:rPr>
+                <w:b w:val="0"/>
+                <w:sz w:val="20"/>
+              </w:rPr>
+              <w:t>Thamires 2 h</w:t>
+            </w:r>
+          </w:p>
+        </w:tc>
+      </w:tr>
+      <w:tr>
+        <w:tc>
+          <w:tcPr>
+            <w:tcW w:type="dxa" w:w="1587"/>
+          </w:tcPr>
+          <w:p>
+            <w:r/>
+            <w:r>
+              <w:rPr>
+                <w:b w:val="0"/>
+                <w:sz w:val="20"/>
+              </w:rPr>
+              <w:t>05 a 22/01/2027</w:t>
+            </w:r>
+          </w:p>
+        </w:tc>
+        <w:tc>
+          <w:tcPr>
+            <w:tcW w:type="dxa" w:w="5102"/>
+          </w:tcPr>
+          <w:p>
+            <w:r/>
+            <w:r>
+              <w:rPr>
+                <w:b w:val="0"/>
+                <w:sz w:val="20"/>
+              </w:rPr>
+              <w:t>Avaliação de desempenho por competência: matriz, formulário, regras do ciclo e gratificação; entrega final</w:t>
             </w:r>
           </w:p>
         </w:tc>

</xml_diff>

<commit_message>
Proposta Surcin: disponibilidade do consultor (6h-10h, após 19h30, fins de semana)
Co-Authored-By: Claude Opus 5.5 (1M context) <noreply@anthropic.com>
Claude-Session: https://claude.ai/code/session_0127xFh2xB8HoQ18BDMAY2QJ
</commit_message>
<xml_diff>
--- a/proposta-surcin/04-proposta-comercial.docx
+++ b/proposta-surcin/04-proposta-comercial.docx
@@ -2812,7 +2812,7 @@
         <w:rPr>
           <w:i w:val="0"/>
         </w:rPr>
-        <w:t>Cerca de 10 horas por semana do consultor, fora do horário comercial. Respeita as férias da Vitória (retorno em 28/10), a semana de fechamentos no início do mês e a prova da Thamires em 13/12.</w:t>
+        <w:t>Cerca de 10 horas por semana do consultor, segunda a sexta das 6h às 10h e depois das 19h30, além de sábados e domingos. Respeita as férias da Vitória (retorno em 28/10), a semana de fechamentos no início do mês e a prova da Thamires em 13/12.</w:t>
       </w:r>
     </w:p>
     <w:tbl>
@@ -3632,7 +3632,15 @@
         <w:pStyle w:val="ListBullet"/>
       </w:pPr>
       <w:r>
-        <w:t>Responder mensagens em até 1 dia útil.</w:t>
+        <w:t>Trabalhar no projeto de segunda a sexta das 6h às 10h e depois das 19h30, além de sábados e domingos.</w:t>
+      </w:r>
+    </w:p>
+    <w:p>
+      <w:pPr>
+        <w:pStyle w:val="ListBullet"/>
+      </w:pPr>
+      <w:r>
+        <w:t>Responder mensagens em até 1 dia útil, dentro dessas janelas.</w:t>
       </w:r>
     </w:p>
     <w:p>
@@ -3664,7 +3672,7 @@
         <w:pStyle w:val="ListBullet"/>
       </w:pPr>
       <w:r>
-        <w:t>Liberar a equipe para entrevistas de cerca de 1 hora, de preferência antes das 10h30, no almoço ou após as 19h30.</w:t>
+        <w:t>Liberar a equipe para entrevistas de cerca de 1 hora, no início do expediente (antes das 10h) ou após as 19h30.</w:t>
       </w:r>
     </w:p>
     <w:p>
@@ -3696,7 +3704,7 @@
         <w:pStyle w:val="ListBullet"/>
       </w:pPr>
       <w:r>
-        <w:t>Reuniões preferencialmente online, nas janelas acima.</w:t>
+        <w:t>Reuniões preferencialmente online, dentro da disponibilidade do consultor: segunda a sexta das 6h às 10h e depois das 19h30, além de sábados e domingos.</w:t>
       </w:r>
     </w:p>
     <w:p>

</xml_diff>

<commit_message>
Proposta comercial: oferta única de R$ 31.900 em 8 semanas, com integrações, avaliação e painéis
Co-Authored-By: Claude Opus 5.5 (1M context) <noreply@anthropic.com>
Claude-Session: https://claude.ai/code/session_0127xFh2xB8HoQ18BDMAY2QJ
</commit_message>
<xml_diff>
--- a/proposta-surcin/04-proposta-comercial.docx
+++ b/proposta-surcin/04-proposta-comercial.docx
@@ -18,7 +18,7 @@
           <w:color w:val="595959"/>
           <w:sz w:val="26"/>
         </w:rPr>
-        <w:t>Organização, estrutura, processos e plano de automação · Surcin Assessoria Empresarial</w:t>
+        <w:t>Organização, processos, rotinas do Claude e pilotos de automação · Surcin Assessoria Empresarial</w:t>
       </w:r>
     </w:p>
     <w:p>
@@ -28,37 +28,9 @@
           <w:color w:val="595959"/>
           <w:sz w:val="18"/>
         </w:rPr>
-        <w:t>Versão 4 · 13/10/2026 · dados reconferidos com a transcrição · uso interno até revisão do Renato</w:t>
+        <w:t>Versão 5 · 22/10/2026 · oferta única · válida até 30/10/2026</w:t>
       </w:r>
     </w:p>
-    <w:tbl>
-      <w:tblPr>
-        <w:tblStyle w:val="TableGrid"/>
-        <w:tblW w:type="auto" w:w="0"/>
-        <w:tblLook w:firstColumn="1" w:firstRow="1" w:lastColumn="0" w:lastRow="0" w:noHBand="0" w:noVBand="1" w:val="04A0"/>
-      </w:tblPr>
-      <w:tblGrid>
-        <w:gridCol w:w="9746"/>
-      </w:tblGrid>
-      <w:tr>
-        <w:tc>
-          <w:tcPr>
-            <w:tcW w:type="dxa" w:w="9746"/>
-            <w:shd w:val="clear" w:color="auto" w:fill="FFF4D6"/>
-          </w:tcPr>
-          <w:p>
-            <w:r/>
-            <w:r>
-              <w:rPr>
-                <w:sz w:val="20"/>
-              </w:rPr>
-              <w:t>Valores calculados com taxa de referência de cerca de R$ 180/h e capacidade de 10 h/semana do consultor, com 20% de contingência. Aguardam confirmação do Renato antes do envio.</w:t>
-            </w:r>
-          </w:p>
-        </w:tc>
-      </w:tr>
-    </w:tbl>
-    <w:p/>
     <w:p>
       <w:pPr>
         <w:pStyle w:val="Heading1"/>
@@ -80,7 +52,7 @@
         <w:rPr>
           <w:i w:val="0"/>
         </w:rPr>
-        <w:t>O briefing enviado pela Surcin pede uma proposta modular, com entregas verificáveis, que gere ganhos ainda em outubro e novembro sem consumir o tempo de estudo da Thamires, e que não seja vendida como "colocar IA em todos os setores". Esta proposta segue esse caminho: primeiro processo, controle e estrutura; depois automação assistida, em módulos orçados um a um.</w:t>
+        <w:t>O objetivo é que, a partir de janeiro de 2027, a equipe opere com papéis claros, fluxos documentados, rotinas do Claude testadas e indicadores por área, sem depender da Thamires para cada decisão. A ordem é sempre a mesma: primeiro processo e controle, depois ferramenta e automação assistida.</w:t>
       </w:r>
     </w:p>
     <w:p>
@@ -88,7 +60,7 @@
         <w:pStyle w:val="Heading1"/>
       </w:pPr>
       <w:r>
-        <w:t>2. Objetivos</w:t>
+        <w:t>2. O que a Surcin recebe</w:t>
       </w:r>
     </w:p>
     <w:p>
@@ -96,7 +68,7 @@
         <w:pStyle w:val="ListBullet"/>
       </w:pPr>
       <w:r>
-        <w:t>Reduzir já os riscos mais caros (guia do cliente errado, tarefa concluída sem evidência, dúvidas repetidas) com controles que não exigem software.</w:t>
+        <w:t>Diagnóstico, mapa dos processos atuais e plano inicial.</w:t>
       </w:r>
     </w:p>
     <w:p>
@@ -104,7 +76,7 @@
         <w:pStyle w:val="ListBullet"/>
       </w:pPr>
       <w:r>
-        <w:t>Tirar a Thamires do centro da operação: papéis claros, critérios de revisão e escalonamento só para exceções.</w:t>
+        <w:t>Organograma funcional, matriz de responsabilidades e alçadas.</w:t>
       </w:r>
     </w:p>
     <w:p>
@@ -112,7 +84,7 @@
         <w:pStyle w:val="ListBullet"/>
       </w:pPr>
       <w:r>
-        <w:t>Tornar visíveis os fluxos, gargalos e dependências entre pessoas e sistemas.</w:t>
+        <w:t>Fluxos futuros e listas de verificação da entrada do cliente e da passagem formal para a operação.</w:t>
       </w:r>
     </w:p>
     <w:p>
@@ -120,7 +92,7 @@
         <w:pStyle w:val="ListBullet"/>
       </w:pPr>
       <w:r>
-        <w:t>Entregar o plano de automação priorizado por valor, risco, esforço e dependência externa, com custo recorrente estimado.</w:t>
+        <w:t>Biblioteca de 5 rotinas do Claude documentadas e testadas.</w:t>
       </w:r>
     </w:p>
     <w:p>
@@ -128,7 +100,39 @@
         <w:pStyle w:val="ListBullet"/>
       </w:pPr>
       <w:r>
-        <w:t>Preparar a operação para a retomada comercial e para as decisões de contratação de janeiro de 2027.</w:t>
+        <w:t>2 pilotos demonstrados, com resultados registrados.</w:t>
+      </w:r>
+    </w:p>
+    <w:p>
+      <w:pPr>
+        <w:pStyle w:val="ListBullet"/>
+      </w:pPr>
+      <w:r>
+        <w:t>Até 2 integrações implantadas entre sistemas de viabilidade confirmada.</w:t>
+      </w:r>
+    </w:p>
+    <w:p>
+      <w:pPr>
+        <w:pStyle w:val="ListBullet"/>
+      </w:pPr>
+      <w:r>
+        <w:t>Painel de indicadores por área (DP, Financeiro, Contabilidade e Comercial) e visão da diretoria.</w:t>
+      </w:r>
+    </w:p>
+    <w:p>
+      <w:pPr>
+        <w:pStyle w:val="ListBullet"/>
+      </w:pPr>
+      <w:r>
+        <w:t>Primeiro ciclo de avaliação de desempenho por competência.</w:t>
+      </w:r>
+    </w:p>
+    <w:p>
+      <w:pPr>
+        <w:pStyle w:val="ListBullet"/>
+      </w:pPr>
+      <w:r>
+        <w:t>Manuais, 3 treinamentos e plano de evolução.</w:t>
       </w:r>
     </w:p>
     <w:p>
@@ -136,7 +140,7 @@
         <w:pStyle w:val="Heading1"/>
       </w:pPr>
       <w:r>
-        <w:t>3. O que esta proposta cobre (e o que não cobre)</w:t>
+        <w:t>3. Etapas, datas e aceites</w:t>
       </w:r>
     </w:p>
     <w:p>
@@ -144,7 +148,7 @@
         <w:rPr>
           <w:i w:val="0"/>
         </w:rPr>
-        <w:t>O briefing pede que consultoria, implantação, desenvolvimento, integrações, licenças e manutenção fiquem separados.</w:t>
+        <w:t>Um projeto deste porte normalmente leva cerca de 18 semanas. Para atender ao prazo da Surcin, ele foi condensado em 8 semanas, de 03/11 a 23/12/2026, com etapas sobrepostas. A partir de janeiro, a Surcin opera com o que foi implantado.</w:t>
       </w:r>
     </w:p>
     <w:tbl>
@@ -152,16 +156,20 @@
         <w:tblStyle w:val="TableGrid"/>
         <w:tblW w:type="auto" w:w="0"/>
         <w:jc w:val="center"/>
+        <w:tblLayout w:type="fixed"/>
         <w:tblLook w:firstColumn="1" w:firstRow="1" w:lastColumn="0" w:lastRow="0" w:noHBand="0" w:noVBand="1" w:val="04A0"/>
       </w:tblPr>
       <w:tblGrid>
-        <w:gridCol w:w="4873"/>
-        <w:gridCol w:w="4873"/>
+        <w:gridCol w:w="1814"/>
+        <w:gridCol w:w="1247"/>
+        <w:gridCol w:w="794"/>
+        <w:gridCol w:w="3175"/>
+        <w:gridCol w:w="2381"/>
       </w:tblGrid>
       <w:tr>
         <w:tc>
           <w:tcPr>
-            <w:tcW w:type="dxa" w:w="5102"/>
+            <w:tcW w:type="dxa" w:w="1814"/>
             <w:shd w:val="clear" w:color="auto" w:fill="1F3A5F"/>
           </w:tcPr>
           <w:p>
@@ -172,13 +180,13 @@
                 <w:color w:val="FFFFFF"/>
                 <w:sz w:val="20"/>
               </w:rPr>
-              <w:t>Frente</w:t>
+              <w:t>Etapa</w:t>
             </w:r>
           </w:p>
         </w:tc>
         <w:tc>
           <w:tcPr>
-            <w:tcW w:type="dxa" w:w="3969"/>
+            <w:tcW w:type="dxa" w:w="1247"/>
             <w:shd w:val="clear" w:color="auto" w:fill="1F3A5F"/>
           </w:tcPr>
           <w:p>
@@ -189,229 +197,13 @@
                 <w:color w:val="FFFFFF"/>
                 <w:sz w:val="20"/>
               </w:rPr>
-              <w:t>Situação nesta proposta</w:t>
-            </w:r>
-          </w:p>
-        </w:tc>
-      </w:tr>
-      <w:tr>
-        <w:tc>
-          <w:tcPr>
-            <w:tcW w:type="dxa" w:w="5102"/>
-          </w:tcPr>
-          <w:p>
-            <w:r/>
-            <w:r>
-              <w:rPr>
-                <w:b w:val="0"/>
-                <w:sz w:val="20"/>
-              </w:rPr>
-              <w:t>Consultoria: diagnóstico, mapeamento, estrutura, plano</w:t>
+              <w:t>Período</w:t>
             </w:r>
           </w:p>
         </w:tc>
         <w:tc>
           <w:tcPr>
-            <w:tcW w:type="dxa" w:w="3969"/>
-          </w:tcPr>
-          <w:p>
-            <w:r/>
-            <w:r>
-              <w:rPr>
-                <w:b w:val="0"/>
-                <w:sz w:val="20"/>
-              </w:rPr>
-              <w:t>Incluída (Fase 1, preço fechado)</w:t>
-            </w:r>
-          </w:p>
-        </w:tc>
-      </w:tr>
-      <w:tr>
-        <w:tc>
-          <w:tcPr>
-            <w:tcW w:type="dxa" w:w="5102"/>
-          </w:tcPr>
-          <w:p>
-            <w:r/>
-            <w:r>
-              <w:rPr>
-                <w:b w:val="0"/>
-                <w:sz w:val="20"/>
-              </w:rPr>
-              <w:t>Contenção imediata: 3 controles manuais</w:t>
-            </w:r>
-          </w:p>
-        </w:tc>
-        <w:tc>
-          <w:tcPr>
-            <w:tcW w:type="dxa" w:w="3969"/>
-          </w:tcPr>
-          <w:p>
-            <w:r/>
-            <w:r>
-              <w:rPr>
-                <w:b w:val="0"/>
-                <w:sz w:val="20"/>
-              </w:rPr>
-              <w:t>Incluída na opção Completa</w:t>
-            </w:r>
-          </w:p>
-        </w:tc>
-      </w:tr>
-      <w:tr>
-        <w:tc>
-          <w:tcPr>
-            <w:tcW w:type="dxa" w:w="5102"/>
-          </w:tcPr>
-          <w:p>
-            <w:r/>
-            <w:r>
-              <w:rPr>
-                <w:b w:val="0"/>
-                <w:sz w:val="20"/>
-              </w:rPr>
-              <w:t>Implantação e desenvolvimento: ambiente Claude, especialistas, validadores, painéis</w:t>
-            </w:r>
-          </w:p>
-        </w:tc>
-        <w:tc>
-          <w:tcPr>
-            <w:tcW w:type="dxa" w:w="3969"/>
-          </w:tcPr>
-          <w:p>
-            <w:r/>
-            <w:r>
-              <w:rPr>
-                <w:b w:val="0"/>
-                <w:sz w:val="20"/>
-              </w:rPr>
-              <w:t>Fase 2, módulos orçados à parte após o plano</w:t>
-            </w:r>
-          </w:p>
-        </w:tc>
-      </w:tr>
-      <w:tr>
-        <w:tc>
-          <w:tcPr>
-            <w:tcW w:type="dxa" w:w="5102"/>
-          </w:tcPr>
-          <w:p>
-            <w:r/>
-            <w:r>
-              <w:rPr>
-                <w:b w:val="0"/>
-                <w:sz w:val="20"/>
-              </w:rPr>
-              <w:t>Integrações (Conta Azul, Domínio, Nestzap, OneDrive, Trello)</w:t>
-            </w:r>
-          </w:p>
-        </w:tc>
-        <w:tc>
-          <w:tcPr>
-            <w:tcW w:type="dxa" w:w="3969"/>
-          </w:tcPr>
-          <w:p>
-            <w:r/>
-            <w:r>
-              <w:rPr>
-                <w:b w:val="0"/>
-                <w:sz w:val="20"/>
-              </w:rPr>
-              <w:t>Fase 2, cada uma com prova de viabilidade antes de orçar</w:t>
-            </w:r>
-          </w:p>
-        </w:tc>
-      </w:tr>
-      <w:tr>
-        <w:tc>
-          <w:tcPr>
-            <w:tcW w:type="dxa" w:w="5102"/>
-          </w:tcPr>
-          <w:p>
-            <w:r/>
-            <w:r>
-              <w:rPr>
-                <w:b w:val="0"/>
-                <w:sz w:val="20"/>
-              </w:rPr>
-              <w:t>Licenças e ferramentas</w:t>
-            </w:r>
-          </w:p>
-        </w:tc>
-        <w:tc>
-          <w:tcPr>
-            <w:tcW w:type="dxa" w:w="3969"/>
-          </w:tcPr>
-          <w:p>
-            <w:r/>
-            <w:r>
-              <w:rPr>
-                <w:b w:val="0"/>
-                <w:sz w:val="20"/>
-              </w:rPr>
-              <w:t>Por conta da Surcin; estimativa mensal entregue no plano</w:t>
-            </w:r>
-          </w:p>
-        </w:tc>
-      </w:tr>
-      <w:tr>
-        <w:tc>
-          <w:tcPr>
-            <w:tcW w:type="dxa" w:w="5102"/>
-          </w:tcPr>
-          <w:p>
-            <w:r/>
-            <w:r>
-              <w:rPr>
-                <w:b w:val="0"/>
-                <w:sz w:val="20"/>
-              </w:rPr>
-              <w:t>Manutenção e suporte</w:t>
-            </w:r>
-          </w:p>
-        </w:tc>
-        <w:tc>
-          <w:tcPr>
-            <w:tcW w:type="dxa" w:w="3969"/>
-          </w:tcPr>
-          <w:p>
-            <w:r/>
-            <w:r>
-              <w:rPr>
-                <w:b w:val="0"/>
-                <w:sz w:val="20"/>
-              </w:rPr>
-              <w:t>Fase 3, mensalidade com franquia de horas, opcional</w:t>
-            </w:r>
-          </w:p>
-        </w:tc>
-      </w:tr>
-    </w:tbl>
-    <w:p/>
-    <w:p>
-      <w:pPr>
-        <w:pStyle w:val="Heading1"/>
-      </w:pPr>
-      <w:r>
-        <w:t>4. Fase 1 · Diagnóstico, estrutura e plano: duas opções</w:t>
-      </w:r>
-    </w:p>
-    <w:tbl>
-      <w:tblPr>
-        <w:tblStyle w:val="TableGrid"/>
-        <w:tblW w:type="auto" w:w="0"/>
-        <w:jc w:val="center"/>
-        <w:tblLook w:firstColumn="1" w:firstRow="1" w:lastColumn="0" w:lastRow="0" w:noHBand="0" w:noVBand="1" w:val="04A0"/>
-      </w:tblPr>
-      <w:tblGrid>
-        <w:gridCol w:w="3249"/>
-        <w:gridCol w:w="3249"/>
-        <w:gridCol w:w="3249"/>
-      </w:tblGrid>
-      <w:tr>
-        <w:tc>
-          <w:tcPr>
-            <w:tcW w:type="dxa" w:w="3118"/>
+            <w:tcW w:type="dxa" w:w="794"/>
             <w:shd w:val="clear" w:color="auto" w:fill="1F3A5F"/>
           </w:tcPr>
           <w:p>
@@ -422,625 +214,13 @@
                 <w:color w:val="FFFFFF"/>
                 <w:sz w:val="20"/>
               </w:rPr>
-              <w:t>Entregável</w:t>
+              <w:t>Horas</w:t>
             </w:r>
           </w:p>
         </w:tc>
         <w:tc>
           <w:tcPr>
-            <w:tcW w:type="dxa" w:w="2551"/>
-            <w:shd w:val="clear" w:color="auto" w:fill="1F3A5F"/>
-          </w:tcPr>
-          <w:p>
-            <w:r/>
-            <w:r>
-              <w:rPr>
-                <w:b/>
-                <w:color w:val="FFFFFF"/>
-                <w:sz w:val="20"/>
-              </w:rPr>
-              <w:t>Essencial</w:t>
-            </w:r>
-          </w:p>
-        </w:tc>
-        <w:tc>
-          <w:tcPr>
-            <w:tcW w:type="dxa" w:w="3402"/>
-            <w:shd w:val="clear" w:color="auto" w:fill="1F3A5F"/>
-          </w:tcPr>
-          <w:p>
-            <w:r/>
-            <w:r>
-              <w:rPr>
-                <w:b/>
-                <w:color w:val="FFFFFF"/>
-                <w:sz w:val="20"/>
-              </w:rPr>
-              <w:t>Completa (recomendada)</w:t>
-            </w:r>
-          </w:p>
-        </w:tc>
-      </w:tr>
-      <w:tr>
-        <w:tc>
-          <w:tcPr>
-            <w:tcW w:type="dxa" w:w="3118"/>
-          </w:tcPr>
-          <w:p>
-            <w:r/>
-            <w:r>
-              <w:rPr>
-                <w:b w:val="0"/>
-                <w:sz w:val="20"/>
-              </w:rPr>
-              <w:t>Entrevistas (cerca de 1 h cada)</w:t>
-            </w:r>
-          </w:p>
-        </w:tc>
-        <w:tc>
-          <w:tcPr>
-            <w:tcW w:type="dxa" w:w="2551"/>
-          </w:tcPr>
-          <w:p>
-            <w:r/>
-            <w:r>
-              <w:rPr>
-                <w:b w:val="0"/>
-                <w:sz w:val="20"/>
-              </w:rPr>
-              <w:t>Até 4 pessoas: Thamires, Júlia, Vitória, Tamara</w:t>
-            </w:r>
-          </w:p>
-        </w:tc>
-        <w:tc>
-          <w:tcPr>
-            <w:tcW w:type="dxa" w:w="3402"/>
-          </w:tcPr>
-          <w:p>
-            <w:r/>
-            <w:r>
-              <w:rPr>
-                <w:b w:val="0"/>
-                <w:sz w:val="20"/>
-              </w:rPr>
-              <w:t>Até 5 pessoas (inclui a Alana)</w:t>
-            </w:r>
-          </w:p>
-        </w:tc>
-      </w:tr>
-      <w:tr>
-        <w:tc>
-          <w:tcPr>
-            <w:tcW w:type="dxa" w:w="3118"/>
-          </w:tcPr>
-          <w:p>
-            <w:r/>
-            <w:r>
-              <w:rPr>
-                <w:b w:val="0"/>
-                <w:sz w:val="20"/>
-              </w:rPr>
-              <w:t>Processos atuais mapeados e validados</w:t>
-            </w:r>
-          </w:p>
-        </w:tc>
-        <w:tc>
-          <w:tcPr>
-            <w:tcW w:type="dxa" w:w="2551"/>
-          </w:tcPr>
-          <w:p>
-            <w:r/>
-            <w:r>
-              <w:rPr>
-                <w:b w:val="0"/>
-                <w:sz w:val="20"/>
-              </w:rPr>
-              <w:t>Até 5</w:t>
-            </w:r>
-          </w:p>
-        </w:tc>
-        <w:tc>
-          <w:tcPr>
-            <w:tcW w:type="dxa" w:w="3402"/>
-          </w:tcPr>
-          <w:p>
-            <w:r/>
-            <w:r>
-              <w:rPr>
-                <w:b w:val="0"/>
-                <w:sz w:val="20"/>
-              </w:rPr>
-              <w:t>Até 8, entre os 11 identificados</w:t>
-            </w:r>
-          </w:p>
-        </w:tc>
-      </w:tr>
-      <w:tr>
-        <w:tc>
-          <w:tcPr>
-            <w:tcW w:type="dxa" w:w="3118"/>
-          </w:tcPr>
-          <w:p>
-            <w:r/>
-            <w:r>
-              <w:rPr>
-                <w:b w:val="0"/>
-                <w:sz w:val="20"/>
-              </w:rPr>
-              <w:t>Gargalos e matriz de dependências</w:t>
-            </w:r>
-          </w:p>
-        </w:tc>
-        <w:tc>
-          <w:tcPr>
-            <w:tcW w:type="dxa" w:w="2551"/>
-          </w:tcPr>
-          <w:p>
-            <w:r/>
-            <w:r>
-              <w:rPr>
-                <w:b w:val="0"/>
-                <w:sz w:val="20"/>
-              </w:rPr>
-              <w:t>Sim</w:t>
-            </w:r>
-          </w:p>
-        </w:tc>
-        <w:tc>
-          <w:tcPr>
-            <w:tcW w:type="dxa" w:w="3402"/>
-          </w:tcPr>
-          <w:p>
-            <w:r/>
-            <w:r>
-              <w:rPr>
-                <w:b w:val="0"/>
-                <w:sz w:val="20"/>
-              </w:rPr>
-              <w:t>Sim</w:t>
-            </w:r>
-          </w:p>
-        </w:tc>
-      </w:tr>
-      <w:tr>
-        <w:tc>
-          <w:tcPr>
-            <w:tcW w:type="dxa" w:w="3118"/>
-          </w:tcPr>
-          <w:p>
-            <w:r/>
-            <w:r>
-              <w:rPr>
-                <w:b w:val="0"/>
-                <w:sz w:val="20"/>
-              </w:rPr>
-              <w:t>Inventário de ferramentas, contas, licenças e acessos</w:t>
-            </w:r>
-          </w:p>
-        </w:tc>
-        <w:tc>
-          <w:tcPr>
-            <w:tcW w:type="dxa" w:w="2551"/>
-          </w:tcPr>
-          <w:p>
-            <w:r/>
-            <w:r>
-              <w:rPr>
-                <w:b w:val="0"/>
-                <w:sz w:val="20"/>
-              </w:rPr>
-              <w:t>Sim</w:t>
-            </w:r>
-          </w:p>
-        </w:tc>
-        <w:tc>
-          <w:tcPr>
-            <w:tcW w:type="dxa" w:w="3402"/>
-          </w:tcPr>
-          <w:p>
-            <w:r/>
-            <w:r>
-              <w:rPr>
-                <w:b w:val="0"/>
-                <w:sz w:val="20"/>
-              </w:rPr>
-              <w:t>Sim</w:t>
-            </w:r>
-          </w:p>
-        </w:tc>
-      </w:tr>
-      <w:tr>
-        <w:tc>
-          <w:tcPr>
-            <w:tcW w:type="dxa" w:w="3118"/>
-          </w:tcPr>
-          <w:p>
-            <w:r/>
-            <w:r>
-              <w:rPr>
-                <w:b w:val="0"/>
-                <w:sz w:val="20"/>
-              </w:rPr>
-              <w:t>Contenção imediata: 3 controles manuais implantados com a equipe</w:t>
-            </w:r>
-          </w:p>
-        </w:tc>
-        <w:tc>
-          <w:tcPr>
-            <w:tcW w:type="dxa" w:w="2551"/>
-          </w:tcPr>
-          <w:p>
-            <w:r/>
-            <w:r>
-              <w:rPr>
-                <w:b w:val="0"/>
-                <w:sz w:val="20"/>
-              </w:rPr>
-              <w:t>Não</w:t>
-            </w:r>
-          </w:p>
-        </w:tc>
-        <w:tc>
-          <w:tcPr>
-            <w:tcW w:type="dxa" w:w="3402"/>
-          </w:tcPr>
-          <w:p>
-            <w:r/>
-            <w:r>
-              <w:rPr>
-                <w:b w:val="0"/>
-                <w:sz w:val="20"/>
-              </w:rPr>
-              <w:t>Sim, até 15/11</w:t>
-            </w:r>
-          </w:p>
-        </w:tc>
-      </w:tr>
-      <w:tr>
-        <w:tc>
-          <w:tcPr>
-            <w:tcW w:type="dxa" w:w="3118"/>
-          </w:tcPr>
-          <w:p>
-            <w:r/>
-            <w:r>
-              <w:rPr>
-                <w:b w:val="0"/>
-                <w:sz w:val="20"/>
-              </w:rPr>
-              <w:t>Estrutura organizacional</w:t>
-            </w:r>
-          </w:p>
-        </w:tc>
-        <w:tc>
-          <w:tcPr>
-            <w:tcW w:type="dxa" w:w="2551"/>
-          </w:tcPr>
-          <w:p>
-            <w:r/>
-            <w:r>
-              <w:rPr>
-                <w:b w:val="0"/>
-                <w:sz w:val="20"/>
-              </w:rPr>
-              <w:t>Organograma e matriz de responsabilidades</w:t>
-            </w:r>
-          </w:p>
-        </w:tc>
-        <w:tc>
-          <w:tcPr>
-            <w:tcW w:type="dxa" w:w="3402"/>
-          </w:tcPr>
-          <w:p>
-            <w:r/>
-            <w:r>
-              <w:rPr>
-                <w:b w:val="0"/>
-                <w:sz w:val="20"/>
-              </w:rPr>
-              <w:t>Organograma atual e proposto, descrição de papéis e indicadores por função</w:t>
-            </w:r>
-          </w:p>
-        </w:tc>
-      </w:tr>
-      <w:tr>
-        <w:tc>
-          <w:tcPr>
-            <w:tcW w:type="dxa" w:w="3118"/>
-          </w:tcPr>
-          <w:p>
-            <w:r/>
-            <w:r>
-              <w:rPr>
-                <w:b w:val="0"/>
-                <w:sz w:val="20"/>
-              </w:rPr>
-              <w:t>Fluxos otimizados (atual e futuro)</w:t>
-            </w:r>
-          </w:p>
-        </w:tc>
-        <w:tc>
-          <w:tcPr>
-            <w:tcW w:type="dxa" w:w="2551"/>
-          </w:tcPr>
-          <w:p>
-            <w:r/>
-            <w:r>
-              <w:rPr>
-                <w:b w:val="0"/>
-                <w:sz w:val="20"/>
-              </w:rPr>
-              <w:t>Não</w:t>
-            </w:r>
-          </w:p>
-        </w:tc>
-        <w:tc>
-          <w:tcPr>
-            <w:tcW w:type="dxa" w:w="3402"/>
-          </w:tcPr>
-          <w:p>
-            <w:r/>
-            <w:r>
-              <w:rPr>
-                <w:b w:val="0"/>
-                <w:sz w:val="20"/>
-              </w:rPr>
-              <w:t>5 processos prioritários</w:t>
-            </w:r>
-          </w:p>
-        </w:tc>
-      </w:tr>
-      <w:tr>
-        <w:tc>
-          <w:tcPr>
-            <w:tcW w:type="dxa" w:w="3118"/>
-          </w:tcPr>
-          <w:p>
-            <w:r/>
-            <w:r>
-              <w:rPr>
-                <w:b w:val="0"/>
-                <w:sz w:val="20"/>
-              </w:rPr>
-              <w:t>Plano de automação</w:t>
-            </w:r>
-          </w:p>
-        </w:tc>
-        <w:tc>
-          <w:tcPr>
-            <w:tcW w:type="dxa" w:w="2551"/>
-          </w:tcPr>
-          <w:p>
-            <w:r/>
-            <w:r>
-              <w:rPr>
-                <w:b w:val="0"/>
-                <w:sz w:val="20"/>
-              </w:rPr>
-              <w:t>Lista priorizada, sem estimativa</w:t>
-            </w:r>
-          </w:p>
-        </w:tc>
-        <w:tc>
-          <w:tcPr>
-            <w:tcW w:type="dxa" w:w="3402"/>
-          </w:tcPr>
-          <w:p>
-            <w:r/>
-            <w:r>
-              <w:rPr>
-                <w:b w:val="0"/>
-                <w:sz w:val="20"/>
-              </w:rPr>
-              <w:t>Casos de uso priorizados por valor, risco, esforço e dependência, com módulos estimados e custo recorrente</w:t>
-            </w:r>
-          </w:p>
-        </w:tc>
-      </w:tr>
-      <w:tr>
-        <w:tc>
-          <w:tcPr>
-            <w:tcW w:type="dxa" w:w="3118"/>
-          </w:tcPr>
-          <w:p>
-            <w:r/>
-            <w:r>
-              <w:rPr>
-                <w:b w:val="0"/>
-                <w:sz w:val="20"/>
-              </w:rPr>
-              <w:t>Avaliação de desempenho por competência</w:t>
-            </w:r>
-          </w:p>
-        </w:tc>
-        <w:tc>
-          <w:tcPr>
-            <w:tcW w:type="dxa" w:w="2551"/>
-          </w:tcPr>
-          <w:p>
-            <w:r/>
-            <w:r>
-              <w:rPr>
-                <w:b w:val="0"/>
-                <w:sz w:val="20"/>
-              </w:rPr>
-              <w:t>Não (pode ser contratada à parte por R$ 3.200)</w:t>
-            </w:r>
-          </w:p>
-        </w:tc>
-        <w:tc>
-          <w:tcPr>
-            <w:tcW w:type="dxa" w:w="3402"/>
-          </w:tcPr>
-          <w:p>
-            <w:r/>
-            <w:r>
-              <w:rPr>
-                <w:b w:val="0"/>
-                <w:sz w:val="20"/>
-              </w:rPr>
-              <w:t>Sim, em janeiro de 2027: matriz de competências, formulário, ciclo semestral e ligação com a gratificação</w:t>
-            </w:r>
-          </w:p>
-        </w:tc>
-      </w:tr>
-      <w:tr>
-        <w:tc>
-          <w:tcPr>
-            <w:tcW w:type="dxa" w:w="3118"/>
-          </w:tcPr>
-          <w:p>
-            <w:r/>
-            <w:r>
-              <w:rPr>
-                <w:b w:val="0"/>
-                <w:sz w:val="20"/>
-              </w:rPr>
-              <w:t>Relatório e apresentação executiva</w:t>
-            </w:r>
-          </w:p>
-        </w:tc>
-        <w:tc>
-          <w:tcPr>
-            <w:tcW w:type="dxa" w:w="2551"/>
-          </w:tcPr>
-          <w:p>
-            <w:r/>
-            <w:r>
-              <w:rPr>
-                <w:b w:val="0"/>
-                <w:sz w:val="20"/>
-              </w:rPr>
-              <w:t>Sim</w:t>
-            </w:r>
-          </w:p>
-        </w:tc>
-        <w:tc>
-          <w:tcPr>
-            <w:tcW w:type="dxa" w:w="3402"/>
-          </w:tcPr>
-          <w:p>
-            <w:r/>
-            <w:r>
-              <w:rPr>
-                <w:b w:val="0"/>
-                <w:sz w:val="20"/>
-              </w:rPr>
-              <w:t>Sim</w:t>
-            </w:r>
-          </w:p>
-        </w:tc>
-      </w:tr>
-    </w:tbl>
-    <w:p/>
-    <w:p>
-      <w:pPr>
-        <w:pStyle w:val="Heading3"/>
-      </w:pPr>
-      <w:r>
-        <w:t>Contenção imediata (opção Completa)</w:t>
-      </w:r>
-    </w:p>
-    <w:p>
-      <w:r>
-        <w:rPr>
-          <w:i w:val="0"/>
-        </w:rPr>
-        <w:t>Três controles manuais, desenhados a partir dos erros reais citados no briefing, implantados com a equipe sem desenvolvimento e sem depender da Thamires no dia a dia:</w:t>
-      </w:r>
-    </w:p>
-    <w:p>
-      <w:pPr>
-        <w:pStyle w:val="ListBullet"/>
-      </w:pPr>
-      <w:r>
-        <w:rPr>
-          <w:b/>
-        </w:rPr>
-        <w:t xml:space="preserve">Conferência de guia antes do pagamento: </w:t>
-      </w:r>
-      <w:r>
-        <w:t>checagem de cliente, CNPJ, pasta, tributo, competência e valor, com padrão mínimo de nome de arquivo.</w:t>
-      </w:r>
-    </w:p>
-    <w:p>
-      <w:pPr>
-        <w:pStyle w:val="ListBullet"/>
-      </w:pPr>
-      <w:r>
-        <w:rPr>
-          <w:b/>
-        </w:rPr>
-        <w:t xml:space="preserve">Evidência para concluir tarefa: </w:t>
-      </w:r>
-      <w:r>
-        <w:t>nas rotinas críticas, o cartão do Trello só é concluído com o link do comprovante no OneDrive.</w:t>
-      </w:r>
-    </w:p>
-    <w:p>
-      <w:pPr>
-        <w:pStyle w:val="ListBullet"/>
-      </w:pPr>
-      <w:r>
-        <w:rPr>
-          <w:b/>
-        </w:rPr>
-        <w:t xml:space="preserve">Registro de escalonamentos: </w:t>
-      </w:r>
-      <w:r>
-        <w:t>toda dúvida levada à Thamires é registrada com motivo e solução, o que vira o indicador de dependência e a base do futuro especialista de dúvidas.</w:t>
-      </w:r>
-    </w:p>
-    <w:p>
-      <w:pPr>
-        <w:pStyle w:val="Heading1"/>
-      </w:pPr>
-      <w:r>
-        <w:t>5. Fase 2 · Implantação em módulos (orçada depois do plano)</w:t>
-      </w:r>
-    </w:p>
-    <w:p>
-      <w:r>
-        <w:rPr>
-          <w:i w:val="0"/>
-        </w:rPr>
-        <w:t>Módulos citados no briefing, apresentados como ordem de grandeza para planejamento. O escopo, as horas e o preço de cada módulo só são fechados depois da Fase 1, com prova de viabilidade dos conectores envolvidos. Nenhum deles está contratado nesta proposta.</w:t>
-      </w:r>
-    </w:p>
-    <w:tbl>
-      <w:tblPr>
-        <w:tblStyle w:val="TableGrid"/>
-        <w:tblW w:type="auto" w:w="0"/>
-        <w:jc w:val="center"/>
-        <w:tblLook w:firstColumn="1" w:firstRow="1" w:lastColumn="0" w:lastRow="0" w:noHBand="0" w:noVBand="1" w:val="04A0"/>
-      </w:tblPr>
-      <w:tblGrid>
-        <w:gridCol w:w="2436"/>
-        <w:gridCol w:w="2436"/>
-        <w:gridCol w:w="2436"/>
-        <w:gridCol w:w="2436"/>
-      </w:tblGrid>
-      <w:tr>
-        <w:tc>
-          <w:tcPr>
-            <w:tcW w:type="dxa" w:w="2154"/>
-            <w:shd w:val="clear" w:color="auto" w:fill="1F3A5F"/>
-          </w:tcPr>
-          <w:p>
-            <w:r/>
-            <w:r>
-              <w:rPr>
-                <w:b/>
-                <w:color w:val="FFFFFF"/>
-                <w:sz w:val="20"/>
-              </w:rPr>
-              <w:t>Módulo</w:t>
-            </w:r>
-          </w:p>
-        </w:tc>
-        <w:tc>
-          <w:tcPr>
-            <w:tcW w:type="dxa" w:w="3515"/>
+            <w:tcW w:type="dxa" w:w="3175"/>
             <w:shd w:val="clear" w:color="auto" w:fill="1F3A5F"/>
           </w:tcPr>
           <w:p>
@@ -1057,7 +237,7 @@
         </w:tc>
         <w:tc>
           <w:tcPr>
-            <w:tcW w:type="dxa" w:w="1134"/>
+            <w:tcW w:type="dxa" w:w="2381"/>
             <w:shd w:val="clear" w:color="auto" w:fill="1F3A5F"/>
           </w:tcPr>
           <w:p>
@@ -1068,24 +248,7 @@
                 <w:color w:val="FFFFFF"/>
                 <w:sz w:val="20"/>
               </w:rPr>
-              <w:t>Porte provável</w:t>
-            </w:r>
-          </w:p>
-        </w:tc>
-        <w:tc>
-          <w:tcPr>
-            <w:tcW w:type="dxa" w:w="2268"/>
-            <w:shd w:val="clear" w:color="auto" w:fill="1F3A5F"/>
-          </w:tcPr>
-          <w:p>
-            <w:r/>
-            <w:r>
-              <w:rPr>
-                <w:b/>
-                <w:color w:val="FFFFFF"/>
-                <w:sz w:val="20"/>
-              </w:rPr>
-              <w:t>Dependências</w:t>
+              <w:t>Aceite</w:t>
             </w:r>
           </w:p>
         </w:tc>
@@ -1093,7 +256,7 @@
       <w:tr>
         <w:tc>
           <w:tcPr>
-            <w:tcW w:type="dxa" w:w="2154"/>
+            <w:tcW w:type="dxa" w:w="1814"/>
           </w:tcPr>
           <w:p>
             <w:r/>
@@ -1102,13 +265,13 @@
                 <w:b w:val="0"/>
                 <w:sz w:val="20"/>
               </w:rPr>
-              <w:t>Ambiente Surcin e Base Mestre de Clientes</w:t>
+              <w:t>1 · Diagnóstico e inventário</w:t>
             </w:r>
           </w:p>
         </w:tc>
         <w:tc>
           <w:tcPr>
-            <w:tcW w:type="dxa" w:w="3515"/>
+            <w:tcW w:type="dxa" w:w="1247"/>
           </w:tcPr>
           <w:p>
             <w:r/>
@@ -1117,13 +280,13 @@
                 <w:b w:val="0"/>
                 <w:sz w:val="20"/>
               </w:rPr>
-              <w:t>Conta Claude da Surcin, permissões, Projects Diretoria, Financeiro e Fiscal, base mínima de clientes no OneDrive</w:t>
+              <w:t>03 a 13/11</w:t>
             </w:r>
           </w:p>
         </w:tc>
         <w:tc>
           <w:tcPr>
-            <w:tcW w:type="dxa" w:w="1134"/>
+            <w:tcW w:type="dxa" w:w="794"/>
           </w:tcPr>
           <w:p>
             <w:r/>
@@ -1132,13 +295,13 @@
                 <w:b w:val="0"/>
                 <w:sz w:val="20"/>
               </w:rPr>
-              <w:t>M</w:t>
+              <w:t>28 h</w:t>
             </w:r>
           </w:p>
         </w:tc>
         <w:tc>
           <w:tcPr>
-            <w:tcW w:type="dxa" w:w="2268"/>
+            <w:tcW w:type="dxa" w:w="3175"/>
           </w:tcPr>
           <w:p>
             <w:r/>
@@ -1147,15 +310,13 @@
                 <w:b w:val="0"/>
                 <w:sz w:val="20"/>
               </w:rPr>
-              <w:t>Contas novas no domínio Surcin</w:t>
+              <w:t>Reunião de abertura e análise de materiais; até 5 entrevistas; mapeamento de até 8 processos atuais; inventário de sistemas e riscos</w:t>
             </w:r>
           </w:p>
         </w:tc>
-      </w:tr>
-      <w:tr>
         <w:tc>
           <w:tcPr>
-            <w:tcW w:type="dxa" w:w="2154"/>
+            <w:tcW w:type="dxa" w:w="2381"/>
           </w:tcPr>
           <w:p>
             <w:r/>
@@ -1164,13 +325,15 @@
                 <w:b w:val="0"/>
                 <w:sz w:val="20"/>
               </w:rPr>
-              <w:t>Especialista de dúvidas (por setor)</w:t>
+              <w:t>Diagnóstico, mapa atual, prioridades e plano inicial validados</w:t>
             </w:r>
           </w:p>
         </w:tc>
+      </w:tr>
+      <w:tr>
         <w:tc>
           <w:tcPr>
-            <w:tcW w:type="dxa" w:w="3515"/>
+            <w:tcW w:type="dxa" w:w="1814"/>
           </w:tcPr>
           <w:p>
             <w:r/>
@@ -1179,13 +342,13 @@
                 <w:b w:val="0"/>
                 <w:sz w:val="20"/>
               </w:rPr>
-              <w:t>Assistente que responde com os procedimentos oficiais e escala só exceções</w:t>
+              <w:t>2 · Arquitetura operacional</w:t>
             </w:r>
           </w:p>
         </w:tc>
         <w:tc>
           <w:tcPr>
-            <w:tcW w:type="dxa" w:w="1134"/>
+            <w:tcW w:type="dxa" w:w="1247"/>
           </w:tcPr>
           <w:p>
             <w:r/>
@@ -1194,13 +357,13 @@
                 <w:b w:val="0"/>
                 <w:sz w:val="20"/>
               </w:rPr>
-              <w:t>M</w:t>
+              <w:t>16 a 29/11</w:t>
             </w:r>
           </w:p>
         </w:tc>
         <w:tc>
           <w:tcPr>
-            <w:tcW w:type="dxa" w:w="2268"/>
+            <w:tcW w:type="dxa" w:w="794"/>
           </w:tcPr>
           <w:p>
             <w:r/>
@@ -1209,15 +372,13 @@
                 <w:b w:val="0"/>
                 <w:sz w:val="20"/>
               </w:rPr>
-              <w:t>Procedimentos atualizados na Fase 1</w:t>
+              <w:t>42 h</w:t>
             </w:r>
           </w:p>
         </w:tc>
-      </w:tr>
-      <w:tr>
         <w:tc>
           <w:tcPr>
-            <w:tcW w:type="dxa" w:w="2154"/>
+            <w:tcW w:type="dxa" w:w="3175"/>
           </w:tcPr>
           <w:p>
             <w:r/>
@@ -1226,13 +387,13 @@
                 <w:b w:val="0"/>
                 <w:sz w:val="20"/>
               </w:rPr>
-              <w:t>Validador de guias e documentos</w:t>
+              <w:t>Organograma funcional, matriz de responsabilidades e alçadas; jornada de entrada do cliente e passagem formal; redesenho de até 5 fluxos; controles prioritários; indicadores por área e competências por papel</w:t>
             </w:r>
           </w:p>
         </w:tc>
         <w:tc>
           <w:tcPr>
-            <w:tcW w:type="dxa" w:w="3515"/>
+            <w:tcW w:type="dxa" w:w="2381"/>
           </w:tcPr>
           <w:p>
             <w:r/>
@@ -1241,13 +402,15 @@
                 <w:b w:val="0"/>
                 <w:sz w:val="20"/>
               </w:rPr>
-              <w:t>Alerta quando cliente, CNPJ, competência, tributo ou valor divergem; pagamento sempre humano</w:t>
+              <w:t>Fluxos futuros, responsabilidades e listas de verificação aprovados</w:t>
             </w:r>
           </w:p>
         </w:tc>
+      </w:tr>
+      <w:tr>
         <w:tc>
           <w:tcPr>
-            <w:tcW w:type="dxa" w:w="1134"/>
+            <w:tcW w:type="dxa" w:w="1814"/>
           </w:tcPr>
           <w:p>
             <w:r/>
@@ -1256,13 +419,13 @@
                 <w:b w:val="0"/>
                 <w:sz w:val="20"/>
               </w:rPr>
-              <w:t>M a G</w:t>
+              <w:t>3 · Fundação do Claude e rotinas</w:t>
             </w:r>
           </w:p>
         </w:tc>
         <w:tc>
           <w:tcPr>
-            <w:tcW w:type="dxa" w:w="2268"/>
+            <w:tcW w:type="dxa" w:w="1247"/>
           </w:tcPr>
           <w:p>
             <w:r/>
@@ -1271,15 +434,13 @@
                 <w:b w:val="0"/>
                 <w:sz w:val="20"/>
               </w:rPr>
-              <w:t>Padrão de pastas; amostras reais anonimizadas</w:t>
+              <w:t>23/11 a 13/12</w:t>
             </w:r>
           </w:p>
         </w:tc>
-      </w:tr>
-      <w:tr>
         <w:tc>
           <w:tcPr>
-            <w:tcW w:type="dxa" w:w="2154"/>
+            <w:tcW w:type="dxa" w:w="794"/>
           </w:tcPr>
           <w:p>
             <w:r/>
@@ -1288,13 +449,13 @@
                 <w:b w:val="0"/>
                 <w:sz w:val="20"/>
               </w:rPr>
-              <w:t>Fechamento financeiro interativo (piloto)</w:t>
+              <w:t>52 h</w:t>
             </w:r>
           </w:p>
         </w:tc>
         <w:tc>
           <w:tcPr>
-            <w:tcW w:type="dxa" w:w="3515"/>
+            <w:tcW w:type="dxa" w:w="3175"/>
           </w:tcPr>
           <w:p>
             <w:r/>
@@ -1303,13 +464,13 @@
                 <w:b w:val="0"/>
                 <w:sz w:val="20"/>
               </w:rPr>
-              <w:t>Painel para um ou dois clientes, com dados mensais estruturados e narrativa preparada pelo Claude</w:t>
+              <w:t>Organização da base e das fontes oficiais; Projetos do Claude; construção, testes e documentação das 5 rotinas do Claude</w:t>
             </w:r>
           </w:p>
         </w:tc>
         <w:tc>
           <w:tcPr>
-            <w:tcW w:type="dxa" w:w="1134"/>
+            <w:tcW w:type="dxa" w:w="2381"/>
           </w:tcPr>
           <w:p>
             <w:r/>
@@ -1318,13 +479,15 @@
                 <w:b w:val="0"/>
                 <w:sz w:val="20"/>
               </w:rPr>
-              <w:t>M a G</w:t>
+              <w:t>Biblioteca de 5 rotinas do Claude validada para uso assistido</w:t>
             </w:r>
           </w:p>
         </w:tc>
+      </w:tr>
+      <w:tr>
         <w:tc>
           <w:tcPr>
-            <w:tcW w:type="dxa" w:w="2268"/>
+            <w:tcW w:type="dxa" w:w="1814"/>
           </w:tcPr>
           <w:p>
             <w:r/>
@@ -1333,15 +496,13 @@
                 <w:b w:val="0"/>
                 <w:sz w:val="20"/>
               </w:rPr>
-              <w:t>Conta Azul; Lovable com dados segregados por cliente</w:t>
+              <w:t>4 · Pilotos e painel</w:t>
             </w:r>
           </w:p>
         </w:tc>
-      </w:tr>
-      <w:tr>
         <w:tc>
           <w:tcPr>
-            <w:tcW w:type="dxa" w:w="2154"/>
+            <w:tcW w:type="dxa" w:w="1247"/>
           </w:tcPr>
           <w:p>
             <w:r/>
@@ -1350,13 +511,13 @@
                 <w:b w:val="0"/>
                 <w:sz w:val="20"/>
               </w:rPr>
-              <w:t>Auditoria Trello × OneDrive</w:t>
+              <w:t>07 a 20/12</w:t>
             </w:r>
           </w:p>
         </w:tc>
         <w:tc>
           <w:tcPr>
-            <w:tcW w:type="dxa" w:w="3515"/>
+            <w:tcW w:type="dxa" w:w="794"/>
           </w:tcPr>
           <w:p>
             <w:r/>
@@ -1365,13 +526,13 @@
                 <w:b w:val="0"/>
                 <w:sz w:val="20"/>
               </w:rPr>
-              <w:t>Fila de exceções para uma rotina (ex.: DP), sem concluir sozinha que algo não foi feito</w:t>
+              <w:t>63 h</w:t>
             </w:r>
           </w:p>
         </w:tc>
         <w:tc>
           <w:tcPr>
-            <w:tcW w:type="dxa" w:w="1134"/>
+            <w:tcW w:type="dxa" w:w="3175"/>
           </w:tcPr>
           <w:p>
             <w:r/>
@@ -1380,13 +541,13 @@
                 <w:b w:val="0"/>
                 <w:sz w:val="20"/>
               </w:rPr>
-              <w:t>M</w:t>
+              <w:t>Implantação controlada dos pilotos A e B com dados autorizados; até 2 integrações implantadas; primeira versão do painel por área (planilha ou Trello)</w:t>
             </w:r>
           </w:p>
         </w:tc>
         <w:tc>
           <w:tcPr>
-            <w:tcW w:type="dxa" w:w="2268"/>
+            <w:tcW w:type="dxa" w:w="2381"/>
           </w:tcPr>
           <w:p>
             <w:r/>
@@ -1395,7 +556,7 @@
                 <w:b w:val="0"/>
                 <w:sz w:val="20"/>
               </w:rPr>
-              <w:t>Controle de evidência da Fase 1</w:t>
+              <w:t>Demonstração funcional, resultados dos testes, aceite dos 2 pilotos e painel em uso</w:t>
             </w:r>
           </w:p>
         </w:tc>
@@ -1403,7 +564,7 @@
       <w:tr>
         <w:tc>
           <w:tcPr>
-            <w:tcW w:type="dxa" w:w="2154"/>
+            <w:tcW w:type="dxa" w:w="1814"/>
           </w:tcPr>
           <w:p>
             <w:r/>
@@ -1412,13 +573,13 @@
                 <w:b w:val="0"/>
                 <w:sz w:val="20"/>
               </w:rPr>
-              <w:t>Fila de pedidos de pagamento</w:t>
+              <w:t>5 · Adoção e transferência</w:t>
             </w:r>
           </w:p>
         </w:tc>
         <w:tc>
           <w:tcPr>
-            <w:tcW w:type="dxa" w:w="3515"/>
+            <w:tcW w:type="dxa" w:w="1247"/>
           </w:tcPr>
           <w:p>
             <w:r/>
@@ -1427,13 +588,13 @@
                 <w:b w:val="0"/>
                 <w:sz w:val="20"/>
               </w:rPr>
-              <w:t>Captura padronizada dos pedidos que chegam por WhatsApp; alternativa por formulário se os grupos não forem acessíveis</w:t>
+              <w:t>14 a 23/12</w:t>
             </w:r>
           </w:p>
         </w:tc>
         <w:tc>
           <w:tcPr>
-            <w:tcW w:type="dxa" w:w="1134"/>
+            <w:tcW w:type="dxa" w:w="794"/>
           </w:tcPr>
           <w:p>
             <w:r/>
@@ -1442,13 +603,13 @@
                 <w:b w:val="0"/>
                 <w:sz w:val="20"/>
               </w:rPr>
-              <w:t>M a G</w:t>
+              <w:t>36 h</w:t>
             </w:r>
           </w:p>
         </w:tc>
         <w:tc>
           <w:tcPr>
-            <w:tcW w:type="dxa" w:w="2268"/>
+            <w:tcW w:type="dxa" w:w="3175"/>
           </w:tcPr>
           <w:p>
             <w:r/>
@@ -1457,15 +618,13 @@
                 <w:b w:val="0"/>
                 <w:sz w:val="20"/>
               </w:rPr>
-              <w:t>Viabilidade técnica e termos do Nestzap/Meta</w:t>
+              <w:t>Ajustes acordados; 3 treinamentos de até 90 minutos; manuais; painel por área e da diretoria; primeiro ciclo de avaliação por competência; plano de evolução</w:t>
             </w:r>
           </w:p>
         </w:tc>
-      </w:tr>
-      <w:tr>
         <w:tc>
           <w:tcPr>
-            <w:tcW w:type="dxa" w:w="2154"/>
+            <w:tcW w:type="dxa" w:w="2381"/>
           </w:tcPr>
           <w:p>
             <w:r/>
@@ -1474,52 +633,7 @@
                 <w:b w:val="0"/>
                 <w:sz w:val="20"/>
               </w:rPr>
-              <w:t>Painel de desempenho</w:t>
-            </w:r>
-          </w:p>
-        </w:tc>
-        <w:tc>
-          <w:tcPr>
-            <w:tcW w:type="dxa" w:w="3515"/>
-          </w:tcPr>
-          <w:p>
-            <w:r/>
-            <w:r>
-              <w:rPr>
-                <w:b w:val="0"/>
-                <w:sz w:val="20"/>
-              </w:rPr>
-              <w:t>Dados para o programa de premiação, com critérios ajustáveis</w:t>
-            </w:r>
-          </w:p>
-        </w:tc>
-        <w:tc>
-          <w:tcPr>
-            <w:tcW w:type="dxa" w:w="1134"/>
-          </w:tcPr>
-          <w:p>
-            <w:r/>
-            <w:r>
-              <w:rPr>
-                <w:b w:val="0"/>
-                <w:sz w:val="20"/>
-              </w:rPr>
-              <w:t>M</w:t>
-            </w:r>
-          </w:p>
-        </w:tc>
-        <w:tc>
-          <w:tcPr>
-            <w:tcW w:type="dxa" w:w="2268"/>
-          </w:tcPr>
-          <w:p>
-            <w:r/>
-            <w:r>
-              <w:rPr>
-                <w:b w:val="0"/>
-                <w:sz w:val="20"/>
-              </w:rPr>
-              <w:t>Revisão trabalhista dos critérios</w:t>
+              <w:t>Arquivos editáveis, treinamento, avaliação aplicada, relatório final e passagem formal aprovados</w:t>
             </w:r>
           </w:p>
         </w:tc>
@@ -1527,780 +641,7 @@
       <w:tr>
         <w:tc>
           <w:tcPr>
-            <w:tcW w:type="dxa" w:w="2154"/>
-          </w:tcPr>
-          <w:p>
-            <w:r/>
-            <w:r>
-              <w:rPr>
-                <w:b w:val="0"/>
-                <w:sz w:val="20"/>
-              </w:rPr>
-              <w:t>Comercial e CRM</w:t>
-            </w:r>
-          </w:p>
-        </w:tc>
-        <w:tc>
-          <w:tcPr>
-            <w:tcW w:type="dxa" w:w="3515"/>
-          </w:tcPr>
-          <w:p>
-            <w:r/>
-            <w:r>
-              <w:rPr>
-                <w:b w:val="0"/>
-                <w:sz w:val="20"/>
-              </w:rPr>
-              <w:t>Leads, propostas, onboarding</w:t>
-            </w:r>
-          </w:p>
-        </w:tc>
-        <w:tc>
-          <w:tcPr>
-            <w:tcW w:type="dxa" w:w="1134"/>
-          </w:tcPr>
-          <w:p>
-            <w:r/>
-            <w:r>
-              <w:rPr>
-                <w:b w:val="0"/>
-                <w:sz w:val="20"/>
-              </w:rPr>
-              <w:t>G</w:t>
-            </w:r>
-          </w:p>
-        </w:tc>
-        <w:tc>
-          <w:tcPr>
-            <w:tcW w:type="dxa" w:w="2268"/>
-          </w:tcPr>
-          <w:p>
-            <w:r/>
-            <w:r>
-              <w:rPr>
-                <w:b w:val="0"/>
-                <w:sz w:val="20"/>
-              </w:rPr>
-              <w:t>Janeiro de 2027</w:t>
-            </w:r>
-          </w:p>
-        </w:tc>
-      </w:tr>
-    </w:tbl>
-    <w:p/>
-    <w:p>
-      <w:r>
-        <w:rPr>
-          <w:i w:val="0"/>
-        </w:rPr>
-        <w:t>Porte de referência: P de R$ 1.500 a R$ 2.800; M de R$ 3.500 a R$ 6.500; G de R$ 8.000 a R$ 13.000. Cada módulo inclui desenho, construção, testes com dados anonimizados, documentação e treinamento.</w:t>
-      </w:r>
-    </w:p>
-    <w:p>
-      <w:pPr>
-        <w:pStyle w:val="Heading1"/>
-      </w:pPr>
-      <w:r>
-        <w:t>6. Princípios de implantação</w:t>
-      </w:r>
-    </w:p>
-    <w:p>
-      <w:pPr>
-        <w:pStyle w:val="ListBullet"/>
-      </w:pPr>
-      <w:r>
-        <w:rPr>
-          <w:b/>
-        </w:rPr>
-        <w:t xml:space="preserve">Processo antes de ferramenta. </w:t>
-      </w:r>
-      <w:r>
-        <w:t>Nada é automatizado antes de o fluxo estar validado; parâmetros fiscais são conferidos antes de qualquer automação.</w:t>
-      </w:r>
-    </w:p>
-    <w:p>
-      <w:pPr>
-        <w:pStyle w:val="ListBullet"/>
-      </w:pPr>
-      <w:r>
-        <w:rPr>
-          <w:b/>
-        </w:rPr>
-        <w:t xml:space="preserve">Matriz de autonomia. </w:t>
-      </w:r>
-      <w:r>
-        <w:t>Verde (pesquisar, resumir, conferir) pode ser automático; amarelo (criar tarefa, preparar mensagem, registrar conta a pagar) exige confirmação humana e registro; vermelho (pagar, protocolar, excluir, decidir) é sempre humano.</w:t>
-      </w:r>
-    </w:p>
-    <w:p>
-      <w:pPr>
-        <w:pStyle w:val="ListBullet"/>
-      </w:pPr>
-      <w:r>
-        <w:rPr>
-          <w:b/>
-        </w:rPr>
-        <w:t xml:space="preserve">Ativos da Surcin. </w:t>
-      </w:r>
-      <w:r>
-        <w:t>Contas, licenças, prompts, especialistas, bases e código ficam em nome da Surcin, documentados, com acesso administrativo entregue.</w:t>
-      </w:r>
-    </w:p>
-    <w:p>
-      <w:pPr>
-        <w:pStyle w:val="ListBullet"/>
-      </w:pPr>
-      <w:r>
-        <w:rPr>
-          <w:b/>
-        </w:rPr>
-        <w:t xml:space="preserve">Segurança e LGPD. </w:t>
-      </w:r>
-      <w:r>
-        <w:t>Segregação por cliente e função, acesso mínimo, registro de ações, dados reais só após homologação com dados anonimizados.</w:t>
-      </w:r>
-    </w:p>
-    <w:p>
-      <w:pPr>
-        <w:pStyle w:val="ListBullet"/>
-      </w:pPr>
-      <w:r>
-        <w:rPr>
-          <w:b/>
-        </w:rPr>
-        <w:t xml:space="preserve">Continuidade. </w:t>
-      </w:r>
-      <w:r>
-        <w:t>Cada módulo tem procedimento manual de contingência e pode ser operado sem o consultor.</w:t>
-      </w:r>
-    </w:p>
-    <w:p>
-      <w:pPr>
-        <w:pStyle w:val="Heading1"/>
-      </w:pPr>
-      <w:r>
-        <w:t>7. Fora do escopo da Fase 1</w:t>
-      </w:r>
-    </w:p>
-    <w:p>
-      <w:pPr>
-        <w:pStyle w:val="ListBullet"/>
-      </w:pPr>
-      <w:r>
-        <w:t>Desenvolvimento, configuração ou integração de automações e sistemas (Fase 2).</w:t>
-      </w:r>
-    </w:p>
-    <w:p>
-      <w:pPr>
-        <w:pStyle w:val="ListBullet"/>
-      </w:pPr>
-      <w:r>
-        <w:t>Correção da parametrização do Domínio ou do CITAX (exige suporte do sistema ou especialista).</w:t>
-      </w:r>
-    </w:p>
-    <w:p>
-      <w:pPr>
-        <w:pStyle w:val="ListBullet"/>
-      </w:pPr>
-      <w:r>
-        <w:t>Migração de contas para o domínio novo da Surcin.</w:t>
-      </w:r>
-    </w:p>
-    <w:p>
-      <w:pPr>
-        <w:pStyle w:val="ListBullet"/>
-      </w:pPr>
-      <w:r>
-        <w:t>Definição de valores, periodicidade e natureza jurídica da premiação (exige revisão trabalhista).</w:t>
-      </w:r>
-    </w:p>
-    <w:p>
-      <w:pPr>
-        <w:pStyle w:val="ListBullet"/>
-      </w:pPr>
-      <w:r>
-        <w:t>Recrutamento e seleção.</w:t>
-      </w:r>
-    </w:p>
-    <w:p>
-      <w:pPr>
-        <w:pStyle w:val="ListBullet"/>
-      </w:pPr>
-      <w:r>
-        <w:t>Suporte contínuo, plantão ou urgência.</w:t>
-      </w:r>
-    </w:p>
-    <w:p>
-      <w:pPr>
-        <w:pStyle w:val="ListBullet"/>
-      </w:pPr>
-      <w:r>
-        <w:t>Licenças e assinaturas.</w:t>
-      </w:r>
-    </w:p>
-    <w:p>
-      <w:pPr>
-        <w:pStyle w:val="ListBullet"/>
-      </w:pPr>
-      <w:r>
-        <w:t>Serviços contábeis, fiscais, trabalhistas ou jurídicos.</w:t>
-      </w:r>
-    </w:p>
-    <w:p>
-      <w:pPr>
-        <w:pStyle w:val="Heading1"/>
-      </w:pPr>
-      <w:r>
-        <w:t>8. Esforço estimado (Fase 1)</w:t>
-      </w:r>
-    </w:p>
-    <w:p>
-      <w:r>
-        <w:rPr>
-          <w:i w:val="0"/>
-        </w:rPr>
-        <w:t>Premissas: 2 h por entrevista (1 h de conversa e 1 h de preparação e registro), 2 h por processo mapeado, 2 h por processo redesenhado e 20% de contingência. Na Completa, a contenção imediata é absorvida pelo mapeamento do fiscal e do financeiro e pela contingência.</w:t>
-      </w:r>
-    </w:p>
-    <w:tbl>
-      <w:tblPr>
-        <w:tblStyle w:val="TableGrid"/>
-        <w:tblW w:type="auto" w:w="0"/>
-        <w:jc w:val="center"/>
-        <w:tblLook w:firstColumn="1" w:firstRow="1" w:lastColumn="0" w:lastRow="0" w:noHBand="0" w:noVBand="1" w:val="04A0"/>
-      </w:tblPr>
-      <w:tblGrid>
-        <w:gridCol w:w="3249"/>
-        <w:gridCol w:w="3249"/>
-        <w:gridCol w:w="3249"/>
-      </w:tblGrid>
-      <w:tr>
-        <w:tc>
-          <w:tcPr>
-            <w:tcW w:type="dxa" w:w="5102"/>
-            <w:shd w:val="clear" w:color="auto" w:fill="1F3A5F"/>
-          </w:tcPr>
-          <w:p>
-            <w:r/>
-            <w:r>
-              <w:rPr>
-                <w:b/>
-                <w:color w:val="FFFFFF"/>
-                <w:sz w:val="20"/>
-              </w:rPr>
-              <w:t>Atividade</w:t>
-            </w:r>
-          </w:p>
-        </w:tc>
-        <w:tc>
-          <w:tcPr>
-            <w:tcW w:type="dxa" w:w="1984"/>
-            <w:shd w:val="clear" w:color="auto" w:fill="1F3A5F"/>
-          </w:tcPr>
-          <w:p>
-            <w:r/>
-            <w:r>
-              <w:rPr>
-                <w:b/>
-                <w:color w:val="FFFFFF"/>
-                <w:sz w:val="20"/>
-              </w:rPr>
-              <w:t>Essencial</w:t>
-            </w:r>
-          </w:p>
-        </w:tc>
-        <w:tc>
-          <w:tcPr>
-            <w:tcW w:type="dxa" w:w="1984"/>
-            <w:shd w:val="clear" w:color="auto" w:fill="1F3A5F"/>
-          </w:tcPr>
-          <w:p>
-            <w:r/>
-            <w:r>
-              <w:rPr>
-                <w:b/>
-                <w:color w:val="FFFFFF"/>
-                <w:sz w:val="20"/>
-              </w:rPr>
-              <w:t>Completa</w:t>
-            </w:r>
-          </w:p>
-        </w:tc>
-      </w:tr>
-      <w:tr>
-        <w:tc>
-          <w:tcPr>
-            <w:tcW w:type="dxa" w:w="5102"/>
-          </w:tcPr>
-          <w:p>
-            <w:r/>
-            <w:r>
-              <w:rPr>
-                <w:b w:val="0"/>
-                <w:sz w:val="20"/>
-              </w:rPr>
-              <w:t>Entrevistas com a equipe</w:t>
-            </w:r>
-          </w:p>
-        </w:tc>
-        <w:tc>
-          <w:tcPr>
-            <w:tcW w:type="dxa" w:w="1984"/>
-          </w:tcPr>
-          <w:p>
-            <w:r/>
-            <w:r>
-              <w:rPr>
-                <w:b w:val="0"/>
-                <w:sz w:val="20"/>
-              </w:rPr>
-              <w:t>8</w:t>
-            </w:r>
-          </w:p>
-        </w:tc>
-        <w:tc>
-          <w:tcPr>
-            <w:tcW w:type="dxa" w:w="1984"/>
-          </w:tcPr>
-          <w:p>
-            <w:r/>
-            <w:r>
-              <w:rPr>
-                <w:b w:val="0"/>
-                <w:sz w:val="20"/>
-              </w:rPr>
-              <w:t>10</w:t>
-            </w:r>
-          </w:p>
-        </w:tc>
-      </w:tr>
-      <w:tr>
-        <w:tc>
-          <w:tcPr>
-            <w:tcW w:type="dxa" w:w="5102"/>
-          </w:tcPr>
-          <w:p>
-            <w:r/>
-            <w:r>
-              <w:rPr>
-                <w:b w:val="0"/>
-                <w:sz w:val="20"/>
-              </w:rPr>
-              <w:t>Mapeamento dos processos atuais</w:t>
-            </w:r>
-          </w:p>
-        </w:tc>
-        <w:tc>
-          <w:tcPr>
-            <w:tcW w:type="dxa" w:w="1984"/>
-          </w:tcPr>
-          <w:p>
-            <w:r/>
-            <w:r>
-              <w:rPr>
-                <w:b w:val="0"/>
-                <w:sz w:val="20"/>
-              </w:rPr>
-              <w:t>10</w:t>
-            </w:r>
-          </w:p>
-        </w:tc>
-        <w:tc>
-          <w:tcPr>
-            <w:tcW w:type="dxa" w:w="1984"/>
-          </w:tcPr>
-          <w:p>
-            <w:r/>
-            <w:r>
-              <w:rPr>
-                <w:b w:val="0"/>
-                <w:sz w:val="20"/>
-              </w:rPr>
-              <w:t>16</w:t>
-            </w:r>
-          </w:p>
-        </w:tc>
-      </w:tr>
-      <w:tr>
-        <w:tc>
-          <w:tcPr>
-            <w:tcW w:type="dxa" w:w="5102"/>
-          </w:tcPr>
-          <w:p>
-            <w:r/>
-            <w:r>
-              <w:rPr>
-                <w:b w:val="0"/>
-                <w:sz w:val="20"/>
-              </w:rPr>
-              <w:t>Gargalos e dependências</w:t>
-            </w:r>
-          </w:p>
-        </w:tc>
-        <w:tc>
-          <w:tcPr>
-            <w:tcW w:type="dxa" w:w="1984"/>
-          </w:tcPr>
-          <w:p>
-            <w:r/>
-            <w:r>
-              <w:rPr>
-                <w:b w:val="0"/>
-                <w:sz w:val="20"/>
-              </w:rPr>
-              <w:t>3</w:t>
-            </w:r>
-          </w:p>
-        </w:tc>
-        <w:tc>
-          <w:tcPr>
-            <w:tcW w:type="dxa" w:w="1984"/>
-          </w:tcPr>
-          <w:p>
-            <w:r/>
-            <w:r>
-              <w:rPr>
-                <w:b w:val="0"/>
-                <w:sz w:val="20"/>
-              </w:rPr>
-              <w:t>4</w:t>
-            </w:r>
-          </w:p>
-        </w:tc>
-      </w:tr>
-      <w:tr>
-        <w:tc>
-          <w:tcPr>
-            <w:tcW w:type="dxa" w:w="5102"/>
-          </w:tcPr>
-          <w:p>
-            <w:r/>
-            <w:r>
-              <w:rPr>
-                <w:b w:val="0"/>
-                <w:sz w:val="20"/>
-              </w:rPr>
-              <w:t>Validação com a Thamires</w:t>
-            </w:r>
-          </w:p>
-        </w:tc>
-        <w:tc>
-          <w:tcPr>
-            <w:tcW w:type="dxa" w:w="1984"/>
-          </w:tcPr>
-          <w:p>
-            <w:r/>
-            <w:r>
-              <w:rPr>
-                <w:b w:val="0"/>
-                <w:sz w:val="20"/>
-              </w:rPr>
-              <w:t>2</w:t>
-            </w:r>
-          </w:p>
-        </w:tc>
-        <w:tc>
-          <w:tcPr>
-            <w:tcW w:type="dxa" w:w="1984"/>
-          </w:tcPr>
-          <w:p>
-            <w:r/>
-            <w:r>
-              <w:rPr>
-                <w:b w:val="0"/>
-                <w:sz w:val="20"/>
-              </w:rPr>
-              <w:t>2,5</w:t>
-            </w:r>
-          </w:p>
-        </w:tc>
-      </w:tr>
-      <w:tr>
-        <w:tc>
-          <w:tcPr>
-            <w:tcW w:type="dxa" w:w="5102"/>
-          </w:tcPr>
-          <w:p>
-            <w:r/>
-            <w:r>
-              <w:rPr>
-                <w:b w:val="0"/>
-                <w:sz w:val="20"/>
-              </w:rPr>
-              <w:t>Estrutura organizacional</w:t>
-            </w:r>
-          </w:p>
-        </w:tc>
-        <w:tc>
-          <w:tcPr>
-            <w:tcW w:type="dxa" w:w="1984"/>
-          </w:tcPr>
-          <w:p>
-            <w:r/>
-            <w:r>
-              <w:rPr>
-                <w:b w:val="0"/>
-                <w:sz w:val="20"/>
-              </w:rPr>
-              <w:t>6</w:t>
-            </w:r>
-          </w:p>
-        </w:tc>
-        <w:tc>
-          <w:tcPr>
-            <w:tcW w:type="dxa" w:w="1984"/>
-          </w:tcPr>
-          <w:p>
-            <w:r/>
-            <w:r>
-              <w:rPr>
-                <w:b w:val="0"/>
-                <w:sz w:val="20"/>
-              </w:rPr>
-              <w:t>14</w:t>
-            </w:r>
-          </w:p>
-        </w:tc>
-      </w:tr>
-      <w:tr>
-        <w:tc>
-          <w:tcPr>
-            <w:tcW w:type="dxa" w:w="5102"/>
-          </w:tcPr>
-          <w:p>
-            <w:r/>
-            <w:r>
-              <w:rPr>
-                <w:b w:val="0"/>
-                <w:sz w:val="20"/>
-              </w:rPr>
-              <w:t>Fluxos otimizados</w:t>
-            </w:r>
-          </w:p>
-        </w:tc>
-        <w:tc>
-          <w:tcPr>
-            <w:tcW w:type="dxa" w:w="1984"/>
-          </w:tcPr>
-          <w:p>
-            <w:r/>
-            <w:r>
-              <w:rPr>
-                <w:b w:val="0"/>
-                <w:sz w:val="20"/>
-              </w:rPr>
-              <w:t>-</w:t>
-            </w:r>
-          </w:p>
-        </w:tc>
-        <w:tc>
-          <w:tcPr>
-            <w:tcW w:type="dxa" w:w="1984"/>
-          </w:tcPr>
-          <w:p>
-            <w:r/>
-            <w:r>
-              <w:rPr>
-                <w:b w:val="0"/>
-                <w:sz w:val="20"/>
-              </w:rPr>
-              <w:t>10</w:t>
-            </w:r>
-          </w:p>
-        </w:tc>
-      </w:tr>
-      <w:tr>
-        <w:tc>
-          <w:tcPr>
-            <w:tcW w:type="dxa" w:w="5102"/>
-          </w:tcPr>
-          <w:p>
-            <w:r/>
-            <w:r>
-              <w:rPr>
-                <w:b w:val="0"/>
-                <w:sz w:val="20"/>
-              </w:rPr>
-              <w:t>Plano de automação</w:t>
-            </w:r>
-          </w:p>
-        </w:tc>
-        <w:tc>
-          <w:tcPr>
-            <w:tcW w:type="dxa" w:w="1984"/>
-          </w:tcPr>
-          <w:p>
-            <w:r/>
-            <w:r>
-              <w:rPr>
-                <w:b w:val="0"/>
-                <w:sz w:val="20"/>
-              </w:rPr>
-              <w:t>2</w:t>
-            </w:r>
-          </w:p>
-        </w:tc>
-        <w:tc>
-          <w:tcPr>
-            <w:tcW w:type="dxa" w:w="1984"/>
-          </w:tcPr>
-          <w:p>
-            <w:r/>
-            <w:r>
-              <w:rPr>
-                <w:b w:val="0"/>
-                <w:sz w:val="20"/>
-              </w:rPr>
-              <w:t>5</w:t>
-            </w:r>
-          </w:p>
-        </w:tc>
-      </w:tr>
-      <w:tr>
-        <w:tc>
-          <w:tcPr>
-            <w:tcW w:type="dxa" w:w="5102"/>
-          </w:tcPr>
-          <w:p>
-            <w:r/>
-            <w:r>
-              <w:rPr>
-                <w:b w:val="0"/>
-                <w:sz w:val="20"/>
-              </w:rPr>
-              <w:t>Relatório e apresentação executiva</w:t>
-            </w:r>
-          </w:p>
-        </w:tc>
-        <w:tc>
-          <w:tcPr>
-            <w:tcW w:type="dxa" w:w="1984"/>
-          </w:tcPr>
-          <w:p>
-            <w:r/>
-            <w:r>
-              <w:rPr>
-                <w:b w:val="0"/>
-                <w:sz w:val="20"/>
-              </w:rPr>
-              <w:t>3</w:t>
-            </w:r>
-          </w:p>
-        </w:tc>
-        <w:tc>
-          <w:tcPr>
-            <w:tcW w:type="dxa" w:w="1984"/>
-          </w:tcPr>
-          <w:p>
-            <w:r/>
-            <w:r>
-              <w:rPr>
-                <w:b w:val="0"/>
-                <w:sz w:val="20"/>
-              </w:rPr>
-              <w:t>6</w:t>
-            </w:r>
-          </w:p>
-        </w:tc>
-      </w:tr>
-      <w:tr>
-        <w:tc>
-          <w:tcPr>
-            <w:tcW w:type="dxa" w:w="5102"/>
-          </w:tcPr>
-          <w:p>
-            <w:r/>
-            <w:r>
-              <w:rPr>
-                <w:b w:val="0"/>
-                <w:sz w:val="20"/>
-              </w:rPr>
-              <w:t>Avaliação de desempenho por competência</w:t>
-            </w:r>
-          </w:p>
-        </w:tc>
-        <w:tc>
-          <w:tcPr>
-            <w:tcW w:type="dxa" w:w="1984"/>
-          </w:tcPr>
-          <w:p>
-            <w:r/>
-            <w:r>
-              <w:rPr>
-                <w:b w:val="0"/>
-                <w:sz w:val="20"/>
-              </w:rPr>
-              <w:t>-</w:t>
-            </w:r>
-          </w:p>
-        </w:tc>
-        <w:tc>
-          <w:tcPr>
-            <w:tcW w:type="dxa" w:w="1984"/>
-          </w:tcPr>
-          <w:p>
-            <w:r/>
-            <w:r>
-              <w:rPr>
-                <w:b w:val="0"/>
-                <w:sz w:val="20"/>
-              </w:rPr>
-              <w:t>12</w:t>
-            </w:r>
-          </w:p>
-        </w:tc>
-      </w:tr>
-      <w:tr>
-        <w:tc>
-          <w:tcPr>
-            <w:tcW w:type="dxa" w:w="5102"/>
-          </w:tcPr>
-          <w:p>
-            <w:r/>
-            <w:r>
-              <w:rPr>
-                <w:b w:val="0"/>
-                <w:sz w:val="20"/>
-              </w:rPr>
-              <w:t>Contingência (20%)</w:t>
-            </w:r>
-          </w:p>
-        </w:tc>
-        <w:tc>
-          <w:tcPr>
-            <w:tcW w:type="dxa" w:w="1984"/>
-          </w:tcPr>
-          <w:p>
-            <w:r/>
-            <w:r>
-              <w:rPr>
-                <w:b w:val="0"/>
-                <w:sz w:val="20"/>
-              </w:rPr>
-              <w:t>7</w:t>
-            </w:r>
-          </w:p>
-        </w:tc>
-        <w:tc>
-          <w:tcPr>
-            <w:tcW w:type="dxa" w:w="1984"/>
-          </w:tcPr>
-          <w:p>
-            <w:r/>
-            <w:r>
-              <w:rPr>
-                <w:b w:val="0"/>
-                <w:sz w:val="20"/>
-              </w:rPr>
-              <w:t>16</w:t>
-            </w:r>
-          </w:p>
-        </w:tc>
-      </w:tr>
-      <w:tr>
-        <w:tc>
-          <w:tcPr>
-            <w:tcW w:type="dxa" w:w="5102"/>
+            <w:tcW w:type="dxa" w:w="1814"/>
           </w:tcPr>
           <w:p>
             <w:r/>
@@ -2315,7 +656,7 @@
         </w:tc>
         <w:tc>
           <w:tcPr>
-            <w:tcW w:type="dxa" w:w="1984"/>
+            <w:tcW w:type="dxa" w:w="1247"/>
           </w:tcPr>
           <w:p>
             <w:r/>
@@ -2324,13 +665,13 @@
                 <w:b/>
                 <w:sz w:val="20"/>
               </w:rPr>
-              <w:t>~41 h</w:t>
+              <w:t>8 semanas</w:t>
             </w:r>
           </w:p>
         </w:tc>
         <w:tc>
           <w:tcPr>
-            <w:tcW w:type="dxa" w:w="1984"/>
+            <w:tcW w:type="dxa" w:w="794"/>
           </w:tcPr>
           <w:p>
             <w:r/>
@@ -2339,120 +680,13 @@
                 <w:b/>
                 <w:sz w:val="20"/>
               </w:rPr>
-              <w:t>~96 h</w:t>
-            </w:r>
-          </w:p>
-        </w:tc>
-      </w:tr>
-    </w:tbl>
-    <w:p/>
-    <w:p>
-      <w:pPr>
-        <w:pStyle w:val="Heading1"/>
-      </w:pPr>
-      <w:r>
-        <w:t>9. Investimento (Fase 1)</w:t>
-      </w:r>
-    </w:p>
-    <w:tbl>
-      <w:tblPr>
-        <w:tblStyle w:val="TableGrid"/>
-        <w:tblW w:type="auto" w:w="0"/>
-        <w:jc w:val="center"/>
-        <w:tblLook w:firstColumn="1" w:firstRow="1" w:lastColumn="0" w:lastRow="0" w:noHBand="0" w:noVBand="1" w:val="04A0"/>
-      </w:tblPr>
-      <w:tblGrid>
-        <w:gridCol w:w="3249"/>
-        <w:gridCol w:w="3249"/>
-        <w:gridCol w:w="3249"/>
-      </w:tblGrid>
-      <w:tr>
-        <w:tc>
-          <w:tcPr>
-            <w:tcW w:type="dxa" w:w="3402"/>
-            <w:shd w:val="clear" w:color="auto" w:fill="1F3A5F"/>
-          </w:tcPr>
-          <w:p>
-            <w:r/>
-            <w:r>
-              <w:rPr>
-                <w:b/>
-                <w:color w:val="FFFFFF"/>
-                <w:sz w:val="20"/>
-              </w:rPr>
-              <w:t>Opção</w:t>
+              <w:t>~221 h</w:t>
             </w:r>
           </w:p>
         </w:tc>
         <w:tc>
           <w:tcPr>
-            <w:tcW w:type="dxa" w:w="2268"/>
-            <w:shd w:val="clear" w:color="auto" w:fill="1F3A5F"/>
-          </w:tcPr>
-          <w:p>
-            <w:r/>
-            <w:r>
-              <w:rPr>
-                <w:b/>
-                <w:color w:val="FFFFFF"/>
-                <w:sz w:val="20"/>
-              </w:rPr>
-              <w:t>Investimento</w:t>
-            </w:r>
-          </w:p>
-        </w:tc>
-        <w:tc>
-          <w:tcPr>
-            <w:tcW w:type="dxa" w:w="3402"/>
-            <w:shd w:val="clear" w:color="auto" w:fill="1F3A5F"/>
-          </w:tcPr>
-          <w:p>
-            <w:r/>
-            <w:r>
-              <w:rPr>
-                <w:b/>
-                <w:color w:val="FFFFFF"/>
-                <w:sz w:val="20"/>
-              </w:rPr>
-              <w:t>Pagamento</w:t>
-            </w:r>
-          </w:p>
-        </w:tc>
-      </w:tr>
-      <w:tr>
-        <w:tc>
-          <w:tcPr>
-            <w:tcW w:type="dxa" w:w="3402"/>
-          </w:tcPr>
-          <w:p>
-            <w:r/>
-            <w:r>
-              <w:rPr>
-                <w:b/>
-                <w:sz w:val="20"/>
-              </w:rPr>
-              <w:t>Essencial</w:t>
-            </w:r>
-          </w:p>
-        </w:tc>
-        <w:tc>
-          <w:tcPr>
-            <w:tcW w:type="dxa" w:w="2268"/>
-          </w:tcPr>
-          <w:p>
-            <w:r/>
-            <w:r>
-              <w:rPr>
-                <w:b/>
-                <w:sz w:val="20"/>
-              </w:rPr>
-              <w:t>R$ 7.800</w:t>
-            </w:r>
-          </w:p>
-        </w:tc>
-        <w:tc>
-          <w:tcPr>
-            <w:tcW w:type="dxa" w:w="3402"/>
+            <w:tcW w:type="dxa" w:w="3175"/>
           </w:tcPr>
           <w:p>
             <w:r/>
@@ -2461,45 +695,12 @@
                 <w:b w:val="0"/>
                 <w:sz w:val="20"/>
               </w:rPr>
-              <w:t>50% no aceite, 50% na entrega</w:t>
-            </w:r>
-          </w:p>
-        </w:tc>
-      </w:tr>
-      <w:tr>
-        <w:tc>
-          <w:tcPr>
-            <w:tcW w:type="dxa" w:w="3402"/>
-          </w:tcPr>
-          <w:p>
-            <w:r/>
-            <w:r>
-              <w:rPr>
-                <w:b/>
-                <w:sz w:val="20"/>
-              </w:rPr>
-              <w:t>Completa (recomendada)</w:t>
             </w:r>
           </w:p>
         </w:tc>
         <w:tc>
           <w:tcPr>
-            <w:tcW w:type="dxa" w:w="2268"/>
-          </w:tcPr>
-          <w:p>
-            <w:r/>
-            <w:r>
-              <w:rPr>
-                <w:b/>
-                <w:sz w:val="20"/>
-              </w:rPr>
-              <w:t>R$ 17.400</w:t>
-            </w:r>
-          </w:p>
-        </w:tc>
-        <w:tc>
-          <w:tcPr>
-            <w:tcW w:type="dxa" w:w="3402"/>
+            <w:tcW w:type="dxa" w:w="2381"/>
           </w:tcPr>
           <w:p>
             <w:r/>
@@ -2508,263 +709,6 @@
                 <w:b w:val="0"/>
                 <w:sz w:val="20"/>
               </w:rPr>
-              <w:t>30% no aceite, 35% na entrega do mapeamento, 35% na entrega final (janeiro de 2027)</w:t>
-            </w:r>
-          </w:p>
-        </w:tc>
-      </w:tr>
-      <w:tr>
-        <w:tc>
-          <w:tcPr>
-            <w:tcW w:type="dxa" w:w="3402"/>
-          </w:tcPr>
-          <w:p>
-            <w:r/>
-            <w:r>
-              <w:rPr>
-                <w:b w:val="0"/>
-                <w:sz w:val="20"/>
-              </w:rPr>
-              <w:t>Hora avulsa (fora do escopo, sob aprovação prévia)</w:t>
-            </w:r>
-          </w:p>
-        </w:tc>
-        <w:tc>
-          <w:tcPr>
-            <w:tcW w:type="dxa" w:w="2268"/>
-          </w:tcPr>
-          <w:p>
-            <w:r/>
-            <w:r>
-              <w:rPr>
-                <w:b w:val="0"/>
-                <w:sz w:val="20"/>
-              </w:rPr>
-              <w:t>R$ 220/h</w:t>
-            </w:r>
-          </w:p>
-        </w:tc>
-        <w:tc>
-          <w:tcPr>
-            <w:tcW w:type="dxa" w:w="3402"/>
-          </w:tcPr>
-          <w:p>
-            <w:r/>
-            <w:r>
-              <w:rPr>
-                <w:b w:val="0"/>
-                <w:sz w:val="20"/>
-              </w:rPr>
-              <w:t>Mensal, conforme horas aprovadas</w:t>
-            </w:r>
-          </w:p>
-        </w:tc>
-      </w:tr>
-    </w:tbl>
-    <w:p/>
-    <w:p>
-      <w:r>
-        <w:rPr>
-          <w:i w:val="0"/>
-        </w:rPr>
-        <w:t>A reunião inicial de 12/10/2026 e a preparação desta proposta não são cobradas. Acompanhamento mensal (Fase 3), se desejado, a partir de R$ 900 por mês com 4 horas.</w:t>
-      </w:r>
-    </w:p>
-    <w:p>
-      <w:pPr>
-        <w:pStyle w:val="Heading3"/>
-      </w:pPr>
-      <w:r>
-        <w:t>Avaliação de desempenho por competência (incluída na Completa)</w:t>
-      </w:r>
-    </w:p>
-    <w:p>
-      <w:r>
-        <w:rPr>
-          <w:i w:val="0"/>
-        </w:rPr>
-        <w:t>Atende ao pedido de avaliar o desempenho individual e criar uma premiação (reunião 00:46 e 02:21; briefing, seção 10). Parte dos papéis e indicadores da Fase 1 e organiza a avaliação em ciclos semestrais, com uma gratificação de fim de ano que a Surcin consegue provisionar mês a mês.</w:t>
-      </w:r>
-    </w:p>
-    <w:p>
-      <w:pPr>
-        <w:pStyle w:val="ListBullet"/>
-      </w:pPr>
-      <w:r>
-        <w:t>Matriz de competências por função (secretária, financeiro, DP, estagiária do jurídico), com o nível esperado de cada uma.</w:t>
-      </w:r>
-    </w:p>
-    <w:p>
-      <w:pPr>
-        <w:pStyle w:val="ListBullet"/>
-      </w:pPr>
-      <w:r>
-        <w:t>Formulário de avaliação com escala definida: autoavaliação da funcionária e avaliação da Thamires.</w:t>
-      </w:r>
-    </w:p>
-    <w:p>
-      <w:pPr>
-        <w:pStyle w:val="ListBullet"/>
-      </w:pPr>
-      <w:r>
-        <w:t>Regras do ciclo: duas avaliações por ano, critérios de assiduidade e pontualidade, conversa de devolutiva e plano de desenvolvimento individual.</w:t>
-      </w:r>
-    </w:p>
-    <w:p>
-      <w:pPr>
-        <w:pStyle w:val="ListBullet"/>
-      </w:pPr>
-      <w:r>
-        <w:t>Modelo de ligação com a gratificação de fim de ano, com simulação de provisão mensal. Os valores são decisão dela.</w:t>
-      </w:r>
-    </w:p>
-    <w:p>
-      <w:pPr>
-        <w:pStyle w:val="ListBullet"/>
-      </w:pPr>
-      <w:r>
-        <w:t>Guia de aplicação e uma sessão de preparação da Thamires para o primeiro ciclo.</w:t>
-      </w:r>
-    </w:p>
-    <w:tbl>
-      <w:tblPr>
-        <w:tblStyle w:val="TableGrid"/>
-        <w:tblW w:type="auto" w:w="0"/>
-        <w:jc w:val="center"/>
-        <w:tblLook w:firstColumn="1" w:firstRow="1" w:lastColumn="0" w:lastRow="0" w:noHBand="0" w:noVBand="1" w:val="04A0"/>
-      </w:tblPr>
-      <w:tblGrid>
-        <w:gridCol w:w="4873"/>
-        <w:gridCol w:w="4873"/>
-      </w:tblGrid>
-      <w:tr>
-        <w:tc>
-          <w:tcPr>
-            <w:tcW w:type="dxa" w:w="3402"/>
-            <w:shd w:val="clear" w:color="auto" w:fill="1F3A5F"/>
-          </w:tcPr>
-          <w:p>
-            <w:r/>
-            <w:r>
-              <w:rPr>
-                <w:b/>
-                <w:color w:val="FFFFFF"/>
-                <w:sz w:val="20"/>
-              </w:rPr>
-              <w:t>Item</w:t>
-            </w:r>
-          </w:p>
-        </w:tc>
-        <w:tc>
-          <w:tcPr>
-            <w:tcW w:type="dxa" w:w="5669"/>
-            <w:shd w:val="clear" w:color="auto" w:fill="1F3A5F"/>
-          </w:tcPr>
-          <w:p>
-            <w:r/>
-            <w:r>
-              <w:rPr>
-                <w:b/>
-                <w:color w:val="FFFFFF"/>
-                <w:sz w:val="20"/>
-              </w:rPr>
-              <w:t>Valor</w:t>
-            </w:r>
-          </w:p>
-        </w:tc>
-      </w:tr>
-      <w:tr>
-        <w:tc>
-          <w:tcPr>
-            <w:tcW w:type="dxa" w:w="3402"/>
-          </w:tcPr>
-          <w:p>
-            <w:r/>
-            <w:r>
-              <w:rPr>
-                <w:b w:val="0"/>
-                <w:sz w:val="20"/>
-              </w:rPr>
-              <w:t>Na opção Completa</w:t>
-            </w:r>
-          </w:p>
-        </w:tc>
-        <w:tc>
-          <w:tcPr>
-            <w:tcW w:type="dxa" w:w="5669"/>
-          </w:tcPr>
-          <w:p>
-            <w:r/>
-            <w:r>
-              <w:rPr>
-                <w:b w:val="0"/>
-                <w:sz w:val="20"/>
-              </w:rPr>
-              <w:t>Incluída no valor (cerca de 14 h, reaproveitando os papéis e indicadores da estrutura organizacional)</w:t>
-            </w:r>
-          </w:p>
-        </w:tc>
-      </w:tr>
-      <w:tr>
-        <w:tc>
-          <w:tcPr>
-            <w:tcW w:type="dxa" w:w="3402"/>
-          </w:tcPr>
-          <w:p>
-            <w:r/>
-            <w:r>
-              <w:rPr>
-                <w:b/>
-                <w:sz w:val="20"/>
-              </w:rPr>
-              <w:t>Com a Essencial ou contratada depois</w:t>
-            </w:r>
-          </w:p>
-        </w:tc>
-        <w:tc>
-          <w:tcPr>
-            <w:tcW w:type="dxa" w:w="5669"/>
-          </w:tcPr>
-          <w:p>
-            <w:r/>
-            <w:r>
-              <w:rPr>
-                <w:b/>
-                <w:sz w:val="20"/>
-              </w:rPr>
-              <w:t>R$ 3.200** (cerca de 18 h)</w:t>
-            </w:r>
-          </w:p>
-        </w:tc>
-      </w:tr>
-      <w:tr>
-        <w:tc>
-          <w:tcPr>
-            <w:tcW w:type="dxa" w:w="3402"/>
-          </w:tcPr>
-          <w:p>
-            <w:r/>
-            <w:r>
-              <w:rPr>
-                <w:b w:val="0"/>
-                <w:sz w:val="20"/>
-              </w:rPr>
-              <w:t>Quando</w:t>
-            </w:r>
-          </w:p>
-        </w:tc>
-        <w:tc>
-          <w:tcPr>
-            <w:tcW w:type="dxa" w:w="5669"/>
-          </w:tcPr>
-          <w:p>
-            <w:r/>
-            <w:r>
-              <w:rPr>
-                <w:b w:val="0"/>
-                <w:sz w:val="20"/>
-              </w:rPr>
-              <w:t>Janeiro de 2027, para que o primeiro ciclo cubra o 1º semestre de 2027</w:t>
             </w:r>
           </w:p>
         </w:tc>
@@ -2792,7 +736,7 @@
               <w:rPr>
                 <w:sz w:val="20"/>
               </w:rPr>
-              <w:t>Os critérios e a gratificação precisam de revisão trabalhista antes de entrar em vigor, em especial o tratamento de faltas justificadas por atestado médico e a natureza jurídica do valor pago. Essa revisão não está incluída.</w:t>
+              <w:t>Dois meses intensivos. Para entregar tudo funcionando até 23/12, a R2 trabalha no projeto todos os dias, inclusive sábados e domingos: são cerca de 221 horas, ou cerca de 4h15 por dia, de 03/11 a 23/12. Não há folga no calendário: o prazo depende de entrevistas, acessos e dados chegarem nas datas.</w:t>
             </w:r>
           </w:p>
         </w:tc>
@@ -2804,7 +748,7 @@
         <w:pStyle w:val="Heading1"/>
       </w:pPr>
       <w:r>
-        <w:t>10. Cronograma (opção Completa, aceite até 16/10/2026)</w:t>
+        <w:t>4. As 5 rotinas do Claude</w:t>
       </w:r>
     </w:p>
     <w:p>
@@ -2812,7 +756,7 @@
         <w:rPr>
           <w:i w:val="0"/>
         </w:rPr>
-        <w:t>Cerca de 10 horas por semana do consultor, segunda a sexta das 6h às 10h e depois das 19h30, além de sábados e domingos. Respeita as férias da Vitória (retorno em 28/10), a semana de fechamentos no início do mês e a prova da Thamires em 13/12.</w:t>
+        <w:t>Até 5 rotinas do Claude, escolhidas entre os processos priorizados no diagnóstico. As cinco abaixo são as candidatas iniciais. Uma rotina do Claude é um procedimento escrito e testado, operado de forma assistida: uma pessoa autorizada fornece o insumo, o Claude produz a saída e uma pessoa valida.</w:t>
       </w:r>
     </w:p>
     <w:tbl>
@@ -2820,48 +764,16 @@
         <w:tblStyle w:val="TableGrid"/>
         <w:tblW w:type="auto" w:w="0"/>
         <w:jc w:val="center"/>
+        <w:tblLayout w:type="fixed"/>
         <w:tblLook w:firstColumn="1" w:firstRow="1" w:lastColumn="0" w:lastRow="0" w:noHBand="0" w:noVBand="1" w:val="04A0"/>
       </w:tblPr>
       <w:tblGrid>
-        <w:gridCol w:w="3249"/>
-        <w:gridCol w:w="3249"/>
-        <w:gridCol w:w="3249"/>
+        <w:gridCol w:w="2381"/>
+        <w:gridCol w:w="2041"/>
+        <w:gridCol w:w="2721"/>
+        <w:gridCol w:w="2268"/>
       </w:tblGrid>
       <w:tr>
-        <w:tc>
-          <w:tcPr>
-            <w:tcW w:type="dxa" w:w="1587"/>
-            <w:shd w:val="clear" w:color="auto" w:fill="1F3A5F"/>
-          </w:tcPr>
-          <w:p>
-            <w:r/>
-            <w:r>
-              <w:rPr>
-                <w:b/>
-                <w:color w:val="FFFFFF"/>
-                <w:sz w:val="20"/>
-              </w:rPr>
-              <w:t>Semana</w:t>
-            </w:r>
-          </w:p>
-        </w:tc>
-        <w:tc>
-          <w:tcPr>
-            <w:tcW w:type="dxa" w:w="5102"/>
-            <w:shd w:val="clear" w:color="auto" w:fill="1F3A5F"/>
-          </w:tcPr>
-          <w:p>
-            <w:r/>
-            <w:r>
-              <w:rPr>
-                <w:b/>
-                <w:color w:val="FFFFFF"/>
-                <w:sz w:val="20"/>
-              </w:rPr>
-              <w:t>Atividades</w:t>
-            </w:r>
-          </w:p>
-        </w:tc>
         <w:tc>
           <w:tcPr>
             <w:tcW w:type="dxa" w:w="2381"/>
@@ -2875,42 +787,63 @@
                 <w:color w:val="FFFFFF"/>
                 <w:sz w:val="20"/>
               </w:rPr>
-              <w:t>Participação da Surcin</w:t>
+              <w:t>Rotina do Claude</w:t>
+            </w:r>
+          </w:p>
+        </w:tc>
+        <w:tc>
+          <w:tcPr>
+            <w:tcW w:type="dxa" w:w="2041"/>
+            <w:shd w:val="clear" w:color="auto" w:fill="1F3A5F"/>
+          </w:tcPr>
+          <w:p>
+            <w:r/>
+            <w:r>
+              <w:rPr>
+                <w:b/>
+                <w:color w:val="FFFFFF"/>
+                <w:sz w:val="20"/>
+              </w:rPr>
+              <w:t>Entra</w:t>
+            </w:r>
+          </w:p>
+        </w:tc>
+        <w:tc>
+          <w:tcPr>
+            <w:tcW w:type="dxa" w:w="2721"/>
+            <w:shd w:val="clear" w:color="auto" w:fill="1F3A5F"/>
+          </w:tcPr>
+          <w:p>
+            <w:r/>
+            <w:r>
+              <w:rPr>
+                <w:b/>
+                <w:color w:val="FFFFFF"/>
+                <w:sz w:val="20"/>
+              </w:rPr>
+              <w:t>Sai</w:t>
+            </w:r>
+          </w:p>
+        </w:tc>
+        <w:tc>
+          <w:tcPr>
+            <w:tcW w:type="dxa" w:w="2268"/>
+            <w:shd w:val="clear" w:color="auto" w:fill="1F3A5F"/>
+          </w:tcPr>
+          <w:p>
+            <w:r/>
+            <w:r>
+              <w:rPr>
+                <w:b/>
+                <w:color w:val="FFFFFF"/>
+                <w:sz w:val="20"/>
+              </w:rPr>
+              <w:t>Validação humana</w:t>
             </w:r>
           </w:p>
         </w:tc>
       </w:tr>
       <w:tr>
-        <w:tc>
-          <w:tcPr>
-            <w:tcW w:type="dxa" w:w="1587"/>
-          </w:tcPr>
-          <w:p>
-            <w:r/>
-            <w:r>
-              <w:rPr>
-                <w:b w:val="0"/>
-                <w:sz w:val="20"/>
-              </w:rPr>
-              <w:t>19 a 25/10</w:t>
-            </w:r>
-          </w:p>
-        </w:tc>
-        <w:tc>
-          <w:tcPr>
-            <w:tcW w:type="dxa" w:w="5102"/>
-          </w:tcPr>
-          <w:p>
-            <w:r/>
-            <w:r>
-              <w:rPr>
-                <w:b w:val="0"/>
-                <w:sz w:val="20"/>
-              </w:rPr>
-              <w:t>Kick-off, inventário de contas e ferramentas, coleta dos passo a passos, entrevistas com Thamires e Júlia</w:t>
-            </w:r>
-          </w:p>
-        </w:tc>
         <w:tc>
           <w:tcPr>
             <w:tcW w:type="dxa" w:w="2381"/>
@@ -2922,15 +855,13 @@
                 <w:b w:val="0"/>
                 <w:sz w:val="20"/>
               </w:rPr>
-              <w:t>Thamires 2 h, Júlia 1 h</w:t>
+              <w:t>01 · Entrada do cliente e passagem formal</w:t>
             </w:r>
           </w:p>
         </w:tc>
-      </w:tr>
-      <w:tr>
         <w:tc>
           <w:tcPr>
-            <w:tcW w:type="dxa" w:w="1587"/>
+            <w:tcW w:type="dxa" w:w="2041"/>
           </w:tcPr>
           <w:p>
             <w:r/>
@@ -2939,13 +870,13 @@
                 <w:b w:val="0"/>
                 <w:sz w:val="20"/>
               </w:rPr>
-              <w:t>26/10 a 01/11</w:t>
+              <w:t>Dados de implantação autorizados</w:t>
             </w:r>
           </w:p>
         </w:tc>
         <w:tc>
           <w:tcPr>
-            <w:tcW w:type="dxa" w:w="5102"/>
+            <w:tcW w:type="dxa" w:w="2721"/>
           </w:tcPr>
           <w:p>
             <w:r/>
@@ -2954,10 +885,27 @@
                 <w:b w:val="0"/>
                 <w:sz w:val="20"/>
               </w:rPr>
-              <w:t>Entrevistas com Tamara e Vitória; desenho do fiscal e dos pagamentos; desenho dos 3 controles</w:t>
+              <w:t>Trilha, lista de verificação, pendências e resumo da passagem formal</w:t>
             </w:r>
           </w:p>
         </w:tc>
+        <w:tc>
+          <w:tcPr>
+            <w:tcW w:type="dxa" w:w="2268"/>
+          </w:tcPr>
+          <w:p>
+            <w:r/>
+            <w:r>
+              <w:rPr>
+                <w:b w:val="0"/>
+                <w:sz w:val="20"/>
+              </w:rPr>
+              <w:t>Júlia coordena; a área técnica aprova a ativação</w:t>
+            </w:r>
+          </w:p>
+        </w:tc>
+      </w:tr>
+      <w:tr>
         <w:tc>
           <w:tcPr>
             <w:tcW w:type="dxa" w:w="2381"/>
@@ -2969,15 +917,13 @@
                 <w:b w:val="0"/>
                 <w:sz w:val="20"/>
               </w:rPr>
-              <w:t>Tamara 1 h, Vitória 1 h</w:t>
+              <w:t>02 · Triagem de demandas</w:t>
             </w:r>
           </w:p>
         </w:tc>
-      </w:tr>
-      <w:tr>
         <w:tc>
           <w:tcPr>
-            <w:tcW w:type="dxa" w:w="1587"/>
+            <w:tcW w:type="dxa" w:w="2041"/>
           </w:tcPr>
           <w:p>
             <w:r/>
@@ -2986,13 +932,13 @@
                 <w:b w:val="0"/>
                 <w:sz w:val="20"/>
               </w:rPr>
-              <w:t>02 a 08/11</w:t>
+              <w:t>Mensagem ou documento importado</w:t>
             </w:r>
           </w:p>
         </w:tc>
         <w:tc>
           <w:tcPr>
-            <w:tcW w:type="dxa" w:w="5102"/>
+            <w:tcW w:type="dxa" w:w="2721"/>
           </w:tcPr>
           <w:p>
             <w:r/>
@@ -3001,10 +947,27 @@
                 <w:b w:val="0"/>
                 <w:sz w:val="20"/>
               </w:rPr>
-              <w:t>Desenho dos fluxos atuais (sem reuniões: semana de fechamentos)</w:t>
+              <w:t>Categoria, prioridade sugerida, responsável e rascunho de resposta</w:t>
             </w:r>
           </w:p>
         </w:tc>
+        <w:tc>
+          <w:tcPr>
+            <w:tcW w:type="dxa" w:w="2268"/>
+          </w:tcPr>
+          <w:p>
+            <w:r/>
+            <w:r>
+              <w:rPr>
+                <w:b w:val="0"/>
+                <w:sz w:val="20"/>
+              </w:rPr>
+              <w:t>Atendimento revisa antes de enviar</w:t>
+            </w:r>
+          </w:p>
+        </w:tc>
+      </w:tr>
+      <w:tr>
         <w:tc>
           <w:tcPr>
             <w:tcW w:type="dxa" w:w="2381"/>
@@ -3016,15 +979,13 @@
                 <w:b w:val="0"/>
                 <w:sz w:val="20"/>
               </w:rPr>
-              <w:t>Nenhuma</w:t>
+              <w:t>03 · Conferência de guias e documentos</w:t>
             </w:r>
           </w:p>
         </w:tc>
-      </w:tr>
-      <w:tr>
         <w:tc>
           <w:tcPr>
-            <w:tcW w:type="dxa" w:w="1587"/>
+            <w:tcW w:type="dxa" w:w="2041"/>
           </w:tcPr>
           <w:p>
             <w:r/>
@@ -3033,13 +994,13 @@
                 <w:b w:val="0"/>
                 <w:sz w:val="20"/>
               </w:rPr>
-              <w:t>09 a 15/11</w:t>
+              <w:t>Documentos e cadastro mestre autorizado</w:t>
             </w:r>
           </w:p>
         </w:tc>
         <w:tc>
           <w:tcPr>
-            <w:tcW w:type="dxa" w:w="5102"/>
+            <w:tcW w:type="dxa" w:w="2721"/>
           </w:tcPr>
           <w:p>
             <w:r/>
@@ -3048,10 +1009,27 @@
                 <w:b w:val="0"/>
                 <w:sz w:val="20"/>
               </w:rPr>
-              <w:t>Validação, gargalos e dependências; controles em uso; entrega do mapeamento</w:t>
+              <w:t>Quadro por cliente, competência e tributo, com divergências</w:t>
             </w:r>
           </w:p>
         </w:tc>
+        <w:tc>
+          <w:tcPr>
+            <w:tcW w:type="dxa" w:w="2268"/>
+          </w:tcPr>
+          <w:p>
+            <w:r/>
+            <w:r>
+              <w:rPr>
+                <w:b w:val="0"/>
+                <w:sz w:val="20"/>
+              </w:rPr>
+              <w:t>Fiscal ou financeiro libera</w:t>
+            </w:r>
+          </w:p>
+        </w:tc>
+      </w:tr>
+      <w:tr>
         <w:tc>
           <w:tcPr>
             <w:tcW w:type="dxa" w:w="2381"/>
@@ -3063,15 +1041,13 @@
                 <w:b w:val="0"/>
                 <w:sz w:val="20"/>
               </w:rPr>
-              <w:t>Equipe 1 h, Thamires 1 h</w:t>
+              <w:t>04 · Fechamento financeiro assistido</w:t>
             </w:r>
           </w:p>
         </w:tc>
-      </w:tr>
-      <w:tr>
         <w:tc>
           <w:tcPr>
-            <w:tcW w:type="dxa" w:w="1587"/>
+            <w:tcW w:type="dxa" w:w="2041"/>
           </w:tcPr>
           <w:p>
             <w:r/>
@@ -3080,13 +1056,13 @@
                 <w:b w:val="0"/>
                 <w:sz w:val="20"/>
               </w:rPr>
-              <w:t>16 a 29/11</w:t>
+              <w:t>Exportações do Conta Azul e planilhas</w:t>
             </w:r>
           </w:p>
         </w:tc>
         <w:tc>
           <w:tcPr>
-            <w:tcW w:type="dxa" w:w="5102"/>
+            <w:tcW w:type="dxa" w:w="2721"/>
           </w:tcPr>
           <w:p>
             <w:r/>
@@ -3095,10 +1071,27 @@
                 <w:b w:val="0"/>
                 <w:sz w:val="20"/>
               </w:rPr>
-              <w:t>Estrutura organizacional: organogramas, papéis, indicadores</w:t>
+              <w:t>Conferências, indicadores e minuta de análise</w:t>
             </w:r>
           </w:p>
         </w:tc>
+        <w:tc>
+          <w:tcPr>
+            <w:tcW w:type="dxa" w:w="2268"/>
+          </w:tcPr>
+          <w:p>
+            <w:r/>
+            <w:r>
+              <w:rPr>
+                <w:b w:val="0"/>
+                <w:sz w:val="20"/>
+              </w:rPr>
+              <w:t>Vitória e/ou Thamires valida</w:t>
+            </w:r>
+          </w:p>
+        </w:tc>
+      </w:tr>
+      <w:tr>
         <w:tc>
           <w:tcPr>
             <w:tcW w:type="dxa" w:w="2381"/>
@@ -3110,15 +1103,13 @@
                 <w:b w:val="0"/>
                 <w:sz w:val="20"/>
               </w:rPr>
-              <w:t>Thamires 1 h</w:t>
+              <w:t>05 · Controle de tarefas e evidências</w:t>
             </w:r>
           </w:p>
         </w:tc>
-      </w:tr>
-      <w:tr>
         <w:tc>
           <w:tcPr>
-            <w:tcW w:type="dxa" w:w="1587"/>
+            <w:tcW w:type="dxa" w:w="2041"/>
           </w:tcPr>
           <w:p>
             <w:r/>
@@ -3127,13 +1118,13 @@
                 <w:b w:val="0"/>
                 <w:sz w:val="20"/>
               </w:rPr>
-              <w:t>30/11 a 13/12</w:t>
+              <w:t>Relatório de tarefas e índice de documentos</w:t>
             </w:r>
           </w:p>
         </w:tc>
         <w:tc>
           <w:tcPr>
-            <w:tcW w:type="dxa" w:w="5102"/>
+            <w:tcW w:type="dxa" w:w="2721"/>
           </w:tcPr>
           <w:p>
             <w:r/>
@@ -3142,13 +1133,13 @@
                 <w:b w:val="0"/>
                 <w:sz w:val="20"/>
               </w:rPr>
-              <w:t>Fluxos otimizados e plano de automação (sem reuniões na semana da prova)</w:t>
+              <w:t>Pendências e inconsistências sinalizadas</w:t>
             </w:r>
           </w:p>
         </w:tc>
         <w:tc>
           <w:tcPr>
-            <w:tcW w:type="dxa" w:w="2381"/>
+            <w:tcW w:type="dxa" w:w="2268"/>
           </w:tcPr>
           <w:p>
             <w:r/>
@@ -3157,101 +1148,7 @@
                 <w:b w:val="0"/>
                 <w:sz w:val="20"/>
               </w:rPr>
-              <w:t>Validação por escrito</w:t>
-            </w:r>
-          </w:p>
-        </w:tc>
-      </w:tr>
-      <w:tr>
-        <w:tc>
-          <w:tcPr>
-            <w:tcW w:type="dxa" w:w="1587"/>
-          </w:tcPr>
-          <w:p>
-            <w:r/>
-            <w:r>
-              <w:rPr>
-                <w:b w:val="0"/>
-                <w:sz w:val="20"/>
-              </w:rPr>
-              <w:t>14 a 18/12</w:t>
-            </w:r>
-          </w:p>
-        </w:tc>
-        <w:tc>
-          <w:tcPr>
-            <w:tcW w:type="dxa" w:w="5102"/>
-          </w:tcPr>
-          <w:p>
-            <w:r/>
-            <w:r>
-              <w:rPr>
-                <w:b w:val="0"/>
-                <w:sz w:val="20"/>
-              </w:rPr>
-              <w:t>Apresentação dos fluxos e do plano de automação; proposta dos módulos da Fase 2</w:t>
-            </w:r>
-          </w:p>
-        </w:tc>
-        <w:tc>
-          <w:tcPr>
-            <w:tcW w:type="dxa" w:w="2381"/>
-          </w:tcPr>
-          <w:p>
-            <w:r/>
-            <w:r>
-              <w:rPr>
-                <w:b w:val="0"/>
-                <w:sz w:val="20"/>
-              </w:rPr>
-              <w:t>Thamires 2 h</w:t>
-            </w:r>
-          </w:p>
-        </w:tc>
-      </w:tr>
-      <w:tr>
-        <w:tc>
-          <w:tcPr>
-            <w:tcW w:type="dxa" w:w="1587"/>
-          </w:tcPr>
-          <w:p>
-            <w:r/>
-            <w:r>
-              <w:rPr>
-                <w:b w:val="0"/>
-                <w:sz w:val="20"/>
-              </w:rPr>
-              <w:t>05 a 22/01/2027</w:t>
-            </w:r>
-          </w:p>
-        </w:tc>
-        <w:tc>
-          <w:tcPr>
-            <w:tcW w:type="dxa" w:w="5102"/>
-          </w:tcPr>
-          <w:p>
-            <w:r/>
-            <w:r>
-              <w:rPr>
-                <w:b w:val="0"/>
-                <w:sz w:val="20"/>
-              </w:rPr>
-              <w:t>Avaliação de desempenho por competência: matriz, formulário, regras do ciclo e gratificação; entrega final</w:t>
-            </w:r>
-          </w:p>
-        </w:tc>
-        <w:tc>
-          <w:tcPr>
-            <w:tcW w:type="dxa" w:w="2381"/>
-          </w:tcPr>
-          <w:p>
-            <w:r/>
-            <w:r>
-              <w:rPr>
-                <w:b w:val="0"/>
-                <w:sz w:val="20"/>
-              </w:rPr>
-              <w:t>Thamires 2 h</w:t>
+              <w:t>Área responsável confere a evidência</w:t>
             </w:r>
           </w:p>
         </w:tc>
@@ -3263,7 +1160,7 @@
         <w:rPr>
           <w:i w:val="0"/>
         </w:rPr>
-        <w:t>Opção Essencial: de 19/10 a cerca de 22/11, com entrega única no fim. Primeiros módulos da Fase 2 a partir de janeiro de 2027.</w:t>
+        <w:t>Cada rotina traz finalidade, procedimento, limites, 3 ou mais casos de teste e responsável. Passar de 5 rotinas exige aditivo.</w:t>
       </w:r>
     </w:p>
     <w:p>
@@ -3271,7 +1168,59 @@
         <w:pStyle w:val="Heading1"/>
       </w:pPr>
       <w:r>
-        <w:t>11. Respostas às perguntas do briefing (seção 16)</w:t>
+        <w:t>5. Os 2 pilotos</w:t>
+      </w:r>
+    </w:p>
+    <w:p>
+      <w:pPr>
+        <w:pStyle w:val="ListBullet"/>
+      </w:pPr>
+      <w:r>
+        <w:rPr>
+          <w:b/>
+        </w:rPr>
+        <w:t xml:space="preserve">Piloto A · Entrada do cliente assistida, com a Júlia: </w:t>
+      </w:r>
+      <w:r>
+        <w:t>até 2 casos selecionados; triagem por tipo de cliente e serviços contratados; lista de verificação e identificação de campos e documentos ausentes; passagem formal com responsáveis, pendências e prazo.</w:t>
+      </w:r>
+    </w:p>
+    <w:p>
+      <w:pPr>
+        <w:pStyle w:val="ListBullet"/>
+      </w:pPr>
+      <w:r>
+        <w:rPr>
+          <w:b/>
+        </w:rPr>
+        <w:t xml:space="preserve">Piloto B · Conferência assistida de guias e documentos: </w:t>
+      </w:r>
+      <w:r>
+        <w:t>documentos de teste pré-aprovados, de preferência anonimizados; confronto de cliente, CNPJ, competência, tributo, valor e pasta; sinalização de campos ausentes, diferenças e baixa confiança.</w:t>
+      </w:r>
+    </w:p>
+    <w:p>
+      <w:r>
+        <w:rPr>
+          <w:i w:val="0"/>
+        </w:rPr>
+        <w:t>Os pilotos não dependem de conexão automática com Domínio, Veri ou OneDrive: se um conector não for viável, o piloto segue com arquivos exportados. Ficam fora dos pilotos o pagamento bancário, a transmissão de declarações, decisões fiscais ou jurídicas finais e a integração com grupos de WhatsApp.</w:t>
+      </w:r>
+    </w:p>
+    <w:p>
+      <w:pPr>
+        <w:pStyle w:val="Heading1"/>
+      </w:pPr>
+      <w:r>
+        <w:t>6. Integrações: o que dá para ligar</w:t>
+      </w:r>
+    </w:p>
+    <w:p>
+      <w:r>
+        <w:rPr>
+          <w:i w:val="0"/>
+        </w:rPr>
+        <w:t>A proposta inclui até 2 integrações implantadas, escolhidas no diagnóstico entre os sistemas de viabilidade alta ou média confirmada. A classificação abaixo é uma leitura prévia, feita a partir do que se sabe publicamente de cada sistema, e será confirmada com os planos e acessos reais da Surcin.</w:t>
       </w:r>
     </w:p>
     <w:tbl>
@@ -3279,13 +1228,320 @@
         <w:tblStyle w:val="TableGrid"/>
         <w:tblW w:type="auto" w:w="0"/>
         <w:jc w:val="center"/>
+        <w:tblLayout w:type="fixed"/>
         <w:tblLook w:firstColumn="1" w:firstRow="1" w:lastColumn="0" w:lastRow="0" w:noHBand="0" w:noVBand="1" w:val="04A0"/>
       </w:tblPr>
       <w:tblGrid>
-        <w:gridCol w:w="4873"/>
-        <w:gridCol w:w="4873"/>
+        <w:gridCol w:w="1701"/>
+        <w:gridCol w:w="3118"/>
+        <w:gridCol w:w="4535"/>
       </w:tblGrid>
       <w:tr>
+        <w:tc>
+          <w:tcPr>
+            <w:tcW w:type="dxa" w:w="1701"/>
+            <w:shd w:val="clear" w:color="auto" w:fill="1F3A5F"/>
+          </w:tcPr>
+          <w:p>
+            <w:r/>
+            <w:r>
+              <w:rPr>
+                <w:b/>
+                <w:color w:val="FFFFFF"/>
+                <w:sz w:val="20"/>
+              </w:rPr>
+              <w:t>Viabilidade</w:t>
+            </w:r>
+          </w:p>
+        </w:tc>
+        <w:tc>
+          <w:tcPr>
+            <w:tcW w:type="dxa" w:w="3118"/>
+            <w:shd w:val="clear" w:color="auto" w:fill="1F3A5F"/>
+          </w:tcPr>
+          <w:p>
+            <w:r/>
+            <w:r>
+              <w:rPr>
+                <w:b/>
+                <w:color w:val="FFFFFF"/>
+                <w:sz w:val="20"/>
+              </w:rPr>
+              <w:t>Sistemas</w:t>
+            </w:r>
+          </w:p>
+        </w:tc>
+        <w:tc>
+          <w:tcPr>
+            <w:tcW w:type="dxa" w:w="4535"/>
+            <w:shd w:val="clear" w:color="auto" w:fill="1F3A5F"/>
+          </w:tcPr>
+          <w:p>
+            <w:r/>
+            <w:r>
+              <w:rPr>
+                <w:b/>
+                <w:color w:val="FFFFFF"/>
+                <w:sz w:val="20"/>
+              </w:rPr>
+              <w:t>Por quê</w:t>
+            </w:r>
+          </w:p>
+        </w:tc>
+      </w:tr>
+      <w:tr>
+        <w:tc>
+          <w:tcPr>
+            <w:tcW w:type="dxa" w:w="1701"/>
+          </w:tcPr>
+          <w:p>
+            <w:r/>
+            <w:r>
+              <w:rPr>
+                <w:b/>
+                <w:sz w:val="20"/>
+              </w:rPr>
+              <w:t>Alta</w:t>
+            </w:r>
+          </w:p>
+        </w:tc>
+        <w:tc>
+          <w:tcPr>
+            <w:tcW w:type="dxa" w:w="3118"/>
+          </w:tcPr>
+          <w:p>
+            <w:r/>
+            <w:r>
+              <w:rPr>
+                <w:b w:val="0"/>
+                <w:sz w:val="20"/>
+              </w:rPr>
+              <w:t>Trello, OneDrive e Microsoft 365 (Excel), Google Agenda, Google Forms, Notion, Slack</w:t>
+            </w:r>
+          </w:p>
+        </w:tc>
+        <w:tc>
+          <w:tcPr>
+            <w:tcW w:type="dxa" w:w="4535"/>
+          </w:tcPr>
+          <w:p>
+            <w:r/>
+            <w:r>
+              <w:rPr>
+                <w:b w:val="0"/>
+                <w:sz w:val="20"/>
+              </w:rPr>
+              <w:t>Têm acesso técnico público e documentado, e a maioria já tem conector pronto para o Claude.</w:t>
+            </w:r>
+          </w:p>
+        </w:tc>
+      </w:tr>
+      <w:tr>
+        <w:tc>
+          <w:tcPr>
+            <w:tcW w:type="dxa" w:w="1701"/>
+          </w:tcPr>
+          <w:p>
+            <w:r/>
+            <w:r>
+              <w:rPr>
+                <w:b/>
+                <w:sz w:val="20"/>
+              </w:rPr>
+              <w:t>Média</w:t>
+            </w:r>
+          </w:p>
+        </w:tc>
+        <w:tc>
+          <w:tcPr>
+            <w:tcW w:type="dxa" w:w="3118"/>
+          </w:tcPr>
+          <w:p>
+            <w:r/>
+            <w:r>
+              <w:rPr>
+                <w:b w:val="0"/>
+                <w:sz w:val="20"/>
+              </w:rPr>
+              <w:t>Conta Azul, WhatsApp</w:t>
+            </w:r>
+          </w:p>
+        </w:tc>
+        <w:tc>
+          <w:tcPr>
+            <w:tcW w:type="dxa" w:w="4535"/>
+          </w:tcPr>
+          <w:p>
+            <w:r/>
+            <w:r>
+              <w:rPr>
+                <w:b w:val="0"/>
+                <w:sz w:val="20"/>
+              </w:rPr>
+              <w:t>O Conta Azul tem acesso técnico público, mas a Surcin precisa autorizar. No WhatsApp, só a versão oficial do WhatsApp Business permite automação; ela é paga por conversa e não automatiza grupos.</w:t>
+            </w:r>
+          </w:p>
+        </w:tc>
+      </w:tr>
+      <w:tr>
+        <w:tc>
+          <w:tcPr>
+            <w:tcW w:type="dxa" w:w="1701"/>
+          </w:tcPr>
+          <w:p>
+            <w:r/>
+            <w:r>
+              <w:rPr>
+                <w:b/>
+                <w:sz w:val="20"/>
+              </w:rPr>
+              <w:t>Por arquivo exportado</w:t>
+            </w:r>
+          </w:p>
+        </w:tc>
+        <w:tc>
+          <w:tcPr>
+            <w:tcW w:type="dxa" w:w="3118"/>
+          </w:tcPr>
+          <w:p>
+            <w:r/>
+            <w:r>
+              <w:rPr>
+                <w:b w:val="0"/>
+                <w:sz w:val="20"/>
+              </w:rPr>
+              <w:t>Domínio, Veri, Nestzap, Jusbrasil, Alterdata, CITAX</w:t>
+            </w:r>
+          </w:p>
+        </w:tc>
+        <w:tc>
+          <w:tcPr>
+            <w:tcW w:type="dxa" w:w="4535"/>
+          </w:tcPr>
+          <w:p>
+            <w:r/>
+            <w:r>
+              <w:rPr>
+                <w:b w:val="0"/>
+                <w:sz w:val="20"/>
+              </w:rPr>
+              <w:t>Não há acesso técnico aberto conhecido para uso direto. Nesses sistemas a rotina usa relatórios exportados até que um acesso seja comprovado.</w:t>
+            </w:r>
+          </w:p>
+        </w:tc>
+      </w:tr>
+    </w:tbl>
+    <w:p/>
+    <w:p>
+      <w:r>
+        <w:rPr>
+          <w:i w:val="0"/>
+        </w:rPr>
+        <w:t>Candidatas mais fortes: Trello com o Claude (controle de tarefas e painel) e Conta Azul com a planilha do fechamento. Alternativa: OneDrive, para a conferência de documentos. Se um acesso não se confirmar, a rotina segue por arquivo exportado e a troca fica registrada no plano de evolução. Nenhuma integração paga, protocola ou envia algo a cliente sem confirmação humana.</w:t>
+      </w:r>
+    </w:p>
+    <w:p>
+      <w:pPr>
+        <w:pStyle w:val="Heading1"/>
+      </w:pPr>
+      <w:r>
+        <w:t>7. Avaliação de desempenho e painéis por área</w:t>
+      </w:r>
+    </w:p>
+    <w:p>
+      <w:pPr>
+        <w:pStyle w:val="ListBullet"/>
+      </w:pPr>
+      <w:r>
+        <w:rPr>
+          <w:b/>
+        </w:rPr>
+        <w:t xml:space="preserve">Avaliação por competência: </w:t>
+      </w:r>
+      <w:r>
+        <w:t>competências ajustadas aos papéis definidos na Etapa 2, ficha de avaliação, dicionário de notas, roteiro da conversa de avaliação, rotina de 1:1 semanal e regras de registro de faltas, atrasos e atestados. O primeiro ciclo é aplicado com a Thamires na Etapa 5. O modelo prevê avaliação semestral.</w:t>
+      </w:r>
+    </w:p>
+    <w:p>
+      <w:pPr>
+        <w:pStyle w:val="ListBullet"/>
+      </w:pPr>
+      <w:r>
+        <w:rPr>
+          <w:b/>
+        </w:rPr>
+        <w:t xml:space="preserve">Painéis por área: </w:t>
+      </w:r>
+      <w:r>
+        <w:t>de 3 a 5 indicadores por área (DP, Financeiro, Contabilidade e Comercial), mais uma visão da diretoria, cada um com definição, fórmula, fonte, responsável e meta. Na primeira versão, o painel é alimentado por planilha ou pelo Trello, com uma rotina semanal de atualização; a ligação direta com Domínio e Conta Azul depende das integrações da Etapa 4.</w:t>
+      </w:r>
+    </w:p>
+    <w:tbl>
+      <w:tblPr>
+        <w:tblStyle w:val="TableGrid"/>
+        <w:tblW w:type="auto" w:w="0"/>
+        <w:tblLook w:firstColumn="1" w:firstRow="1" w:lastColumn="0" w:lastRow="0" w:noHBand="0" w:noVBand="1" w:val="04A0"/>
+      </w:tblPr>
+      <w:tblGrid>
+        <w:gridCol w:w="9746"/>
+      </w:tblGrid>
+      <w:tr>
+        <w:tc>
+          <w:tcPr>
+            <w:tcW w:type="dxa" w:w="9746"/>
+            <w:shd w:val="clear" w:color="auto" w:fill="FFF4D6"/>
+          </w:tcPr>
+          <w:p>
+            <w:r/>
+            <w:r>
+              <w:rPr>
+                <w:sz w:val="20"/>
+              </w:rPr>
+              <w:t>Os valores de gratificação são decisão da Thamires, e os critérios precisam de revisão trabalhista antes de entrar em vigor, em especial o tratamento de faltas justificadas por atestado médico. Essa revisão não está incluída.</w:t>
+            </w:r>
+          </w:p>
+        </w:tc>
+      </w:tr>
+    </w:tbl>
+    <w:p/>
+    <w:p>
+      <w:pPr>
+        <w:pStyle w:val="Heading1"/>
+      </w:pPr>
+      <w:r>
+        <w:t>8. Escopo fechado</w:t>
+      </w:r>
+    </w:p>
+    <w:tbl>
+      <w:tblPr>
+        <w:tblStyle w:val="TableGrid"/>
+        <w:tblW w:type="auto" w:w="0"/>
+        <w:jc w:val="center"/>
+        <w:tblLayout w:type="fixed"/>
+        <w:tblLook w:firstColumn="1" w:firstRow="1" w:lastColumn="0" w:lastRow="0" w:noHBand="0" w:noVBand="1" w:val="04A0"/>
+      </w:tblPr>
+      <w:tblGrid>
+        <w:gridCol w:w="5669"/>
+        <w:gridCol w:w="3402"/>
+      </w:tblGrid>
+      <w:tr>
+        <w:tc>
+          <w:tcPr>
+            <w:tcW w:type="dxa" w:w="5669"/>
+            <w:shd w:val="clear" w:color="auto" w:fill="1F3A5F"/>
+          </w:tcPr>
+          <w:p>
+            <w:r/>
+            <w:r>
+              <w:rPr>
+                <w:b/>
+                <w:color w:val="FFFFFF"/>
+                <w:sz w:val="20"/>
+              </w:rPr>
+              <w:t>Item</w:t>
+            </w:r>
+          </w:p>
+        </w:tc>
         <w:tc>
           <w:tcPr>
             <w:tcW w:type="dxa" w:w="3402"/>
@@ -3299,29 +1555,27 @@
                 <w:color w:val="FFFFFF"/>
                 <w:sz w:val="20"/>
               </w:rPr>
-              <w:t>Pergunta</w:t>
+              <w:t>Limite do contrato</w:t>
             </w:r>
           </w:p>
         </w:tc>
+      </w:tr>
+      <w:tr>
         <w:tc>
           <w:tcPr>
             <w:tcW w:type="dxa" w:w="5669"/>
-            <w:shd w:val="clear" w:color="auto" w:fill="1F3A5F"/>
           </w:tcPr>
           <w:p>
             <w:r/>
             <w:r>
               <w:rPr>
-                <w:b/>
-                <w:color w:val="FFFFFF"/>
+                <w:b w:val="0"/>
                 <w:sz w:val="20"/>
               </w:rPr>
-              <w:t>Resposta</w:t>
+              <w:t>Entrevistas</w:t>
             </w:r>
           </w:p>
         </w:tc>
-      </w:tr>
-      <w:tr>
         <w:tc>
           <w:tcPr>
             <w:tcW w:type="dxa" w:w="3402"/>
@@ -3333,10 +1587,12 @@
                 <w:b w:val="0"/>
                 <w:sz w:val="20"/>
               </w:rPr>
-              <w:t>O que pode ser implantado com segurança antes de 13/12 sem consumir horas diárias da diretora?</w:t>
+              <w:t>5</w:t>
             </w:r>
           </w:p>
         </w:tc>
+      </w:tr>
+      <w:tr>
         <w:tc>
           <w:tcPr>
             <w:tcW w:type="dxa" w:w="5669"/>
@@ -3348,12 +1604,10 @@
                 <w:b w:val="0"/>
                 <w:sz w:val="20"/>
               </w:rPr>
-              <w:t>Os três controles manuais da contenção imediata, o mapeamento e a estrutura organizacional. Pedem cerca de 7 horas da Thamires no total, concentradas em outubro e novembro.</w:t>
+              <w:t>Processos atuais mapeados</w:t>
             </w:r>
           </w:p>
         </w:tc>
-      </w:tr>
-      <w:tr>
         <w:tc>
           <w:tcPr>
             <w:tcW w:type="dxa" w:w="3402"/>
@@ -3365,10 +1619,12 @@
                 <w:b w:val="0"/>
                 <w:sz w:val="20"/>
               </w:rPr>
-              <w:t>Quais três controles podem entrar primeiro?</w:t>
+              <w:t>8</w:t>
             </w:r>
           </w:p>
         </w:tc>
+      </w:tr>
+      <w:tr>
         <w:tc>
           <w:tcPr>
             <w:tcW w:type="dxa" w:w="5669"/>
@@ -3380,12 +1636,10 @@
                 <w:b w:val="0"/>
                 <w:sz w:val="20"/>
               </w:rPr>
-              <w:t>Conferência de guia antes do pagamento, evidência obrigatória para concluir cartões críticos e registro de escalonamentos. Depois, as versões automatizadas viram módulos da Fase 2.</w:t>
+              <w:t>Fluxos redesenhados</w:t>
             </w:r>
           </w:p>
         </w:tc>
-      </w:tr>
-      <w:tr>
         <w:tc>
           <w:tcPr>
             <w:tcW w:type="dxa" w:w="3402"/>
@@ -3397,10 +1651,12 @@
                 <w:b w:val="0"/>
                 <w:sz w:val="20"/>
               </w:rPr>
-              <w:t>Como a Base Mestre será estruturada sem duplicação ou vazamento?</w:t>
+              <w:t>5</w:t>
             </w:r>
           </w:p>
         </w:tc>
+      </w:tr>
+      <w:tr>
         <w:tc>
           <w:tcPr>
             <w:tcW w:type="dxa" w:w="5669"/>
@@ -3412,12 +1668,10 @@
                 <w:b w:val="0"/>
                 <w:sz w:val="20"/>
               </w:rPr>
-              <w:t>Uma única base no OneDrive como fonte oficial, com campos mínimos definidos na Fase 1; os especialistas consultam sem duplicar cadastro, com acesso por função. O desenho técnico sai no plano.</w:t>
+              <w:t>Rotinas do Claude</w:t>
             </w:r>
           </w:p>
         </w:tc>
-      </w:tr>
-      <w:tr>
         <w:tc>
           <w:tcPr>
             <w:tcW w:type="dxa" w:w="3402"/>
@@ -3429,10 +1683,12 @@
                 <w:b w:val="0"/>
                 <w:sz w:val="20"/>
               </w:rPr>
-              <w:t>Como verificar identidade e competência de PDFs?</w:t>
+              <w:t>5</w:t>
             </w:r>
           </w:p>
         </w:tc>
+      </w:tr>
+      <w:tr>
         <w:tc>
           <w:tcPr>
             <w:tcW w:type="dxa" w:w="5669"/>
@@ -3444,12 +1700,10 @@
                 <w:b w:val="0"/>
                 <w:sz w:val="20"/>
               </w:rPr>
-              <w:t>Primeiro com padrão de nome e conferência humana (Fase 1); depois com validador testado em amostras reais anonimizadas, sempre com pagamento humano.</w:t>
+              <w:t>Pilotos funcionais</w:t>
             </w:r>
           </w:p>
         </w:tc>
-      </w:tr>
-      <w:tr>
         <w:tc>
           <w:tcPr>
             <w:tcW w:type="dxa" w:w="3402"/>
@@ -3461,10 +1715,12 @@
                 <w:b w:val="0"/>
                 <w:sz w:val="20"/>
               </w:rPr>
-              <w:t>Como o painel do Lovable não expõe dados entre clientes?</w:t>
+              <w:t>2</w:t>
             </w:r>
           </w:p>
         </w:tc>
+      </w:tr>
+      <w:tr>
         <w:tc>
           <w:tcPr>
             <w:tcW w:type="dxa" w:w="5669"/>
@@ -3476,12 +1732,10 @@
                 <w:b w:val="0"/>
                 <w:sz w:val="20"/>
               </w:rPr>
-              <w:t>Piloto com um ou dois clientes, dados segregados por cliente e autenticação; protótipo visual não é tratado como plataforma pronta.</w:t>
+              <w:t>Integrações implantadas</w:t>
             </w:r>
           </w:p>
         </w:tc>
-      </w:tr>
-      <w:tr>
         <w:tc>
           <w:tcPr>
             <w:tcW w:type="dxa" w:w="3402"/>
@@ -3493,10 +1747,12 @@
                 <w:b w:val="0"/>
                 <w:sz w:val="20"/>
               </w:rPr>
-              <w:t>Quais integrações são viáveis?</w:t>
+              <w:t>2</w:t>
             </w:r>
           </w:p>
         </w:tc>
+      </w:tr>
+      <w:tr>
         <w:tc>
           <w:tcPr>
             <w:tcW w:type="dxa" w:w="5669"/>
@@ -3508,12 +1764,10 @@
                 <w:b w:val="0"/>
                 <w:sz w:val="20"/>
               </w:rPr>
-              <w:t>Cada conector (Conta Azul, Domínio, Nestzap/WhatsApp em grupos, OneDrive, Trello) recebe prova de viabilidade antes de entrar em orçamento. Nada é presumido.</w:t>
+              <w:t>Treinamentos de até 90 minutos</w:t>
             </w:r>
           </w:p>
         </w:tc>
-      </w:tr>
-      <w:tr>
         <w:tc>
           <w:tcPr>
             <w:tcW w:type="dxa" w:w="3402"/>
@@ -3525,10 +1779,12 @@
                 <w:b w:val="0"/>
                 <w:sz w:val="20"/>
               </w:rPr>
-              <w:t>Como é a homologação?</w:t>
+              <w:t>3</w:t>
             </w:r>
           </w:p>
         </w:tc>
+      </w:tr>
+      <w:tr>
         <w:tc>
           <w:tcPr>
             <w:tcW w:type="dxa" w:w="5669"/>
@@ -3540,12 +1796,10 @@
                 <w:b w:val="0"/>
                 <w:sz w:val="20"/>
               </w:rPr>
-              <w:t>Com dados fictícios ou anonimizados e autorização por escrito antes de usar dados reais.</w:t>
+              <w:t>Painel por área + diretoria</w:t>
             </w:r>
           </w:p>
         </w:tc>
-      </w:tr>
-      <w:tr>
         <w:tc>
           <w:tcPr>
             <w:tcW w:type="dxa" w:w="3402"/>
@@ -3557,10 +1811,12 @@
                 <w:b w:val="0"/>
                 <w:sz w:val="20"/>
               </w:rPr>
-              <w:t>E se o consultor sair ou uma ferramenta mudar?</w:t>
+              <w:t>1</w:t>
             </w:r>
           </w:p>
         </w:tc>
+      </w:tr>
+      <w:tr>
         <w:tc>
           <w:tcPr>
             <w:tcW w:type="dxa" w:w="5669"/>
@@ -3572,7 +1828,22 @@
                 <w:b w:val="0"/>
                 <w:sz w:val="20"/>
               </w:rPr>
-              <w:t>Ativos em nome da Surcin, documentação de cada rotina, procedimento manual de contingência e acesso administrativo entregue.</w:t>
+              <w:t>Ciclo de avaliação por competência</w:t>
+            </w:r>
+          </w:p>
+        </w:tc>
+        <w:tc>
+          <w:tcPr>
+            <w:tcW w:type="dxa" w:w="3402"/>
+          </w:tcPr>
+          <w:p>
+            <w:r/>
+            <w:r>
+              <w:rPr>
+                <w:b w:val="0"/>
+                <w:sz w:val="20"/>
+              </w:rPr>
+              <w:t>1</w:t>
             </w:r>
           </w:p>
         </w:tc>
@@ -3581,10 +1852,353 @@
     <w:p/>
     <w:p>
       <w:pPr>
+        <w:pStyle w:val="Heading3"/>
+      </w:pPr>
+      <w:r>
+        <w:t>Fora do escopo</w:t>
+      </w:r>
+    </w:p>
+    <w:p>
+      <w:pPr>
+        <w:pStyle w:val="ListBullet"/>
+      </w:pPr>
+      <w:r>
+        <w:t>Sistema de gestão integrado (ERP) ou implementação completa de todos os setores.</w:t>
+      </w:r>
+    </w:p>
+    <w:p>
+      <w:pPr>
+        <w:pStyle w:val="ListBullet"/>
+      </w:pPr>
+      <w:r>
+        <w:t>Migração de toda a base histórica.</w:t>
+      </w:r>
+    </w:p>
+    <w:p>
+      <w:pPr>
+        <w:pStyle w:val="ListBullet"/>
+      </w:pPr>
+      <w:r>
+        <w:t>Integrações além das 2 contratadas e sistemas sem acesso técnico (seguem por arquivo exportado).</w:t>
+      </w:r>
+    </w:p>
+    <w:p>
+      <w:pPr>
+        <w:pStyle w:val="ListBullet"/>
+      </w:pPr>
+      <w:r>
+        <w:t>Auditoria fiscal ou contábil formal.</w:t>
+      </w:r>
+    </w:p>
+    <w:p>
+      <w:pPr>
+        <w:pStyle w:val="ListBullet"/>
+      </w:pPr>
+      <w:r>
+        <w:t>Decisões e protocolos profissionais, que continuam com a equipe da Surcin.</w:t>
+      </w:r>
+    </w:p>
+    <w:p>
+      <w:pPr>
+        <w:pStyle w:val="ListBullet"/>
+      </w:pPr>
+      <w:r>
+        <w:t>Disparos sensíveis e pagamentos automáticos.</w:t>
+      </w:r>
+    </w:p>
+    <w:p>
+      <w:pPr>
+        <w:pStyle w:val="ListBullet"/>
+      </w:pPr>
+      <w:r>
+        <w:t>Suporte contínuo e monitoramento 24 horas por dia.</w:t>
+      </w:r>
+    </w:p>
+    <w:p>
+      <w:pPr>
+        <w:pStyle w:val="ListBullet"/>
+      </w:pPr>
+      <w:r>
+        <w:t>Valores de gratificação e revisão trabalhista.</w:t>
+      </w:r>
+    </w:p>
+    <w:p>
+      <w:r>
+        <w:rPr>
+          <w:i w:val="0"/>
+        </w:rPr>
+        <w:t>Tudo além do escopo fechado exige orçamento ou aditivo, aprovado por escrito antes da execução.</w:t>
+      </w:r>
+    </w:p>
+    <w:p>
+      <w:pPr>
         <w:pStyle w:val="Heading1"/>
       </w:pPr>
       <w:r>
-        <w:t>12. Responsabilidades</w:t>
+        <w:t>9. Investimento</w:t>
+      </w:r>
+    </w:p>
+    <w:tbl>
+      <w:tblPr>
+        <w:tblStyle w:val="TableGrid"/>
+        <w:tblW w:type="auto" w:w="0"/>
+        <w:jc w:val="center"/>
+        <w:tblLayout w:type="fixed"/>
+        <w:tblLook w:firstColumn="1" w:firstRow="1" w:lastColumn="0" w:lastRow="0" w:noHBand="0" w:noVBand="1" w:val="04A0"/>
+      </w:tblPr>
+      <w:tblGrid>
+        <w:gridCol w:w="2835"/>
+        <w:gridCol w:w="1984"/>
+        <w:gridCol w:w="4252"/>
+      </w:tblGrid>
+      <w:tr>
+        <w:tc>
+          <w:tcPr>
+            <w:tcW w:type="dxa" w:w="2835"/>
+            <w:shd w:val="clear" w:color="auto" w:fill="1F3A5F"/>
+          </w:tcPr>
+          <w:p>
+            <w:r/>
+            <w:r>
+              <w:rPr>
+                <w:b/>
+                <w:color w:val="FFFFFF"/>
+                <w:sz w:val="20"/>
+              </w:rPr>
+            </w:r>
+          </w:p>
+        </w:tc>
+        <w:tc>
+          <w:tcPr>
+            <w:tcW w:type="dxa" w:w="1984"/>
+            <w:shd w:val="clear" w:color="auto" w:fill="1F3A5F"/>
+          </w:tcPr>
+          <w:p>
+            <w:r/>
+            <w:r>
+              <w:rPr>
+                <w:b/>
+                <w:color w:val="FFFFFF"/>
+                <w:sz w:val="20"/>
+              </w:rPr>
+              <w:t>Valor</w:t>
+            </w:r>
+          </w:p>
+        </w:tc>
+        <w:tc>
+          <w:tcPr>
+            <w:tcW w:type="dxa" w:w="4252"/>
+            <w:shd w:val="clear" w:color="auto" w:fill="1F3A5F"/>
+          </w:tcPr>
+          <w:p>
+            <w:r/>
+            <w:r>
+              <w:rPr>
+                <w:b/>
+                <w:color w:val="FFFFFF"/>
+                <w:sz w:val="20"/>
+              </w:rPr>
+              <w:t>Quando</w:t>
+            </w:r>
+          </w:p>
+        </w:tc>
+      </w:tr>
+      <w:tr>
+        <w:tc>
+          <w:tcPr>
+            <w:tcW w:type="dxa" w:w="2835"/>
+          </w:tcPr>
+          <w:p>
+            <w:r/>
+            <w:r>
+              <w:rPr>
+                <w:b/>
+                <w:sz w:val="20"/>
+              </w:rPr>
+              <w:t>Consultoria e implantação</w:t>
+            </w:r>
+          </w:p>
+        </w:tc>
+        <w:tc>
+          <w:tcPr>
+            <w:tcW w:type="dxa" w:w="1984"/>
+          </w:tcPr>
+          <w:p>
+            <w:r/>
+            <w:r>
+              <w:rPr>
+                <w:b/>
+                <w:sz w:val="20"/>
+              </w:rPr>
+              <w:t>R$ 31.900</w:t>
+            </w:r>
+          </w:p>
+        </w:tc>
+        <w:tc>
+          <w:tcPr>
+            <w:tcW w:type="dxa" w:w="4252"/>
+          </w:tcPr>
+          <w:p>
+            <w:r/>
+            <w:r>
+              <w:rPr>
+                <w:b w:val="0"/>
+                <w:sz w:val="20"/>
+              </w:rPr>
+              <w:t>8 semanas · 5 etapas · 5 rotinas do Claude · 2 pilotos · 2 integrações</w:t>
+            </w:r>
+          </w:p>
+        </w:tc>
+      </w:tr>
+      <w:tr>
+        <w:tc>
+          <w:tcPr>
+            <w:tcW w:type="dxa" w:w="2835"/>
+          </w:tcPr>
+          <w:p>
+            <w:r/>
+            <w:r>
+              <w:rPr>
+                <w:b w:val="0"/>
+                <w:sz w:val="20"/>
+              </w:rPr>
+              <w:t>Parcela 1 · 30%</w:t>
+            </w:r>
+          </w:p>
+        </w:tc>
+        <w:tc>
+          <w:tcPr>
+            <w:tcW w:type="dxa" w:w="1984"/>
+          </w:tcPr>
+          <w:p>
+            <w:r/>
+            <w:r>
+              <w:rPr>
+                <w:b w:val="0"/>
+                <w:sz w:val="20"/>
+              </w:rPr>
+              <w:t>R$ 9.570</w:t>
+            </w:r>
+          </w:p>
+        </w:tc>
+        <w:tc>
+          <w:tcPr>
+            <w:tcW w:type="dxa" w:w="4252"/>
+          </w:tcPr>
+          <w:p>
+            <w:r/>
+            <w:r>
+              <w:rPr>
+                <w:b w:val="0"/>
+                <w:sz w:val="20"/>
+              </w:rPr>
+              <w:t>No aceite da proposta (início da Etapa 1)</w:t>
+            </w:r>
+          </w:p>
+        </w:tc>
+      </w:tr>
+      <w:tr>
+        <w:tc>
+          <w:tcPr>
+            <w:tcW w:type="dxa" w:w="2835"/>
+          </w:tcPr>
+          <w:p>
+            <w:r/>
+            <w:r>
+              <w:rPr>
+                <w:b w:val="0"/>
+                <w:sz w:val="20"/>
+              </w:rPr>
+              <w:t>Parcela 2 · 35%</w:t>
+            </w:r>
+          </w:p>
+        </w:tc>
+        <w:tc>
+          <w:tcPr>
+            <w:tcW w:type="dxa" w:w="1984"/>
+          </w:tcPr>
+          <w:p>
+            <w:r/>
+            <w:r>
+              <w:rPr>
+                <w:b w:val="0"/>
+                <w:sz w:val="20"/>
+              </w:rPr>
+              <w:t>R$ 11.165</w:t>
+            </w:r>
+          </w:p>
+        </w:tc>
+        <w:tc>
+          <w:tcPr>
+            <w:tcW w:type="dxa" w:w="4252"/>
+          </w:tcPr>
+          <w:p>
+            <w:r/>
+            <w:r>
+              <w:rPr>
+                <w:b w:val="0"/>
+                <w:sz w:val="20"/>
+              </w:rPr>
+              <w:t>No aceite da Etapa 3 (biblioteca de 5 rotinas do Claude validada)</w:t>
+            </w:r>
+          </w:p>
+        </w:tc>
+      </w:tr>
+      <w:tr>
+        <w:tc>
+          <w:tcPr>
+            <w:tcW w:type="dxa" w:w="2835"/>
+          </w:tcPr>
+          <w:p>
+            <w:r/>
+            <w:r>
+              <w:rPr>
+                <w:b w:val="0"/>
+                <w:sz w:val="20"/>
+              </w:rPr>
+              <w:t>Parcela 3 · 35%</w:t>
+            </w:r>
+          </w:p>
+        </w:tc>
+        <w:tc>
+          <w:tcPr>
+            <w:tcW w:type="dxa" w:w="1984"/>
+          </w:tcPr>
+          <w:p>
+            <w:r/>
+            <w:r>
+              <w:rPr>
+                <w:b w:val="0"/>
+                <w:sz w:val="20"/>
+              </w:rPr>
+              <w:t>R$ 11.165</w:t>
+            </w:r>
+          </w:p>
+        </w:tc>
+        <w:tc>
+          <w:tcPr>
+            <w:tcW w:type="dxa" w:w="4252"/>
+          </w:tcPr>
+          <w:p>
+            <w:r/>
+            <w:r>
+              <w:rPr>
+                <w:b w:val="0"/>
+                <w:sz w:val="20"/>
+              </w:rPr>
+              <w:t>Na entrega final (homologação das Etapas 4 e 5)</w:t>
+            </w:r>
+          </w:p>
+        </w:tc>
+      </w:tr>
+    </w:tbl>
+    <w:p/>
+    <w:p>
+      <w:r>
+        <w:rPr>
+          <w:i w:val="0"/>
+        </w:rPr>
+        <w:t>Valor único, com escopo fechado. O contrato detalha o marco exato de cada parcela.</w:t>
       </w:r>
     </w:p>
     <w:p>
@@ -3592,7 +2206,109 @@
         <w:pStyle w:val="Heading3"/>
       </w:pPr>
       <w:r>
-        <w:t>Do consultor</w:t>
+        <w:t>Custos da Surcin, à parte e com aprovação prévia</w:t>
+      </w:r>
+    </w:p>
+    <w:p>
+      <w:r>
+        <w:rPr>
+          <w:i w:val="0"/>
+        </w:rPr>
+        <w:t>Planos do Claude e de outras ferramentas, uso de modelos de IA e integrações, automação, hospedagem, licenças, custo por conversa do WhatsApp Business, infraestrutura e eventuais terceiros.</w:t>
+      </w:r>
+    </w:p>
+    <w:p>
+      <w:pPr>
+        <w:pStyle w:val="Heading1"/>
+      </w:pPr>
+      <w:r>
+        <w:t>10. Princípios de implantação</w:t>
+      </w:r>
+    </w:p>
+    <w:p>
+      <w:pPr>
+        <w:pStyle w:val="ListBullet"/>
+      </w:pPr>
+      <w:r>
+        <w:rPr>
+          <w:b/>
+        </w:rPr>
+        <w:t xml:space="preserve">Processo antes de ferramenta. </w:t>
+      </w:r>
+      <w:r>
+        <w:t>Nada é automatizado antes de o fluxo estar validado; parâmetros fiscais são conferidos antes de qualquer automação.</w:t>
+      </w:r>
+    </w:p>
+    <w:p>
+      <w:pPr>
+        <w:pStyle w:val="ListBullet"/>
+      </w:pPr>
+      <w:r>
+        <w:rPr>
+          <w:b/>
+        </w:rPr>
+        <w:t xml:space="preserve">Confirmação humana. </w:t>
+      </w:r>
+      <w:r>
+        <w:t>Pesquisar, resumir e conferir podem ser automáticos; criar tarefa ou preparar mensagem exige confirmação e registro; pagar, protocolar, excluir e decidir é sempre humano.</w:t>
+      </w:r>
+    </w:p>
+    <w:p>
+      <w:pPr>
+        <w:pStyle w:val="ListBullet"/>
+      </w:pPr>
+      <w:r>
+        <w:rPr>
+          <w:b/>
+        </w:rPr>
+        <w:t xml:space="preserve">Ativos da Surcin. </w:t>
+      </w:r>
+      <w:r>
+        <w:t>Arquivos e materiais contratados ficam com a Surcin, com acesso de administrador ao que for dela. A R2 mantém a metodologia pré-existente.</w:t>
+      </w:r>
+    </w:p>
+    <w:p>
+      <w:pPr>
+        <w:pStyle w:val="ListBullet"/>
+      </w:pPr>
+      <w:r>
+        <w:rPr>
+          <w:b/>
+        </w:rPr>
+        <w:t xml:space="preserve">Segurança e LGPD. </w:t>
+      </w:r>
+      <w:r>
+        <w:t>Confidencialidade, minimização e segregação de dados por cliente, testes com dados anonimizados e credenciais em ambiente seguro.</w:t>
+      </w:r>
+    </w:p>
+    <w:p>
+      <w:pPr>
+        <w:pStyle w:val="ListBullet"/>
+      </w:pPr>
+      <w:r>
+        <w:rPr>
+          <w:b/>
+        </w:rPr>
+        <w:t xml:space="preserve">Continuidade. </w:t>
+      </w:r>
+      <w:r>
+        <w:t>Cada rotina tem alternativa manual e pode ser operada sem o consultor.</w:t>
+      </w:r>
+    </w:p>
+    <w:p>
+      <w:pPr>
+        <w:pStyle w:val="Heading1"/>
+      </w:pPr>
+      <w:r>
+        <w:t>11. Responsabilidades</w:t>
+      </w:r>
+    </w:p>
+    <w:p>
+      <w:pPr>
+        <w:pStyle w:val="Heading3"/>
+      </w:pPr>
+      <w:r>
+        <w:t>Da R2 Tech Consultoria</w:t>
       </w:r>
     </w:p>
     <w:p>
@@ -3608,7 +2324,7 @@
         <w:pStyle w:val="ListBullet"/>
       </w:pPr>
       <w:r>
-        <w:t>Entregar os documentos em formato editável, no OneDrive da Surcin.</w:t>
+        <w:t>Trabalhar no projeto todos os dias, inclusive sábados e domingos, de 03/11 a 23/12.</w:t>
       </w:r>
     </w:p>
     <w:p>
@@ -3616,7 +2332,15 @@
         <w:pStyle w:val="ListBullet"/>
       </w:pPr>
       <w:r>
-        <w:t>Manter sigilo sobre dados da empresa e de seus clientes, com acordo de confidencialidade.</w:t>
+        <w:t>Entregar os documentos em formato editável, no ambiente da Surcin.</w:t>
+      </w:r>
+    </w:p>
+    <w:p>
+      <w:pPr>
+        <w:pStyle w:val="ListBullet"/>
+      </w:pPr>
+      <w:r>
+        <w:t>Manter sigilo sobre os dados da empresa e de seus clientes, com acordo de confidencialidade.</w:t>
       </w:r>
     </w:p>
     <w:p>
@@ -3629,10 +2353,10 @@
     </w:p>
     <w:p>
       <w:pPr>
-        <w:pStyle w:val="ListBullet"/>
+        <w:pStyle w:val="Heading3"/>
       </w:pPr>
       <w:r>
-        <w:t>Trabalhar no projeto de segunda a sexta das 6h às 10h e depois das 19h30, além de sábados e domingos.</w:t>
+        <w:t>Da Surcin</w:t>
       </w:r>
     </w:p>
     <w:p>
@@ -3640,15 +2364,7 @@
         <w:pStyle w:val="ListBullet"/>
       </w:pPr>
       <w:r>
-        <w:t>Responder mensagens em até 1 dia útil, dentro dessas janelas.</w:t>
-      </w:r>
-    </w:p>
-    <w:p>
-      <w:pPr>
-        <w:pStyle w:val="Heading3"/>
-      </w:pPr>
-      <w:r>
-        <w:t>Da cliente</w:t>
+        <w:t>Aceitar a proposta até 30/10 e liberar os acessos no início do projeto.</w:t>
       </w:r>
     </w:p>
     <w:p>
@@ -3656,7 +2372,7 @@
         <w:pStyle w:val="ListBullet"/>
       </w:pPr>
       <w:r>
-        <w:t>Indicar a Júlia (ou outra pessoa) como ponto focal para acessos e agenda.</w:t>
+        <w:t>Indicar um ponto focal para acessos e agenda.</w:t>
       </w:r>
     </w:p>
     <w:p>
@@ -3664,7 +2380,7 @@
         <w:pStyle w:val="ListBullet"/>
       </w:pPr>
       <w:r>
-        <w:t>Liberar acesso de leitura ao Trello, à pasta Geral do OneDrive e aos passo a passos.</w:t>
+        <w:t>Liberar a equipe para entrevistas de cerca de 1 hora de 09 a 13/11 (sem entrevistas nos fechamentos, de 02 a 08/11).</w:t>
       </w:r>
     </w:p>
     <w:p>
@@ -3672,7 +2388,7 @@
         <w:pStyle w:val="ListBullet"/>
       </w:pPr>
       <w:r>
-        <w:t>Liberar a equipe para entrevistas de cerca de 1 hora, no início do expediente (antes das 10h) ou após as 19h30.</w:t>
+        <w:t>Fornecer dados autorizados para os pilotos.</w:t>
       </w:r>
     </w:p>
     <w:p>
@@ -3680,7 +2396,7 @@
         <w:pStyle w:val="ListBullet"/>
       </w:pPr>
       <w:r>
-        <w:t>Aplicar os controles combinados na rotina.</w:t>
+        <w:t>Responder e validar entregas em até 1 dia útil.</w:t>
       </w:r>
     </w:p>
     <w:p>
@@ -3688,7 +2404,7 @@
         <w:pStyle w:val="ListBullet"/>
       </w:pPr>
       <w:r>
-        <w:t>Responder dúvidas em até 2 dias úteis e validar entregas em até 5 dias úteis.</w:t>
+        <w:t>Não há reuniões na semana de 07 a 13/12, por causa da prova da Thamires.</w:t>
       </w:r>
     </w:p>
     <w:p>
@@ -3696,7 +2412,7 @@
         <w:pStyle w:val="Heading1"/>
       </w:pPr>
       <w:r>
-        <w:t>13. Condições gerais</w:t>
+        <w:t>12. Condições gerais</w:t>
       </w:r>
     </w:p>
     <w:p>
@@ -3704,7 +2420,7 @@
         <w:pStyle w:val="ListBullet"/>
       </w:pPr>
       <w:r>
-        <w:t>Reuniões preferencialmente online, dentro da disponibilidade do consultor: segunda a sexta das 6h às 10h e depois das 19h30, além de sábados e domingos.</w:t>
+        <w:t>As datas partem de um aceite até 30/10/2026. Aceite depois disso desloca o calendário.</w:t>
       </w:r>
     </w:p>
     <w:p>
@@ -3712,7 +2428,15 @@
         <w:pStyle w:val="ListBullet"/>
       </w:pPr>
       <w:r>
-        <w:t>Atrasos por falta de retorno ou de acesso deslocam o cronograma; pausas de mais de 10 dias reagendam o projeto.</w:t>
+        <w:t>02/11 (Finados) e 20/11 (Consciência Negra) são feriados e não terão reuniões.</w:t>
+      </w:r>
+    </w:p>
+    <w:p>
+      <w:pPr>
+        <w:pStyle w:val="ListBullet"/>
+      </w:pPr>
+      <w:r>
+        <w:t>Atrasos por falta de retorno, acesso ou dados deslocam o cronograma.</w:t>
       </w:r>
     </w:p>
     <w:p>
@@ -3728,7 +2452,7 @@
         <w:pStyle w:val="ListBullet"/>
       </w:pPr>
       <w:r>
-        <w:t>Os documentos produzidos são da Surcin após a quitação de cada parcela.</w:t>
+        <w:t>Os materiais produzidos passam a ser da Surcin após a quitação de cada parcela.</w:t>
       </w:r>
     </w:p>
     <w:p>
@@ -3736,7 +2460,7 @@
         <w:pStyle w:val="ListBullet"/>
       </w:pPr>
       <w:r>
-        <w:t>Validade desta proposta: 15 dias a partir de 15/10/2026.</w:t>
+        <w:t>Validade desta proposta: até 30/10/2026.</w:t>
       </w:r>
     </w:p>
     <w:p>
@@ -3744,7 +2468,7 @@
         <w:pStyle w:val="Heading1"/>
       </w:pPr>
       <w:r>
-        <w:t>14. Próximos passos</w:t>
+        <w:t>13. Próximos passos</w:t>
       </w:r>
     </w:p>
     <w:p>
@@ -3752,7 +2476,7 @@
         <w:pStyle w:val="ListNumber"/>
       </w:pPr>
       <w:r>
-        <w:t>Escolha da opção (Essencial ou Completa) e aceite.</w:t>
+        <w:t>Aceite da proposta: confirmação de escopo e investimento.</w:t>
       </w:r>
     </w:p>
     <w:p>
@@ -3760,7 +2484,7 @@
         <w:pStyle w:val="ListNumber"/>
       </w:pPr>
       <w:r>
-        <w:t>Acordo de confidencialidade.</w:t>
+        <w:t>Contrato e confidencialidade: marcos, LGPD e propriedade formalizados.</w:t>
       </w:r>
     </w:p>
     <w:p>
@@ -3768,7 +2492,15 @@
         <w:pStyle w:val="ListNumber"/>
       </w:pPr>
       <w:r>
-        <w:t>Kick-off na semana de 19/10 e agenda das entrevistas.</w:t>
+        <w:t>Acessos e materiais: levantamento do que a Etapa 1 precisa.</w:t>
+      </w:r>
+    </w:p>
+    <w:p>
+      <w:pPr>
+        <w:pStyle w:val="ListNumber"/>
+      </w:pPr>
+      <w:r>
+        <w:t>Reunião de abertura em 03/11, com o aceite até 30/10.</w:t>
       </w:r>
     </w:p>
     <w:p>
@@ -3777,7 +2509,7 @@
           <w:i w:val="0"/>
         </w:rPr>
         <w:br/>
-        <w:t>Renato Romão · Consultor responsável · R2 Tech Consultoria · r2techconsultoria@gmail.com · [telefone]</w:t>
+        <w:t>Renato Romão · R2 Tech Consultoria · r2techconsultoria@gmail.com</w:t>
       </w:r>
     </w:p>
     <w:sectPr>

</xml_diff>

<commit_message>
Proposta comercial: parcelas em datas fixas (03/11, 01/12 e 05/01/2027)
Co-Authored-By: Claude Opus 5.5 (1M context) <noreply@anthropic.com>
Claude-Session: https://claude.ai/code/session_0127xFh2xB8HoQ18BDMAY2QJ
</commit_message>
<xml_diff>
--- a/proposta-surcin/04-proposta-comercial.docx
+++ b/proposta-surcin/04-proposta-comercial.docx
@@ -28,7 +28,7 @@
           <w:color w:val="595959"/>
           <w:sz w:val="18"/>
         </w:rPr>
-        <w:t>Versão 5 · 22/10/2026 · oferta única · válida até 30/10/2026</w:t>
+        <w:t>Versão 6 · 26/10/2026 · oferta única · válida até 30/10/2026</w:t>
       </w:r>
     </w:p>
     <w:p>
@@ -2092,7 +2092,7 @@
                 <w:b w:val="0"/>
                 <w:sz w:val="20"/>
               </w:rPr>
-              <w:t>No aceite da proposta (início da Etapa 1)</w:t>
+              <w:t>03/11/2026 · início do projeto</w:t>
             </w:r>
           </w:p>
         </w:tc>
@@ -2139,7 +2139,7 @@
                 <w:b w:val="0"/>
                 <w:sz w:val="20"/>
               </w:rPr>
-              <w:t>No aceite da Etapa 3 (biblioteca de 5 rotinas do Claude validada)</w:t>
+              <w:t>01/12/2026 · meio do projeto</w:t>
             </w:r>
           </w:p>
         </w:tc>
@@ -2186,7 +2186,7 @@
                 <w:b w:val="0"/>
                 <w:sz w:val="20"/>
               </w:rPr>
-              <w:t>Na entrega final (homologação das Etapas 4 e 5)</w:t>
+              <w:t>05/01/2027 · fim do projeto, após a entrega final de 23/12</w:t>
             </w:r>
           </w:p>
         </w:tc>
@@ -2198,7 +2198,7 @@
         <w:rPr>
           <w:i w:val="0"/>
         </w:rPr>
-        <w:t>Valor único, com escopo fechado. O contrato detalha o marco exato de cada parcela.</w:t>
+        <w:t>Valor único, com escopo fechado. As parcelas seguem o calendário do projeto, com vencimento em datas fixas: início, meio e fim.</w:t>
       </w:r>
     </w:p>
     <w:p>

</xml_diff>

<commit_message>
Início do projeto Surcin: proposta v7, minutas, base do diagnóstico, fluxos, repositórios e Acompanhamento com sprints
- Proposta comercial v7: serviço completo, 10 x R$ 3.190, sem fases nem regra de saída
- Minutas do contrato e do termo de confidencialidade
- Base do diagnóstico: planilha de registro, pauta de abertura, pedido de acessos, roteiros de entrevista, ficha de processo
- Três fluxos atuais em rascunho (TOML) gerados com o mapeador-de-processos (MIT)
- Repositórios de referência como submódulos (borghei/Claude-Skills, Denymbird/accounting-workflow-skills)
- Fonte do Acompanhamento com aba Sprints (11 sprints semanais, quadro, burndown, revisão e retro)

Co-Authored-By: Claude Opus 5.5 <noreply@anthropic.com>
Claude-Session: https://claude.ai/code/session_01DCm4jNimW7RA567rBwMYQR
</commit_message>
<xml_diff>
--- a/proposta-surcin/04-proposta-comercial.docx
+++ b/proposta-surcin/04-proposta-comercial.docx
@@ -28,7 +28,7 @@
           <w:color w:val="595959"/>
           <w:sz w:val="18"/>
         </w:rPr>
-        <w:t>Versão 6 · 26/10/2026 · oferta única · válida até 30/10/2026</w:t>
+        <w:t>Versão 7 · 30/10/2026 · oferta única · válida até 03/11/2026</w:t>
       </w:r>
     </w:p>
     <w:p>
@@ -52,7 +52,7 @@
         <w:rPr>
           <w:i w:val="0"/>
         </w:rPr>
-        <w:t>O objetivo é que, a partir de janeiro de 2027, a equipe opere com papéis claros, fluxos documentados, rotinas do Claude testadas e indicadores por área, sem depender da Thamires para cada decisão. A ordem é sempre a mesma: primeiro processo e controle, depois ferramenta e automação assistida.</w:t>
+        <w:t>O objetivo é que, na entrega final, em fevereiro de 2027, a equipe opere com papéis claros, fluxos documentados, rotinas do Claude testadas e indicadores por área, sem depender da Thamires para cada decisão. A ordem é sempre a mesma: primeiro processo e controle, depois ferramenta e automação assistida.</w:t>
       </w:r>
     </w:p>
     <w:p>
@@ -148,7 +148,15 @@
         <w:rPr>
           <w:i w:val="0"/>
         </w:rPr>
-        <w:t>Um projeto deste porte normalmente leva cerca de 18 semanas. Para atender ao prazo da Surcin, ele foi condensado em 8 semanas, de 03/11 a 23/12/2026, com etapas sobrepostas. A partir de janeiro, a Surcin opera com o que foi implantado.</w:t>
+        <w:t>O serviço é contratado por inteiro e entregue em cinco etapas, em dois períodos de trabalho. Primeiro a organização da empresa, em um ritmo que cabe na agenda da Surcin, de 03/11 a 04/12/2026. Depois de uma pausa, a implantação do Claude, dos pilotos e da avaliação, de 04/01 a 12/02/2027.</w:t>
+      </w:r>
+    </w:p>
+    <w:p>
+      <w:pPr>
+        <w:pStyle w:val="Heading3"/>
+      </w:pPr>
+      <w:r>
+        <w:t>Organização · Etapas 1 e 2 · 03/11 a 04/12/2026 · 70 h</w:t>
       </w:r>
     </w:p>
     <w:tbl>
@@ -280,7 +288,7 @@
                 <w:b w:val="0"/>
                 <w:sz w:val="20"/>
               </w:rPr>
-              <w:t>03 a 13/11</w:t>
+              <w:t>03 a 19/11</w:t>
             </w:r>
           </w:p>
         </w:tc>
@@ -357,7 +365,7 @@
                 <w:b w:val="0"/>
                 <w:sz w:val="20"/>
               </w:rPr>
-              <w:t>16 a 29/11</w:t>
+              <w:t>23/11 a 04/12</w:t>
             </w:r>
           </w:p>
         </w:tc>
@@ -387,7 +395,7 @@
                 <w:b w:val="0"/>
                 <w:sz w:val="20"/>
               </w:rPr>
-              <w:t>Organograma funcional, matriz de responsabilidades e alçadas; jornada de entrada do cliente e passagem formal; redesenho de até 5 fluxos; controles prioritários; indicadores por área e competências por papel</w:t>
+              <w:t>Organograma funcional, matriz de responsabilidades e alçadas; jornada de entrada do cliente e passagem formal; redesenho de até 5 fluxos; controles prioritários e proposta de evolução da Júlia; indicadores por área e competências por papel</w:t>
             </w:r>
           </w:p>
         </w:tc>
@@ -403,6 +411,201 @@
                 <w:sz w:val="20"/>
               </w:rPr>
               <w:t>Fluxos futuros, responsabilidades e listas de verificação aprovados</w:t>
+            </w:r>
+          </w:p>
+        </w:tc>
+      </w:tr>
+      <w:tr>
+        <w:tc>
+          <w:tcPr>
+            <w:tcW w:type="dxa" w:w="1814"/>
+          </w:tcPr>
+          <w:p>
+            <w:r/>
+            <w:r>
+              <w:rPr>
+                <w:b/>
+                <w:sz w:val="20"/>
+              </w:rPr>
+              <w:t>Subtotal</w:t>
+            </w:r>
+          </w:p>
+        </w:tc>
+        <w:tc>
+          <w:tcPr>
+            <w:tcW w:type="dxa" w:w="1247"/>
+          </w:tcPr>
+          <w:p>
+            <w:r/>
+            <w:r>
+              <w:rPr>
+                <w:b/>
+                <w:sz w:val="20"/>
+              </w:rPr>
+              <w:t>5 semanas</w:t>
+            </w:r>
+          </w:p>
+        </w:tc>
+        <w:tc>
+          <w:tcPr>
+            <w:tcW w:type="dxa" w:w="794"/>
+          </w:tcPr>
+          <w:p>
+            <w:r/>
+            <w:r>
+              <w:rPr>
+                <w:b/>
+                <w:sz w:val="20"/>
+              </w:rPr>
+              <w:t>70 h</w:t>
+            </w:r>
+          </w:p>
+        </w:tc>
+        <w:tc>
+          <w:tcPr>
+            <w:tcW w:type="dxa" w:w="3175"/>
+          </w:tcPr>
+          <w:p>
+            <w:r/>
+            <w:r>
+              <w:rPr>
+                <w:b w:val="0"/>
+                <w:sz w:val="20"/>
+              </w:rPr>
+            </w:r>
+          </w:p>
+        </w:tc>
+        <w:tc>
+          <w:tcPr>
+            <w:tcW w:type="dxa" w:w="2381"/>
+          </w:tcPr>
+          <w:p>
+            <w:r/>
+            <w:r>
+              <w:rPr>
+                <w:b w:val="0"/>
+                <w:sz w:val="20"/>
+              </w:rPr>
+            </w:r>
+          </w:p>
+        </w:tc>
+      </w:tr>
+    </w:tbl>
+    <w:p/>
+    <w:p>
+      <w:r>
+        <w:rPr>
+          <w:i w:val="0"/>
+        </w:rPr>
+        <w:t>Pausa entre 04/12/2026 e 04/01/2027, sem reuniões de 07 a 13/12.</w:t>
+      </w:r>
+    </w:p>
+    <w:p>
+      <w:pPr>
+        <w:pStyle w:val="Heading3"/>
+      </w:pPr>
+      <w:r>
+        <w:t>Implantação · Etapas 3 a 5 · 04/01 a 12/02/2027 · 151 h</w:t>
+      </w:r>
+    </w:p>
+    <w:tbl>
+      <w:tblPr>
+        <w:tblStyle w:val="TableGrid"/>
+        <w:tblW w:type="auto" w:w="0"/>
+        <w:jc w:val="center"/>
+        <w:tblLayout w:type="fixed"/>
+        <w:tblLook w:firstColumn="1" w:firstRow="1" w:lastColumn="0" w:lastRow="0" w:noHBand="0" w:noVBand="1" w:val="04A0"/>
+      </w:tblPr>
+      <w:tblGrid>
+        <w:gridCol w:w="1814"/>
+        <w:gridCol w:w="1247"/>
+        <w:gridCol w:w="794"/>
+        <w:gridCol w:w="3175"/>
+        <w:gridCol w:w="2381"/>
+      </w:tblGrid>
+      <w:tr>
+        <w:tc>
+          <w:tcPr>
+            <w:tcW w:type="dxa" w:w="1814"/>
+            <w:shd w:val="clear" w:color="auto" w:fill="1F3A5F"/>
+          </w:tcPr>
+          <w:p>
+            <w:r/>
+            <w:r>
+              <w:rPr>
+                <w:b/>
+                <w:color w:val="FFFFFF"/>
+                <w:sz w:val="20"/>
+              </w:rPr>
+              <w:t>Etapa</w:t>
+            </w:r>
+          </w:p>
+        </w:tc>
+        <w:tc>
+          <w:tcPr>
+            <w:tcW w:type="dxa" w:w="1247"/>
+            <w:shd w:val="clear" w:color="auto" w:fill="1F3A5F"/>
+          </w:tcPr>
+          <w:p>
+            <w:r/>
+            <w:r>
+              <w:rPr>
+                <w:b/>
+                <w:color w:val="FFFFFF"/>
+                <w:sz w:val="20"/>
+              </w:rPr>
+              <w:t>Período</w:t>
+            </w:r>
+          </w:p>
+        </w:tc>
+        <w:tc>
+          <w:tcPr>
+            <w:tcW w:type="dxa" w:w="794"/>
+            <w:shd w:val="clear" w:color="auto" w:fill="1F3A5F"/>
+          </w:tcPr>
+          <w:p>
+            <w:r/>
+            <w:r>
+              <w:rPr>
+                <w:b/>
+                <w:color w:val="FFFFFF"/>
+                <w:sz w:val="20"/>
+              </w:rPr>
+              <w:t>Horas</w:t>
+            </w:r>
+          </w:p>
+        </w:tc>
+        <w:tc>
+          <w:tcPr>
+            <w:tcW w:type="dxa" w:w="3175"/>
+            <w:shd w:val="clear" w:color="auto" w:fill="1F3A5F"/>
+          </w:tcPr>
+          <w:p>
+            <w:r/>
+            <w:r>
+              <w:rPr>
+                <w:b/>
+                <w:color w:val="FFFFFF"/>
+                <w:sz w:val="20"/>
+              </w:rPr>
+              <w:t>O que entrega</w:t>
+            </w:r>
+          </w:p>
+        </w:tc>
+        <w:tc>
+          <w:tcPr>
+            <w:tcW w:type="dxa" w:w="2381"/>
+            <w:shd w:val="clear" w:color="auto" w:fill="1F3A5F"/>
+          </w:tcPr>
+          <w:p>
+            <w:r/>
+            <w:r>
+              <w:rPr>
+                <w:b/>
+                <w:color w:val="FFFFFF"/>
+                <w:sz w:val="20"/>
+              </w:rPr>
+              <w:t>Aceite</w:t>
             </w:r>
           </w:p>
         </w:tc>
@@ -434,7 +637,7 @@
                 <w:b w:val="0"/>
                 <w:sz w:val="20"/>
               </w:rPr>
-              <w:t>23/11 a 13/12</w:t>
+              <w:t>04 a 22/01</w:t>
             </w:r>
           </w:p>
         </w:tc>
@@ -511,7 +714,7 @@
                 <w:b w:val="0"/>
                 <w:sz w:val="20"/>
               </w:rPr>
-              <w:t>07 a 20/12</w:t>
+              <w:t>18/01 a 05/02</w:t>
             </w:r>
           </w:p>
         </w:tc>
@@ -588,7 +791,7 @@
                 <w:b w:val="0"/>
                 <w:sz w:val="20"/>
               </w:rPr>
-              <w:t>14 a 23/12</w:t>
+              <w:t>01 a 12/02</w:t>
             </w:r>
           </w:p>
         </w:tc>
@@ -650,7 +853,7 @@
                 <w:b/>
                 <w:sz w:val="20"/>
               </w:rPr>
-              <w:t>Total</w:t>
+              <w:t>Subtotal</w:t>
             </w:r>
           </w:p>
         </w:tc>
@@ -665,7 +868,7 @@
                 <w:b/>
                 <w:sz w:val="20"/>
               </w:rPr>
-              <w:t>8 semanas</w:t>
+              <w:t>6 semanas</w:t>
             </w:r>
           </w:p>
         </w:tc>
@@ -680,7 +883,7 @@
                 <w:b/>
                 <w:sz w:val="20"/>
               </w:rPr>
-              <w:t>~221 h</w:t>
+              <w:t>151 h</w:t>
             </w:r>
           </w:p>
         </w:tc>
@@ -736,7 +939,7 @@
               <w:rPr>
                 <w:sz w:val="20"/>
               </w:rPr>
-              <w:t>Dois meses intensivos. Para entregar tudo funcionando até 23/12, a R2 trabalha no projeto todos os dias, inclusive sábados e domingos: são cerca de 221 horas, ou cerca de 4h15 por dia, de 03/11 a 23/12. Não há folga no calendário: o prazo depende de entrevistas, acessos e dados chegarem nas datas.</w:t>
+              <w:t>Cerca de 221 horas de trabalho da R2 no total: 70 h na organização e 151 h na implantação. As datas partem de um aceite até 03/11/2026. Atrasos de entrevistas, acessos ou dados deslocam o calendário.</w:t>
             </w:r>
           </w:p>
         </w:tc>
@@ -2045,7 +2248,7 @@
                 <w:b w:val="0"/>
                 <w:sz w:val="20"/>
               </w:rPr>
-              <w:t>8 semanas · 5 etapas · 5 rotinas do Claude · 2 pilotos · 2 integrações</w:t>
+              <w:t>Serviço completo · 5 etapas · 5 rotinas do Claude · 2 pilotos · 2 integrações</w:t>
             </w:r>
           </w:p>
         </w:tc>
@@ -2062,7 +2265,7 @@
                 <w:b w:val="0"/>
                 <w:sz w:val="20"/>
               </w:rPr>
-              <w:t>Parcela 1 · 30%</w:t>
+              <w:t>Pagamento</w:t>
             </w:r>
           </w:p>
         </w:tc>
@@ -2077,7 +2280,7 @@
                 <w:b w:val="0"/>
                 <w:sz w:val="20"/>
               </w:rPr>
-              <w:t>R$ 9.570</w:t>
+              <w:t>10 x R$ 3.190</w:t>
             </w:r>
           </w:p>
         </w:tc>
@@ -2092,7 +2295,7 @@
                 <w:b w:val="0"/>
                 <w:sz w:val="20"/>
               </w:rPr>
-              <w:t>03/11/2026 · início do projeto</w:t>
+              <w:t>Parcelas mensais, a primeira em 03/11/2026 e a última em agosto de 2027</w:t>
             </w:r>
           </w:p>
         </w:tc>
@@ -2109,7 +2312,7 @@
                 <w:b w:val="0"/>
                 <w:sz w:val="20"/>
               </w:rPr>
-              <w:t>Parcela 2 · 35%</w:t>
+              <w:t>Início</w:t>
             </w:r>
           </w:p>
         </w:tc>
@@ -2124,7 +2327,6 @@
                 <w:b w:val="0"/>
                 <w:sz w:val="20"/>
               </w:rPr>
-              <w:t>R$ 11.165</w:t>
             </w:r>
           </w:p>
         </w:tc>
@@ -2139,7 +2341,7 @@
                 <w:b w:val="0"/>
                 <w:sz w:val="20"/>
               </w:rPr>
-              <w:t>01/12/2026 · meio do projeto</w:t>
+              <w:t>03/11/2026 · reunião de abertura</w:t>
             </w:r>
           </w:p>
         </w:tc>
@@ -2156,7 +2358,7 @@
                 <w:b w:val="0"/>
                 <w:sz w:val="20"/>
               </w:rPr>
-              <w:t>Parcela 3 · 35%</w:t>
+              <w:t>Meio</w:t>
             </w:r>
           </w:p>
         </w:tc>
@@ -2171,7 +2373,6 @@
                 <w:b w:val="0"/>
                 <w:sz w:val="20"/>
               </w:rPr>
-              <w:t>R$ 11.165</w:t>
             </w:r>
           </w:p>
         </w:tc>
@@ -2186,7 +2387,53 @@
                 <w:b w:val="0"/>
                 <w:sz w:val="20"/>
               </w:rPr>
-              <w:t>05/01/2027 · fim do projeto, após a entrega final de 23/12</w:t>
+              <w:t>04/12/2026 · fim da organização (Etapas 1 e 2)</w:t>
+            </w:r>
+          </w:p>
+        </w:tc>
+      </w:tr>
+      <w:tr>
+        <w:tc>
+          <w:tcPr>
+            <w:tcW w:type="dxa" w:w="2835"/>
+          </w:tcPr>
+          <w:p>
+            <w:r/>
+            <w:r>
+              <w:rPr>
+                <w:b w:val="0"/>
+                <w:sz w:val="20"/>
+              </w:rPr>
+              <w:t>Fim</w:t>
+            </w:r>
+          </w:p>
+        </w:tc>
+        <w:tc>
+          <w:tcPr>
+            <w:tcW w:type="dxa" w:w="1984"/>
+          </w:tcPr>
+          <w:p>
+            <w:r/>
+            <w:r>
+              <w:rPr>
+                <w:b w:val="0"/>
+                <w:sz w:val="20"/>
+              </w:rPr>
+            </w:r>
+          </w:p>
+        </w:tc>
+        <w:tc>
+          <w:tcPr>
+            <w:tcW w:type="dxa" w:w="4252"/>
+          </w:tcPr>
+          <w:p>
+            <w:r/>
+            <w:r>
+              <w:rPr>
+                <w:b w:val="0"/>
+                <w:sz w:val="20"/>
+              </w:rPr>
+              <w:t>12/02/2027 · entrega final</w:t>
             </w:r>
           </w:p>
         </w:tc>
@@ -2198,7 +2445,7 @@
         <w:rPr>
           <w:i w:val="0"/>
         </w:rPr>
-        <w:t>Valor único, com escopo fechado. As parcelas seguem o calendário do projeto, com vencimento em datas fixas: início, meio e fim.</w:t>
+        <w:t>Valor único pelo serviço completo, com escopo fechado, pago em 10 parcelas mensais. A entrega termina antes do fim do pagamento.</w:t>
       </w:r>
     </w:p>
     <w:p>
@@ -2324,14 +2571,6 @@
         <w:pStyle w:val="ListBullet"/>
       </w:pPr>
       <w:r>
-        <w:t>Trabalhar no projeto todos os dias, inclusive sábados e domingos, de 03/11 a 23/12.</w:t>
-      </w:r>
-    </w:p>
-    <w:p>
-      <w:pPr>
-        <w:pStyle w:val="ListBullet"/>
-      </w:pPr>
-      <w:r>
         <w:t>Entregar os documentos em formato editável, no ambiente da Surcin.</w:t>
       </w:r>
     </w:p>
@@ -2364,7 +2603,7 @@
         <w:pStyle w:val="ListBullet"/>
       </w:pPr>
       <w:r>
-        <w:t>Aceitar a proposta até 30/10 e liberar os acessos no início do projeto.</w:t>
+        <w:t>Aceitar a proposta até 03/11 e liberar os acessos no início do projeto.</w:t>
       </w:r>
     </w:p>
     <w:p>
@@ -2388,7 +2627,7 @@
         <w:pStyle w:val="ListBullet"/>
       </w:pPr>
       <w:r>
-        <w:t>Fornecer dados autorizados para os pilotos.</w:t>
+        <w:t>Fornecer até 18/12 os dados autorizados para os pilotos.</w:t>
       </w:r>
     </w:p>
     <w:p>
@@ -2404,7 +2643,7 @@
         <w:pStyle w:val="ListBullet"/>
       </w:pPr>
       <w:r>
-        <w:t>Não há reuniões na semana de 07 a 13/12, por causa da prova da Thamires.</w:t>
+        <w:t>Não há reuniões na semana de 07 a 13/12.</w:t>
       </w:r>
     </w:p>
     <w:p>
@@ -2420,7 +2659,7 @@
         <w:pStyle w:val="ListBullet"/>
       </w:pPr>
       <w:r>
-        <w:t>As datas partem de um aceite até 30/10/2026. Aceite depois disso desloca o calendário.</w:t>
+        <w:t>As datas partem de um aceite até 03/11/2026. Aceite depois disso desloca o calendário.</w:t>
       </w:r>
     </w:p>
     <w:p>
@@ -2428,7 +2667,7 @@
         <w:pStyle w:val="ListBullet"/>
       </w:pPr>
       <w:r>
-        <w:t>02/11 (Finados) e 20/11 (Consciência Negra) são feriados e não terão reuniões.</w:t>
+        <w:t>02/11 (Finados) e 20/11 (Consciência Negra) são feriados e não terão reuniões. Não há reuniões de 07 a 13/12.</w:t>
       </w:r>
     </w:p>
     <w:p>
@@ -2460,7 +2699,7 @@
         <w:pStyle w:val="ListBullet"/>
       </w:pPr>
       <w:r>
-        <w:t>Validade desta proposta: até 30/10/2026.</w:t>
+        <w:t>Validade desta proposta: até 03/11/2026.</w:t>
       </w:r>
     </w:p>
     <w:p>
@@ -2500,7 +2739,7 @@
         <w:pStyle w:val="ListNumber"/>
       </w:pPr>
       <w:r>
-        <w:t>Reunião de abertura em 03/11, com o aceite até 30/10.</w:t>
+        <w:t>Reunião de abertura em 03/11.</w:t>
       </w:r>
     </w:p>
     <w:p>

</xml_diff>